<commit_message>
Restructure manuscript into numbered sections with separate limitations and setup
</commit_message>
<xml_diff>
--- a/paper/preprocessing_paper.docx
+++ b/paper/preprocessing_paper.docx
@@ -4,7 +4,7 @@
   <w:body>
     <w:p>
       <w:pPr>
-        <w:spacing w:after="200"/>
+        <w:spacing w:after="240"/>
         <w:jc w:val="center"/>
       </w:pPr>
       <w:r>
@@ -45,7 +45,7 @@
     </w:p>
     <w:p>
       <w:pPr>
-        <w:spacing w:after="240"/>
+        <w:spacing w:after="60"/>
         <w:jc w:val="center"/>
       </w:pPr>
       <w:r>
@@ -54,6 +54,19 @@
           <w:szCs w:val="20"/>
         </w:rPr>
         <w:t xml:space="preserve">rishihvora@gmail.com</w:t>
+      </w:r>
+    </w:p>
+    <w:p>
+      <w:pPr>
+        <w:spacing w:after="300"/>
+        <w:jc w:val="center"/>
+      </w:pPr>
+      <w:r>
+        <w:rPr>
+          <w:sz w:val="20"/>
+          <w:szCs w:val="20"/>
+        </w:rPr>
+        <w:t xml:space="preserve">August 2026</w:t>
       </w:r>
     </w:p>
     <w:p>
@@ -85,28 +98,6 @@
     </w:p>
     <w:p>
       <w:pPr>
-        <w:spacing w:after="200" w:line="276"/>
-        <w:jc w:val="both"/>
-      </w:pPr>
-      <w:r>
-        <w:rPr>
-          <w:b/>
-          <w:bCs/>
-          <w:sz w:val="21"/>
-          <w:szCs w:val="21"/>
-        </w:rPr>
-        <w:t xml:space="preserve">Keywords: </w:t>
-      </w:r>
-      <w:r>
-        <w:rPr>
-          <w:sz w:val="21"/>
-          <w:szCs w:val="21"/>
-        </w:rPr>
-        <w:t xml:space="preserve">introversion, extroversion, personality classification, machine learning, data leakage, reproducibility</w:t>
-      </w:r>
-    </w:p>
-    <w:p>
-      <w:pPr>
         <w:spacing w:after="140" w:before="320"/>
       </w:pPr>
       <w:r>
@@ -116,7 +107,7 @@
           <w:sz w:val="26"/>
           <w:szCs w:val="26"/>
         </w:rPr>
-        <w:t xml:space="preserve">1  Introduction</w:t>
+        <w:t xml:space="preserve">Keywords</w:t>
       </w:r>
     </w:p>
     <w:p>
@@ -129,46 +120,7 @@
           <w:sz w:val="21"/>
           <w:szCs w:val="21"/>
         </w:rPr>
-        <w:t xml:space="preserve">Studies that classify introverts and extroverts from self-report data report very different accuracies. Fieri et al. [13] report 73.5% and 95.5% for the same dataset, depending on how the data were prepared before training. So [12] reports 73.81% on the same questionnaire. Numbers like these are often compared as though they describe the same problem.</w:t>
-      </w:r>
-    </w:p>
-    <w:p>
-      <w:pPr>
-        <w:spacing w:after="160" w:line="276"/>
-        <w:jc w:val="both"/>
-      </w:pPr>
-      <w:r>
-        <w:rPr>
-          <w:sz w:val="21"/>
-          <w:szCs w:val="21"/>
-        </w:rPr>
-        <w:t xml:space="preserve">Leakage and preprocessing errors are known to inflate reported performance across many fields. Kapoor and Narayanan [11] found them in 294 papers spanning 17 disciplines and sorted them into eight types. Personality classification was not one of the fields they surveyed, and I could not find a study that measures how much these choices matter for this particular task.</w:t>
-      </w:r>
-    </w:p>
-    <w:p>
-      <w:pPr>
-        <w:spacing w:after="160" w:line="276"/>
-        <w:jc w:val="both"/>
-      </w:pPr>
-      <w:r>
-        <w:rPr>
-          <w:sz w:val="21"/>
-          <w:szCs w:val="21"/>
-        </w:rPr>
-        <w:t xml:space="preserve">Psychologists have studied the distinction between introversion and extroversion for decades because of its obvious presence in daily life [1, 2]. Some individuals will be more energized after a day of being alone, while others will become restless if they do not see other people on a regular basis. One individual may leave a long social gathering exhausted; another will be energized to participate in more social activities [3]. Researchers have used formal assessments such as the Big Five Inventory [4] and shorter self-report measures [6] to place people along this dimension. More recently, personality traits have been predicted from social media activity [7], and computer models have judged personality more accurately than a person’s own friends [8]. This work suggests that introverts and extroverts differ in measurable ways, although it has often relied on large and detailed digital records rather than a few simple, self-reported behaviors.</w:t>
-      </w:r>
-    </w:p>
-    <w:p>
-      <w:pPr>
-        <w:spacing w:after="160" w:line="276"/>
-        <w:jc w:val="both"/>
-      </w:pPr>
-      <w:r>
-        <w:rPr>
-          <w:sz w:val="21"/>
-          <w:szCs w:val="21"/>
-        </w:rPr>
-        <w:t xml:space="preserve">In this study, I measure how much four common preparation decisions move the reported accuracy for this task. The decisions are whether to keep respondents who identify as neither introvert nor extrovert, whether to resample before or inside cross-validation folds, whether to remove duplicate rows, and whether to select features before or inside folds. Each is tested on the same datasets with the same models, so that the only thing changing is the decision itself.</w:t>
+        <w:t xml:space="preserve">Introversion, extroversion, personality classification, machine learning, data leakage, preprocessing, cross-validation, class imbalance, SMOTE, reproducibility</w:t>
       </w:r>
     </w:p>
     <w:p>
@@ -182,7 +134,7 @@
           <w:sz w:val="26"/>
           <w:szCs w:val="26"/>
         </w:rPr>
-        <w:t xml:space="preserve">2  Methods</w:t>
+        <w:t xml:space="preserve">I. Introduction</w:t>
       </w:r>
     </w:p>
     <w:p>
@@ -196,7 +148,7 @@
           <w:sz w:val="22"/>
           <w:szCs w:val="22"/>
         </w:rPr>
-        <w:t xml:space="preserve">2.1  Datasets</w:t>
+        <w:t xml:space="preserve">A. Introversion and Extroversion as a Prediction Target</w:t>
       </w:r>
     </w:p>
     <w:p>
@@ -209,33 +161,7 @@
           <w:sz w:val="21"/>
           <w:szCs w:val="21"/>
         </w:rPr>
-        <w:t xml:space="preserve">The first dataset is a public Kaggle dataset called “Extrovert vs Introvert Behavior Data” [10]. It contains 2,900 responses. Each person answered seven questions about their daily habits and provided a label indicating whether they were an introvert or an extrovert. The questions were: how many hours they spent alone on a typical day, how often they attended social events, how often they went outside, how many close friends they had, how often they posted on social media, whether they got stage fright, and whether socializing made them feel drained. The two classes are close to even, at 1,491 extroverts and 1,409 introverts.</w:t>
-      </w:r>
-    </w:p>
-    <w:p>
-      <w:pPr>
-        <w:spacing w:after="160" w:line="276"/>
-        <w:jc w:val="both"/>
-      </w:pPr>
-      <w:r>
-        <w:rPr>
-          <w:sz w:val="21"/>
-          <w:szCs w:val="21"/>
-        </w:rPr>
-        <w:t xml:space="preserve">The second is the Multidimensional Introversion-Extraversion Scales development data [14], collected by the Open-Source Psychometrics Project in 2019. It contains 7,188 responses to 91 agree-disagree statements rated on a five-point scale. At the end of the survey each respondent was asked whether they identify as an introvert, an extrovert, or neither. Of the 7,163 who answered, 4,404 said introvert, 990 said extrovert, and 1,769 said neither. This dataset is strongly imbalanced, which matters for the resampling condition below.</w:t>
-      </w:r>
-    </w:p>
-    <w:p>
-      <w:pPr>
-        <w:spacing w:after="160" w:line="276"/>
-        <w:jc w:val="both"/>
-      </w:pPr>
-      <w:r>
-        <w:rPr>
-          <w:sz w:val="21"/>
-          <w:szCs w:val="21"/>
-        </w:rPr>
-        <w:t xml:space="preserve">The third is the IPIP Big Five Factor Markers data [15], 19,719 responses to 50 items. It carries no self-reported introvert or extrovert label. A label would have to be derived from the extraversion items themselves, and predicting that label from those same items would be circular, so this dataset is not used for classification. It appears only in Section 3.5 as a reference point for how much the items of an established extraversion scale overlap with one another.</w:t>
+        <w:t xml:space="preserve">Psychologists have studied the distinction between introversion and extroversion for decades because of its obvious presence in daily life [1, 2]. Some individuals will be more energized after a day of being alone, while others will become restless if they do not see other people on a regular basis. One individual may leave a long social gathering exhausted; another will be energized to participate in more social activities [3]. Researchers have used formal assessments such as the NEO Personality Inventory [4], type-based instruments such as the Myers-Briggs Type Indicator [5], and shorter self-report measures [6] to place people along this dimension. More recently, personality traits have been predicted from social media activity [7], computer models have judged personality more accurately than a person’s own friends [8], and personality estimates have been used to target persuasive messages [9]. This work suggests that introverts and extroverts differ in measurable ways, although it has often relied on large and detailed digital records rather than a few simple, self-reported behaviors.</w:t>
       </w:r>
     </w:p>
     <w:p>
@@ -249,7 +175,7 @@
           <w:sz w:val="22"/>
           <w:szCs w:val="22"/>
         </w:rPr>
-        <w:t xml:space="preserve">2.2  Cleaning</w:t>
+        <w:t xml:space="preserve">B. The Spread in Reported Accuracy</w:t>
       </w:r>
     </w:p>
     <w:p>
@@ -262,7 +188,7 @@
           <w:sz w:val="21"/>
           <w:szCs w:val="21"/>
         </w:rPr>
-        <w:t xml:space="preserve">For the Kaggle dataset, the five numerical questions were rounded to the nearest whole number. For stage fright and feeling drained, 1 was used to represent “Yes” and 0 to represent “No.” Personality labels were set to 0 for introvert and 1 for extrovert.</w:t>
+        <w:t xml:space="preserve">Studies that classify introverts and extroverts from self-report data report very different accuracies. Fieri et al. [13] report 73.5% and 95.5% for the same dataset, depending on how the data were prepared before training. So [12] reports 73.81% on the same questionnaire. Numbers like these are often compared as though they describe the same problem.</w:t>
       </w:r>
     </w:p>
     <w:p>
@@ -275,20 +201,7 @@
           <w:sz w:val="21"/>
           <w:szCs w:val="21"/>
         </w:rPr>
-        <w:t xml:space="preserve">The file contains 486 rows that are exact duplicates of another row. Unless a condition states otherwise, these are removed before analysis, leaving 2,414 unique rows. Section 3.4 reports what happens when they are kept.</w:t>
-      </w:r>
-    </w:p>
-    <w:p>
-      <w:pPr>
-        <w:spacing w:after="160" w:line="276"/>
-        <w:jc w:val="both"/>
-      </w:pPr>
-      <w:r>
-        <w:rPr>
-          <w:sz w:val="21"/>
-          <w:szCs w:val="21"/>
-        </w:rPr>
-        <w:t xml:space="preserve">For MIES, a response of 0 marks a skipped question rather than a rating, and is treated as missing.</w:t>
+        <w:t xml:space="preserve">Leakage and preprocessing errors are known to inflate reported performance across many fields. Kapoor and Narayanan [11] found them in 294 papers spanning 17 disciplines and sorted them into eight types. Personality classification was not one of the fields they surveyed, and I could not find a study that measures how much these choices matter for this particular task.</w:t>
       </w:r>
     </w:p>
     <w:p>
@@ -302,7 +215,7 @@
           <w:sz w:val="22"/>
           <w:szCs w:val="22"/>
         </w:rPr>
-        <w:t xml:space="preserve">2.3  Models and evaluation</w:t>
+        <w:t xml:space="preserve">C. Motivation and Contributions</w:t>
       </w:r>
     </w:p>
     <w:p>
@@ -315,46 +228,93 @@
           <w:sz w:val="21"/>
           <w:szCs w:val="21"/>
         </w:rPr>
-        <w:t xml:space="preserve">Three classifiers were used: a random forest with 100 trees, a logistic regression, and an XGBoost model with a maximum depth of 3 and 100 trees. All use random_state = 42 so that the results can be repeated.</w:t>
-      </w:r>
-    </w:p>
-    <w:p>
-      <w:pPr>
-        <w:spacing w:after="160" w:line="276"/>
-        <w:jc w:val="both"/>
-      </w:pPr>
-      <w:r>
-        <w:rPr>
-          <w:sz w:val="21"/>
-          <w:szCs w:val="21"/>
-        </w:rPr>
-        <w:t xml:space="preserve">Every preprocessing step runs inside a scikit-learn [18] pipeline, so imputation and scaling are fitted on training data only. This matters here for a specific reason: fitting a scaler on the full dataset before splitting is itself a small version of the leakage this paper measures, so the code should not commit it.</w:t>
-      </w:r>
-    </w:p>
-    <w:p>
-      <w:pPr>
-        <w:spacing w:after="160" w:line="276"/>
-        <w:jc w:val="both"/>
-      </w:pPr>
-      <w:r>
-        <w:rPr>
-          <w:sz w:val="21"/>
-          <w:szCs w:val="21"/>
-        </w:rPr>
-        <w:t xml:space="preserve">The baseline results in Table 1 use a single 80/20 stratified split. Every condition comparison in Section 3 instead uses 5-fold cross-validation repeated 10 times, giving 50 fits per condition. Differences between conditions are reported in percentage points of balanced accuracy, with a 95% interval computed from the pooled fold variance of the two conditions being compared.</w:t>
-      </w:r>
-    </w:p>
-    <w:p>
-      <w:pPr>
-        <w:spacing w:after="160" w:line="276"/>
-        <w:jc w:val="both"/>
-      </w:pPr>
-      <w:r>
-        <w:rPr>
-          <w:sz w:val="21"/>
-          <w:szCs w:val="21"/>
-        </w:rPr>
-        <w:t xml:space="preserve">Balanced accuracy is used rather than raw accuracy because MIES is strongly imbalanced. A model that always predicts “introvert” on the three-class version reaches 61.5% raw accuracy while learning nothing. Balanced accuracy scores each class separately and averages them, so the same model scores 33%.</w:t>
+        <w:t xml:space="preserve">In this study, I measure how much four common preparation decisions move the reported accuracy for this task. The decisions are whether to keep respondents who identify as neither introvert nor extrovert, whether to resample before or inside cross-validation folds, whether to remove duplicate rows, and whether to select features before or inside folds. Each is tested on the same datasets with the same models, so that the only thing changing is the decision itself. The contributions are as follows:</w:t>
+      </w:r>
+    </w:p>
+    <w:p>
+      <w:pPr>
+        <w:pStyle w:val="ListParagraph"/>
+        <w:numPr>
+          <w:ilvl w:val="0"/>
+          <w:numId w:val="1"/>
+        </w:numPr>
+        <w:spacing w:after="90" w:line="276"/>
+        <w:jc w:val="both"/>
+      </w:pPr>
+      <w:r>
+        <w:rPr>
+          <w:sz w:val="21"/>
+          <w:szCs w:val="21"/>
+        </w:rPr>
+        <w:t xml:space="preserve">A controlled comparison in which each of the four decisions is isolated, with the datasets, the models, and the evaluation protocol held fixed, so that any difference is attributable to the decision alone.</w:t>
+      </w:r>
+    </w:p>
+    <w:p>
+      <w:pPr>
+        <w:pStyle w:val="ListParagraph"/>
+        <w:numPr>
+          <w:ilvl w:val="0"/>
+          <w:numId w:val="1"/>
+        </w:numPr>
+        <w:spacing w:after="90" w:line="276"/>
+        <w:jc w:val="both"/>
+      </w:pPr>
+      <w:r>
+        <w:rPr>
+          <w:sz w:val="21"/>
+          <w:szCs w:val="21"/>
+        </w:rPr>
+        <w:t xml:space="preserve">Effect sizes reported in percentage points of balanced accuracy with 95% intervals, measured across 50 fits per condition rather than a single split.</w:t>
+      </w:r>
+    </w:p>
+    <w:p>
+      <w:pPr>
+        <w:pStyle w:val="ListParagraph"/>
+        <w:numPr>
+          <w:ilvl w:val="0"/>
+          <w:numId w:val="1"/>
+        </w:numPr>
+        <w:spacing w:after="90" w:line="276"/>
+        <w:jc w:val="both"/>
+      </w:pPr>
+      <w:r>
+        <w:rPr>
+          <w:sz w:val="21"/>
+          <w:szCs w:val="21"/>
+        </w:rPr>
+        <w:t xml:space="preserve">A reproduction of two published three-class results on the same instrument, which locates the class-structure decision as the source of most of the spread in the published literature.</w:t>
+      </w:r>
+    </w:p>
+    <w:p>
+      <w:pPr>
+        <w:pStyle w:val="ListParagraph"/>
+        <w:numPr>
+          <w:ilvl w:val="0"/>
+          <w:numId w:val="1"/>
+        </w:numPr>
+        <w:spacing w:after="90" w:line="276"/>
+        <w:jc w:val="both"/>
+      </w:pPr>
+      <w:r>
+        <w:rPr>
+          <w:sz w:val="21"/>
+          <w:szCs w:val="21"/>
+        </w:rPr>
+        <w:t xml:space="preserve">An item-overlap analysis of both datasets, offering an explanation for why one of the four decisions produces no measurable effect while a superficially similar one produces roughly twenty points.</w:t>
+      </w:r>
+    </w:p>
+    <w:p>
+      <w:pPr>
+        <w:spacing w:after="140" w:before="320"/>
+      </w:pPr>
+      <w:r>
+        <w:rPr>
+          <w:b/>
+          <w:bCs/>
+          <w:sz w:val="26"/>
+          <w:szCs w:val="26"/>
+        </w:rPr>
+        <w:t xml:space="preserve">II. Dataset Description and Preprocessing</w:t>
       </w:r>
     </w:p>
     <w:p>
@@ -368,7 +328,7 @@
           <w:sz w:val="22"/>
           <w:szCs w:val="22"/>
         </w:rPr>
-        <w:t xml:space="preserve">2.4  Conditions</w:t>
+        <w:t xml:space="preserve">A. Dataset Composition</w:t>
       </w:r>
     </w:p>
     <w:p>
@@ -381,29 +341,47 @@
           <w:sz w:val="21"/>
           <w:szCs w:val="21"/>
         </w:rPr>
-        <w:t xml:space="preserve">Each condition is a pair of pipelines that differ in exactly one step.</w:t>
+        <w:t xml:space="preserve">The first dataset is a public Kaggle dataset called “Extrovert vs Introvert Behavior Data” [10]. It contains 2,900 responses. Each person answered seven questions about their daily habits and provided a label indicating whether they were an introvert or an extrovert. The questions were: how many hours they spent alone on a typical day, how often they attended social events, how often they went outside, how many close friends they had, how often they posted on social media, whether they got stage fright, and whether socializing made them feel drained. The two classes are close to even, at 1,491 extroverts and 1,409 introverts.</w:t>
       </w:r>
     </w:p>
     <w:p>
       <w:pPr>
         <w:spacing w:after="160" w:line="276"/>
         <w:jc w:val="both"/>
+      </w:pPr>
+      <w:r>
+        <w:rPr>
+          <w:sz w:val="21"/>
+          <w:szCs w:val="21"/>
+        </w:rPr>
+        <w:t xml:space="preserve">The second is the Multidimensional Introversion-Extraversion Scales development data [14], collected by the Open-Source Psychometrics Project in 2019. It contains 7,188 responses to 91 agree-disagree statements rated on a five-point scale. At the end of the survey each respondent was asked whether they identify as an introvert, an extrovert, or neither. Of the 7,163 who answered, 4,404 said introvert, 990 said extrovert, and 1,769 said neither. The remaining 25 respondents left the question blank and are excluded. This dataset is strongly imbalanced, which matters for the resampling condition below.</w:t>
+      </w:r>
+    </w:p>
+    <w:p>
+      <w:pPr>
+        <w:spacing w:after="160" w:line="276"/>
+        <w:jc w:val="both"/>
+      </w:pPr>
+      <w:r>
+        <w:rPr>
+          <w:sz w:val="21"/>
+          <w:szCs w:val="21"/>
+        </w:rPr>
+        <w:t xml:space="preserve">The third is the IPIP Big Five Factor Markers data [15], 19,719 responses to 50 items. It carries no self-reported introvert or extrovert label. A label would have to be derived from the extraversion items themselves, and predicting that label from those same items would be circular, so this dataset is not used for classification. It appears only in Section V.G as a reference point for how much the items of an established extraversion scale overlap with one another.</w:t>
+      </w:r>
+    </w:p>
+    <w:p>
+      <w:pPr>
+        <w:spacing w:after="120" w:before="220"/>
       </w:pPr>
       <w:r>
         <w:rPr>
           <w:b/>
           <w:bCs/>
-          <w:sz w:val="21"/>
-          <w:szCs w:val="21"/>
-        </w:rPr>
-        <w:t xml:space="preserve">Class structure. </w:t>
-      </w:r>
-      <w:r>
-        <w:rPr>
-          <w:sz w:val="21"/>
-          <w:szCs w:val="21"/>
-        </w:rPr>
-        <w:t xml:space="preserve">Three classes (introvert, extrovert, neither) against two classes, with the neither group removed. This changes the prediction task and the population being classified, not only the preprocessing. Section 3.1 discusses that directly.</w:t>
+          <w:sz w:val="22"/>
+          <w:szCs w:val="22"/>
+        </w:rPr>
+        <w:t xml:space="preserve">B. Cleaning</w:t>
       </w:r>
     </w:p>
     <w:p>
@@ -413,19 +391,10 @@
       </w:pPr>
       <w:r>
         <w:rPr>
-          <w:b/>
-          <w:bCs/>
-          <w:sz w:val="21"/>
-          <w:szCs w:val="21"/>
-        </w:rPr>
-        <w:t xml:space="preserve">Resampling order. </w:t>
-      </w:r>
-      <w:r>
-        <w:rPr>
-          <w:sz w:val="21"/>
-          <w:szCs w:val="21"/>
-        </w:rPr>
-        <w:t xml:space="preserve">In the leaky version, SMOTE [16] is applied to the entire dataset and cross-validation is run on the result. In the correct version, SMOTE is applied inside each training fold only, using an imbalanced-learn pipeline, leaving every test fold untouched.</w:t>
+          <w:sz w:val="21"/>
+          <w:szCs w:val="21"/>
+        </w:rPr>
+        <w:t xml:space="preserve">For the Kaggle dataset, the five numerical questions were rounded to the nearest whole number. For stage fright and feeling drained, 1 was used to represent “Yes” and 0 to represent “No.” Personality labels were set to 0 for introvert and 1 for extrovert.</w:t>
       </w:r>
     </w:p>
     <w:p>
@@ -435,19 +404,10 @@
       </w:pPr>
       <w:r>
         <w:rPr>
-          <w:b/>
-          <w:bCs/>
-          <w:sz w:val="21"/>
-          <w:szCs w:val="21"/>
-        </w:rPr>
-        <w:t xml:space="preserve">Duplicate rows. </w:t>
-      </w:r>
-      <w:r>
-        <w:rPr>
-          <w:sz w:val="21"/>
-          <w:szCs w:val="21"/>
-        </w:rPr>
-        <w:t xml:space="preserve">Kept against removed, as described in Section 2.2.</w:t>
+          <w:sz w:val="21"/>
+          <w:szCs w:val="21"/>
+        </w:rPr>
+        <w:t xml:space="preserve">The file contains 486 rows that are exact duplicates of another row. Unless a condition states otherwise, these are removed before analysis, leaving 2,414 unique rows. Section V.E reports what happens when they are kept.</w:t>
       </w:r>
     </w:p>
     <w:p>
@@ -457,19 +417,10 @@
       </w:pPr>
       <w:r>
         <w:rPr>
-          <w:b/>
-          <w:bCs/>
-          <w:sz w:val="21"/>
-          <w:szCs w:val="21"/>
-        </w:rPr>
-        <w:t xml:space="preserve">Feature selection order. </w:t>
-      </w:r>
-      <w:r>
-        <w:rPr>
-          <w:sz w:val="21"/>
-          <w:szCs w:val="21"/>
-        </w:rPr>
-        <w:t xml:space="preserve">In the leaky version, the top 15 features by ANOVA F-score are chosen using the entire dataset, and cross-validation is run on those features. In the correct version, the same selection is performed separately inside each training fold. Fifteen was chosen because it matches the number of items selected by Fieri et al. [13].</w:t>
+          <w:sz w:val="21"/>
+          <w:szCs w:val="21"/>
+        </w:rPr>
+        <w:t xml:space="preserve">For MIES, a response of 0 marks a skipped question rather than a rating, and is treated as missing. Missing values are filled with the median of the training fold.</w:t>
       </w:r>
     </w:p>
     <w:p>
@@ -483,7 +434,21 @@
           <w:sz w:val="26"/>
           <w:szCs w:val="26"/>
         </w:rPr>
-        <w:t xml:space="preserve">3  Results</w:t>
+        <w:t xml:space="preserve">III. Methodology</w:t>
+      </w:r>
+    </w:p>
+    <w:p>
+      <w:pPr>
+        <w:spacing w:after="120" w:before="220"/>
+      </w:pPr>
+      <w:r>
+        <w:rPr>
+          <w:b/>
+          <w:bCs/>
+          <w:sz w:val="22"/>
+          <w:szCs w:val="22"/>
+        </w:rPr>
+        <w:t xml:space="preserve">A. Models</w:t>
       </w:r>
     </w:p>
     <w:p>
@@ -496,7 +461,954 @@
           <w:sz w:val="21"/>
           <w:szCs w:val="21"/>
         </w:rPr>
+        <w:t xml:space="preserve">Three classifiers were used: a random forest with 100 trees, a logistic regression with L2 regularization and the lbfgs solver, and an XGBoost model [19] with a maximum depth of 3 and 100 trees. All use random_state = 42 so that the results can be repeated.</w:t>
+      </w:r>
+    </w:p>
+    <w:p>
+      <w:pPr>
+        <w:spacing w:after="160" w:line="276"/>
+        <w:jc w:val="both"/>
+      </w:pPr>
+      <w:r>
+        <w:rPr>
+          <w:sz w:val="21"/>
+          <w:szCs w:val="21"/>
+        </w:rPr>
+        <w:t xml:space="preserve">Every preprocessing step runs inside a scikit-learn [18] pipeline, so imputation and scaling are fitted on training data only. This matters here for a specific reason: fitting a scaler on the full dataset before splitting is itself a small version of the leakage this paper measures, so the code should not commit it.</w:t>
+      </w:r>
+    </w:p>
+    <w:p>
+      <w:pPr>
+        <w:spacing w:after="120" w:before="220"/>
+      </w:pPr>
+      <w:r>
+        <w:rPr>
+          <w:b/>
+          <w:bCs/>
+          <w:sz w:val="22"/>
+          <w:szCs w:val="22"/>
+        </w:rPr>
+        <w:t xml:space="preserve">B. Evaluation</w:t>
+      </w:r>
+    </w:p>
+    <w:p>
+      <w:pPr>
+        <w:spacing w:after="160" w:line="276"/>
+        <w:jc w:val="both"/>
+      </w:pPr>
+      <w:r>
+        <w:rPr>
+          <w:sz w:val="21"/>
+          <w:szCs w:val="21"/>
+        </w:rPr>
+        <w:t xml:space="preserve">The baseline results in Table 1 use a single 80/20 stratified split. Every condition comparison in Section V instead uses 5-fold cross-validation repeated 10 times, giving 50 fits per condition. Differences between conditions are reported in percentage points of balanced accuracy, with a 95% interval computed from the pooled fold variance of the two conditions being compared.</w:t>
+      </w:r>
+    </w:p>
+    <w:p>
+      <w:pPr>
+        <w:spacing w:after="160" w:line="276"/>
+        <w:jc w:val="both"/>
+      </w:pPr>
+      <w:r>
+        <w:rPr>
+          <w:sz w:val="21"/>
+          <w:szCs w:val="21"/>
+        </w:rPr>
+        <w:t xml:space="preserve">Balanced accuracy is used rather than raw accuracy because MIES is strongly imbalanced. A model that always predicts “introvert” on the three-class version reaches 61.5% raw accuracy while learning nothing. Balanced accuracy scores each class separately and averages them, so the same model scores 33%. Where results from this paper are placed beside published figures, the comparison uses raw accuracy on both sides, since the published studies report raw accuracy.</w:t>
+      </w:r>
+    </w:p>
+    <w:p>
+      <w:pPr>
+        <w:spacing w:after="120" w:before="220"/>
+      </w:pPr>
+      <w:r>
+        <w:rPr>
+          <w:b/>
+          <w:bCs/>
+          <w:sz w:val="22"/>
+          <w:szCs w:val="22"/>
+        </w:rPr>
+        <w:t xml:space="preserve">C. Conditions</w:t>
+      </w:r>
+    </w:p>
+    <w:p>
+      <w:pPr>
+        <w:spacing w:after="160" w:line="276"/>
+        <w:jc w:val="both"/>
+      </w:pPr>
+      <w:r>
+        <w:rPr>
+          <w:sz w:val="21"/>
+          <w:szCs w:val="21"/>
+        </w:rPr>
+        <w:t xml:space="preserve">Each condition is a pair of pipelines that differ in exactly one step.</w:t>
+      </w:r>
+    </w:p>
+    <w:p>
+      <w:pPr>
+        <w:pStyle w:val="ListParagraph"/>
+        <w:numPr>
+          <w:ilvl w:val="0"/>
+          <w:numId w:val="1"/>
+        </w:numPr>
+        <w:spacing w:after="90" w:line="276"/>
+        <w:jc w:val="both"/>
+      </w:pPr>
+      <w:r>
+        <w:rPr>
+          <w:b/>
+          <w:bCs/>
+          <w:sz w:val="21"/>
+          <w:szCs w:val="21"/>
+        </w:rPr>
+        <w:t xml:space="preserve">Class structure. </w:t>
+      </w:r>
+      <w:r>
+        <w:rPr>
+          <w:sz w:val="21"/>
+          <w:szCs w:val="21"/>
+        </w:rPr>
+        <w:t xml:space="preserve">Three classes (introvert, extrovert, neither) against two classes, with the neither group removed. This changes the prediction task and the population being classified, not only the preprocessing. Section V.C discusses that directly.</w:t>
+      </w:r>
+    </w:p>
+    <w:p>
+      <w:pPr>
+        <w:pStyle w:val="ListParagraph"/>
+        <w:numPr>
+          <w:ilvl w:val="0"/>
+          <w:numId w:val="1"/>
+        </w:numPr>
+        <w:spacing w:after="90" w:line="276"/>
+        <w:jc w:val="both"/>
+      </w:pPr>
+      <w:r>
+        <w:rPr>
+          <w:b/>
+          <w:bCs/>
+          <w:sz w:val="21"/>
+          <w:szCs w:val="21"/>
+        </w:rPr>
+        <w:t xml:space="preserve">Resampling order. </w:t>
+      </w:r>
+      <w:r>
+        <w:rPr>
+          <w:sz w:val="21"/>
+          <w:szCs w:val="21"/>
+        </w:rPr>
+        <w:t xml:space="preserve">In the leaky version, SMOTE [16] is applied to the entire dataset and cross-validation is run on the result. In the correct version, SMOTE is applied inside each training fold only, using an imbalanced-learn [20] pipeline, leaving every test fold untouched. Five nearest neighbors are used in both cases.</w:t>
+      </w:r>
+    </w:p>
+    <w:p>
+      <w:pPr>
+        <w:pStyle w:val="ListParagraph"/>
+        <w:numPr>
+          <w:ilvl w:val="0"/>
+          <w:numId w:val="1"/>
+        </w:numPr>
+        <w:spacing w:after="90" w:line="276"/>
+        <w:jc w:val="both"/>
+      </w:pPr>
+      <w:r>
+        <w:rPr>
+          <w:b/>
+          <w:bCs/>
+          <w:sz w:val="21"/>
+          <w:szCs w:val="21"/>
+        </w:rPr>
+        <w:t xml:space="preserve">Duplicate rows. </w:t>
+      </w:r>
+      <w:r>
+        <w:rPr>
+          <w:sz w:val="21"/>
+          <w:szCs w:val="21"/>
+        </w:rPr>
+        <w:t xml:space="preserve">Kept against removed, as described in Section II.B.</w:t>
+      </w:r>
+    </w:p>
+    <w:p>
+      <w:pPr>
+        <w:pStyle w:val="ListParagraph"/>
+        <w:numPr>
+          <w:ilvl w:val="0"/>
+          <w:numId w:val="1"/>
+        </w:numPr>
+        <w:spacing w:after="90" w:line="276"/>
+        <w:jc w:val="both"/>
+      </w:pPr>
+      <w:r>
+        <w:rPr>
+          <w:b/>
+          <w:bCs/>
+          <w:sz w:val="21"/>
+          <w:szCs w:val="21"/>
+        </w:rPr>
+        <w:t xml:space="preserve">Feature selection order. </w:t>
+      </w:r>
+      <w:r>
+        <w:rPr>
+          <w:sz w:val="21"/>
+          <w:szCs w:val="21"/>
+        </w:rPr>
+        <w:t xml:space="preserve">In the leaky version, the top 15 features by ANOVA F-score are chosen using the entire dataset, and cross-validation is run on those features. In the correct version, the same selection is performed separately inside each training fold. Fifteen was chosen because it matches the number of items selected by Fieri et al. [13].</w:t>
+      </w:r>
+    </w:p>
+    <w:p>
+      <w:pPr>
+        <w:spacing w:after="140" w:before="320"/>
+      </w:pPr>
+      <w:r>
+        <w:rPr>
+          <w:b/>
+          <w:bCs/>
+          <w:sz w:val="26"/>
+          <w:szCs w:val="26"/>
+        </w:rPr>
+        <w:t xml:space="preserve">IV. Experimental Setup</w:t>
+      </w:r>
+    </w:p>
+    <w:p>
+      <w:pPr>
+        <w:spacing w:after="120" w:before="220"/>
+      </w:pPr>
+      <w:r>
+        <w:rPr>
+          <w:b/>
+          <w:bCs/>
+          <w:sz w:val="22"/>
+          <w:szCs w:val="22"/>
+        </w:rPr>
+        <w:t xml:space="preserve">A. Software Environment</w:t>
+      </w:r>
+    </w:p>
+    <w:p>
+      <w:pPr>
+        <w:spacing w:after="160" w:line="276"/>
+        <w:jc w:val="both"/>
+      </w:pPr>
+      <w:r>
+        <w:rPr>
+          <w:sz w:val="21"/>
+          <w:szCs w:val="21"/>
+        </w:rPr>
+        <w:t xml:space="preserve">All experiments were run on a single desktop machine under the package versions below. These versions are pinned in the repository so that the results can be reproduced exactly.</w:t>
+      </w:r>
+    </w:p>
+    <w:tbl>
+      <w:tblPr>
+        <w:tblW w:type="dxa" w:w="7600"/>
+        <w:tblBorders>
+          <w:top w:val="single" w:color="auto" w:sz="4"/>
+          <w:left w:val="single" w:color="auto" w:sz="4"/>
+          <w:bottom w:val="single" w:color="auto" w:sz="4"/>
+          <w:right w:val="single" w:color="auto" w:sz="4"/>
+          <w:insideH w:val="single" w:color="auto" w:sz="4"/>
+          <w:insideV w:val="single" w:color="auto" w:sz="4"/>
+        </w:tblBorders>
+      </w:tblPr>
+      <w:tblGrid>
+        <w:gridCol w:w="2600"/>
+        <w:gridCol w:w="2600"/>
+        <w:gridCol w:w="2400"/>
+      </w:tblGrid>
+      <w:tr>
+        <w:tc>
+          <w:tcPr>
+            <w:tcW w:type="dxa" w:w="2600"/>
+            <w:shd w:fill="EDEDED" w:val="clear"/>
+            <w:tcMar>
+              <w:top w:type="dxa" w:w="50"/>
+              <w:left w:type="dxa" w:w="90"/>
+              <w:bottom w:type="dxa" w:w="50"/>
+              <w:right w:type="dxa" w:w="90"/>
+            </w:tcMar>
+          </w:tcPr>
+          <w:p>
+            <w:pPr>
+              <w:jc w:val="left"/>
+            </w:pPr>
+            <w:r>
+              <w:rPr>
+                <w:b/>
+                <w:bCs/>
+                <w:sz w:val="19"/>
+                <w:szCs w:val="19"/>
+              </w:rPr>
+              <w:t xml:space="preserve">Component</w:t>
+            </w:r>
+          </w:p>
+        </w:tc>
+        <w:tc>
+          <w:tcPr>
+            <w:tcW w:type="dxa" w:w="2600"/>
+            <w:shd w:fill="EDEDED" w:val="clear"/>
+            <w:tcMar>
+              <w:top w:type="dxa" w:w="50"/>
+              <w:left w:type="dxa" w:w="90"/>
+              <w:bottom w:type="dxa" w:w="50"/>
+              <w:right w:type="dxa" w:w="90"/>
+            </w:tcMar>
+          </w:tcPr>
+          <w:p>
+            <w:pPr>
+              <w:jc w:val="left"/>
+            </w:pPr>
+            <w:r>
+              <w:rPr>
+                <w:b/>
+                <w:bCs/>
+                <w:sz w:val="19"/>
+                <w:szCs w:val="19"/>
+              </w:rPr>
+              <w:t xml:space="preserve">Package</w:t>
+            </w:r>
+          </w:p>
+        </w:tc>
+        <w:tc>
+          <w:tcPr>
+            <w:tcW w:type="dxa" w:w="2400"/>
+            <w:shd w:fill="EDEDED" w:val="clear"/>
+            <w:tcMar>
+              <w:top w:type="dxa" w:w="50"/>
+              <w:left w:type="dxa" w:w="90"/>
+              <w:bottom w:type="dxa" w:w="50"/>
+              <w:right w:type="dxa" w:w="90"/>
+            </w:tcMar>
+          </w:tcPr>
+          <w:p>
+            <w:pPr>
+              <w:jc w:val="center"/>
+            </w:pPr>
+            <w:r>
+              <w:rPr>
+                <w:b/>
+                <w:bCs/>
+                <w:sz w:val="19"/>
+                <w:szCs w:val="19"/>
+              </w:rPr>
+              <w:t xml:space="preserve">Version</w:t>
+            </w:r>
+          </w:p>
+        </w:tc>
+      </w:tr>
+      <w:tr>
+        <w:tc>
+          <w:tcPr>
+            <w:tcW w:type="dxa" w:w="2600"/>
+            <w:tcMar>
+              <w:top w:type="dxa" w:w="50"/>
+              <w:left w:type="dxa" w:w="90"/>
+              <w:bottom w:type="dxa" w:w="50"/>
+              <w:right w:type="dxa" w:w="90"/>
+            </w:tcMar>
+          </w:tcPr>
+          <w:p>
+            <w:pPr>
+              <w:jc w:val="left"/>
+            </w:pPr>
+            <w:r>
+              <w:rPr>
+                <w:b w:val="false"/>
+                <w:bCs w:val="false"/>
+                <w:sz w:val="19"/>
+                <w:szCs w:val="19"/>
+              </w:rPr>
+              <w:t xml:space="preserve">Language</w:t>
+            </w:r>
+          </w:p>
+        </w:tc>
+        <w:tc>
+          <w:tcPr>
+            <w:tcW w:type="dxa" w:w="2600"/>
+            <w:tcMar>
+              <w:top w:type="dxa" w:w="50"/>
+              <w:left w:type="dxa" w:w="90"/>
+              <w:bottom w:type="dxa" w:w="50"/>
+              <w:right w:type="dxa" w:w="90"/>
+            </w:tcMar>
+          </w:tcPr>
+          <w:p>
+            <w:pPr>
+              <w:jc w:val="left"/>
+            </w:pPr>
+            <w:r>
+              <w:rPr>
+                <w:b w:val="false"/>
+                <w:bCs w:val="false"/>
+                <w:sz w:val="19"/>
+                <w:szCs w:val="19"/>
+              </w:rPr>
+              <w:t xml:space="preserve">Python</w:t>
+            </w:r>
+          </w:p>
+        </w:tc>
+        <w:tc>
+          <w:tcPr>
+            <w:tcW w:type="dxa" w:w="2400"/>
+            <w:tcMar>
+              <w:top w:type="dxa" w:w="50"/>
+              <w:left w:type="dxa" w:w="90"/>
+              <w:bottom w:type="dxa" w:w="50"/>
+              <w:right w:type="dxa" w:w="90"/>
+            </w:tcMar>
+          </w:tcPr>
+          <w:p>
+            <w:pPr>
+              <w:jc w:val="center"/>
+            </w:pPr>
+            <w:r>
+              <w:rPr>
+                <w:b w:val="false"/>
+                <w:bCs w:val="false"/>
+                <w:sz w:val="19"/>
+                <w:szCs w:val="19"/>
+              </w:rPr>
+              <w:t xml:space="preserve">3.13.9</w:t>
+            </w:r>
+          </w:p>
+        </w:tc>
+      </w:tr>
+      <w:tr>
+        <w:tc>
+          <w:tcPr>
+            <w:tcW w:type="dxa" w:w="2600"/>
+            <w:tcMar>
+              <w:top w:type="dxa" w:w="50"/>
+              <w:left w:type="dxa" w:w="90"/>
+              <w:bottom w:type="dxa" w:w="50"/>
+              <w:right w:type="dxa" w:w="90"/>
+            </w:tcMar>
+          </w:tcPr>
+          <w:p>
+            <w:pPr>
+              <w:jc w:val="left"/>
+            </w:pPr>
+            <w:r>
+              <w:rPr>
+                <w:b w:val="false"/>
+                <w:bCs w:val="false"/>
+                <w:sz w:val="19"/>
+                <w:szCs w:val="19"/>
+              </w:rPr>
+              <w:t xml:space="preserve">Machine learning</w:t>
+            </w:r>
+          </w:p>
+        </w:tc>
+        <w:tc>
+          <w:tcPr>
+            <w:tcW w:type="dxa" w:w="2600"/>
+            <w:tcMar>
+              <w:top w:type="dxa" w:w="50"/>
+              <w:left w:type="dxa" w:w="90"/>
+              <w:bottom w:type="dxa" w:w="50"/>
+              <w:right w:type="dxa" w:w="90"/>
+            </w:tcMar>
+          </w:tcPr>
+          <w:p>
+            <w:pPr>
+              <w:jc w:val="left"/>
+            </w:pPr>
+            <w:r>
+              <w:rPr>
+                <w:b w:val="false"/>
+                <w:bCs w:val="false"/>
+                <w:sz w:val="19"/>
+                <w:szCs w:val="19"/>
+              </w:rPr>
+              <w:t xml:space="preserve">scikit-learn</w:t>
+            </w:r>
+          </w:p>
+        </w:tc>
+        <w:tc>
+          <w:tcPr>
+            <w:tcW w:type="dxa" w:w="2400"/>
+            <w:tcMar>
+              <w:top w:type="dxa" w:w="50"/>
+              <w:left w:type="dxa" w:w="90"/>
+              <w:bottom w:type="dxa" w:w="50"/>
+              <w:right w:type="dxa" w:w="90"/>
+            </w:tcMar>
+          </w:tcPr>
+          <w:p>
+            <w:pPr>
+              <w:jc w:val="center"/>
+            </w:pPr>
+            <w:r>
+              <w:rPr>
+                <w:b w:val="false"/>
+                <w:bCs w:val="false"/>
+                <w:sz w:val="19"/>
+                <w:szCs w:val="19"/>
+              </w:rPr>
+              <w:t xml:space="preserve">1.9.0</w:t>
+            </w:r>
+          </w:p>
+        </w:tc>
+      </w:tr>
+      <w:tr>
+        <w:tc>
+          <w:tcPr>
+            <w:tcW w:type="dxa" w:w="2600"/>
+            <w:tcMar>
+              <w:top w:type="dxa" w:w="50"/>
+              <w:left w:type="dxa" w:w="90"/>
+              <w:bottom w:type="dxa" w:w="50"/>
+              <w:right w:type="dxa" w:w="90"/>
+            </w:tcMar>
+          </w:tcPr>
+          <w:p>
+            <w:pPr>
+              <w:jc w:val="left"/>
+            </w:pPr>
+            <w:r>
+              <w:rPr>
+                <w:b w:val="false"/>
+                <w:bCs w:val="false"/>
+                <w:sz w:val="19"/>
+                <w:szCs w:val="19"/>
+              </w:rPr>
+              <w:t xml:space="preserve">Gradient boosting</w:t>
+            </w:r>
+          </w:p>
+        </w:tc>
+        <w:tc>
+          <w:tcPr>
+            <w:tcW w:type="dxa" w:w="2600"/>
+            <w:tcMar>
+              <w:top w:type="dxa" w:w="50"/>
+              <w:left w:type="dxa" w:w="90"/>
+              <w:bottom w:type="dxa" w:w="50"/>
+              <w:right w:type="dxa" w:w="90"/>
+            </w:tcMar>
+          </w:tcPr>
+          <w:p>
+            <w:pPr>
+              <w:jc w:val="left"/>
+            </w:pPr>
+            <w:r>
+              <w:rPr>
+                <w:b w:val="false"/>
+                <w:bCs w:val="false"/>
+                <w:sz w:val="19"/>
+                <w:szCs w:val="19"/>
+              </w:rPr>
+              <w:t xml:space="preserve">xgboost</w:t>
+            </w:r>
+          </w:p>
+        </w:tc>
+        <w:tc>
+          <w:tcPr>
+            <w:tcW w:type="dxa" w:w="2400"/>
+            <w:tcMar>
+              <w:top w:type="dxa" w:w="50"/>
+              <w:left w:type="dxa" w:w="90"/>
+              <w:bottom w:type="dxa" w:w="50"/>
+              <w:right w:type="dxa" w:w="90"/>
+            </w:tcMar>
+          </w:tcPr>
+          <w:p>
+            <w:pPr>
+              <w:jc w:val="center"/>
+            </w:pPr>
+            <w:r>
+              <w:rPr>
+                <w:b w:val="false"/>
+                <w:bCs w:val="false"/>
+                <w:sz w:val="19"/>
+                <w:szCs w:val="19"/>
+              </w:rPr>
+              <w:t xml:space="preserve">not pinned</w:t>
+            </w:r>
+          </w:p>
+        </w:tc>
+      </w:tr>
+      <w:tr>
+        <w:tc>
+          <w:tcPr>
+            <w:tcW w:type="dxa" w:w="2600"/>
+            <w:tcMar>
+              <w:top w:type="dxa" w:w="50"/>
+              <w:left w:type="dxa" w:w="90"/>
+              <w:bottom w:type="dxa" w:w="50"/>
+              <w:right w:type="dxa" w:w="90"/>
+            </w:tcMar>
+          </w:tcPr>
+          <w:p>
+            <w:pPr>
+              <w:jc w:val="left"/>
+            </w:pPr>
+            <w:r>
+              <w:rPr>
+                <w:b w:val="false"/>
+                <w:bCs w:val="false"/>
+                <w:sz w:val="19"/>
+                <w:szCs w:val="19"/>
+              </w:rPr>
+              <w:t xml:space="preserve">Class balancing</w:t>
+            </w:r>
+          </w:p>
+        </w:tc>
+        <w:tc>
+          <w:tcPr>
+            <w:tcW w:type="dxa" w:w="2600"/>
+            <w:tcMar>
+              <w:top w:type="dxa" w:w="50"/>
+              <w:left w:type="dxa" w:w="90"/>
+              <w:bottom w:type="dxa" w:w="50"/>
+              <w:right w:type="dxa" w:w="90"/>
+            </w:tcMar>
+          </w:tcPr>
+          <w:p>
+            <w:pPr>
+              <w:jc w:val="left"/>
+            </w:pPr>
+            <w:r>
+              <w:rPr>
+                <w:b w:val="false"/>
+                <w:bCs w:val="false"/>
+                <w:sz w:val="19"/>
+                <w:szCs w:val="19"/>
+              </w:rPr>
+              <w:t xml:space="preserve">imbalanced-learn</w:t>
+            </w:r>
+          </w:p>
+        </w:tc>
+        <w:tc>
+          <w:tcPr>
+            <w:tcW w:type="dxa" w:w="2400"/>
+            <w:tcMar>
+              <w:top w:type="dxa" w:w="50"/>
+              <w:left w:type="dxa" w:w="90"/>
+              <w:bottom w:type="dxa" w:w="50"/>
+              <w:right w:type="dxa" w:w="90"/>
+            </w:tcMar>
+          </w:tcPr>
+          <w:p>
+            <w:pPr>
+              <w:jc w:val="center"/>
+            </w:pPr>
+            <w:r>
+              <w:rPr>
+                <w:b w:val="false"/>
+                <w:bCs w:val="false"/>
+                <w:sz w:val="19"/>
+                <w:szCs w:val="19"/>
+              </w:rPr>
+              <w:t xml:space="preserve">0.14.2</w:t>
+            </w:r>
+          </w:p>
+        </w:tc>
+      </w:tr>
+      <w:tr>
+        <w:tc>
+          <w:tcPr>
+            <w:tcW w:type="dxa" w:w="2600"/>
+            <w:tcMar>
+              <w:top w:type="dxa" w:w="50"/>
+              <w:left w:type="dxa" w:w="90"/>
+              <w:bottom w:type="dxa" w:w="50"/>
+              <w:right w:type="dxa" w:w="90"/>
+            </w:tcMar>
+          </w:tcPr>
+          <w:p>
+            <w:pPr>
+              <w:jc w:val="left"/>
+            </w:pPr>
+            <w:r>
+              <w:rPr>
+                <w:b w:val="false"/>
+                <w:bCs w:val="false"/>
+                <w:sz w:val="19"/>
+                <w:szCs w:val="19"/>
+              </w:rPr>
+              <w:t xml:space="preserve">Explainability</w:t>
+            </w:r>
+          </w:p>
+        </w:tc>
+        <w:tc>
+          <w:tcPr>
+            <w:tcW w:type="dxa" w:w="2600"/>
+            <w:tcMar>
+              <w:top w:type="dxa" w:w="50"/>
+              <w:left w:type="dxa" w:w="90"/>
+              <w:bottom w:type="dxa" w:w="50"/>
+              <w:right w:type="dxa" w:w="90"/>
+            </w:tcMar>
+          </w:tcPr>
+          <w:p>
+            <w:pPr>
+              <w:jc w:val="left"/>
+            </w:pPr>
+            <w:r>
+              <w:rPr>
+                <w:b w:val="false"/>
+                <w:bCs w:val="false"/>
+                <w:sz w:val="19"/>
+                <w:szCs w:val="19"/>
+              </w:rPr>
+              <w:t xml:space="preserve">shap</w:t>
+            </w:r>
+          </w:p>
+        </w:tc>
+        <w:tc>
+          <w:tcPr>
+            <w:tcW w:type="dxa" w:w="2400"/>
+            <w:tcMar>
+              <w:top w:type="dxa" w:w="50"/>
+              <w:left w:type="dxa" w:w="90"/>
+              <w:bottom w:type="dxa" w:w="50"/>
+              <w:right w:type="dxa" w:w="90"/>
+            </w:tcMar>
+          </w:tcPr>
+          <w:p>
+            <w:pPr>
+              <w:jc w:val="center"/>
+            </w:pPr>
+            <w:r>
+              <w:rPr>
+                <w:b w:val="false"/>
+                <w:bCs w:val="false"/>
+                <w:sz w:val="19"/>
+                <w:szCs w:val="19"/>
+              </w:rPr>
+              <w:t xml:space="preserve">0.52.0</w:t>
+            </w:r>
+          </w:p>
+        </w:tc>
+      </w:tr>
+      <w:tr>
+        <w:tc>
+          <w:tcPr>
+            <w:tcW w:type="dxa" w:w="2600"/>
+            <w:tcMar>
+              <w:top w:type="dxa" w:w="50"/>
+              <w:left w:type="dxa" w:w="90"/>
+              <w:bottom w:type="dxa" w:w="50"/>
+              <w:right w:type="dxa" w:w="90"/>
+            </w:tcMar>
+          </w:tcPr>
+          <w:p>
+            <w:pPr>
+              <w:jc w:val="left"/>
+            </w:pPr>
+            <w:r>
+              <w:rPr>
+                <w:b w:val="false"/>
+                <w:bCs w:val="false"/>
+                <w:sz w:val="19"/>
+                <w:szCs w:val="19"/>
+              </w:rPr>
+              <w:t xml:space="preserve">Data handling</w:t>
+            </w:r>
+          </w:p>
+        </w:tc>
+        <w:tc>
+          <w:tcPr>
+            <w:tcW w:type="dxa" w:w="2600"/>
+            <w:tcMar>
+              <w:top w:type="dxa" w:w="50"/>
+              <w:left w:type="dxa" w:w="90"/>
+              <w:bottom w:type="dxa" w:w="50"/>
+              <w:right w:type="dxa" w:w="90"/>
+            </w:tcMar>
+          </w:tcPr>
+          <w:p>
+            <w:pPr>
+              <w:jc w:val="left"/>
+            </w:pPr>
+            <w:r>
+              <w:rPr>
+                <w:b w:val="false"/>
+                <w:bCs w:val="false"/>
+                <w:sz w:val="19"/>
+                <w:szCs w:val="19"/>
+              </w:rPr>
+              <w:t xml:space="preserve">pandas / numpy</w:t>
+            </w:r>
+          </w:p>
+        </w:tc>
+        <w:tc>
+          <w:tcPr>
+            <w:tcW w:type="dxa" w:w="2400"/>
+            <w:tcMar>
+              <w:top w:type="dxa" w:w="50"/>
+              <w:left w:type="dxa" w:w="90"/>
+              <w:bottom w:type="dxa" w:w="50"/>
+              <w:right w:type="dxa" w:w="90"/>
+            </w:tcMar>
+          </w:tcPr>
+          <w:p>
+            <w:pPr>
+              <w:jc w:val="center"/>
+            </w:pPr>
+            <w:r>
+              <w:rPr>
+                <w:b w:val="false"/>
+                <w:bCs w:val="false"/>
+                <w:sz w:val="19"/>
+                <w:szCs w:val="19"/>
+              </w:rPr>
+              <w:t xml:space="preserve">3.0.5 / 2.5.2</w:t>
+            </w:r>
+          </w:p>
+        </w:tc>
+      </w:tr>
+      <w:tr>
+        <w:tc>
+          <w:tcPr>
+            <w:tcW w:type="dxa" w:w="2600"/>
+            <w:tcMar>
+              <w:top w:type="dxa" w:w="50"/>
+              <w:left w:type="dxa" w:w="90"/>
+              <w:bottom w:type="dxa" w:w="50"/>
+              <w:right w:type="dxa" w:w="90"/>
+            </w:tcMar>
+          </w:tcPr>
+          <w:p>
+            <w:pPr>
+              <w:jc w:val="left"/>
+            </w:pPr>
+            <w:r>
+              <w:rPr>
+                <w:b w:val="false"/>
+                <w:bCs w:val="false"/>
+                <w:sz w:val="19"/>
+                <w:szCs w:val="19"/>
+              </w:rPr>
+              <w:t xml:space="preserve">Figures</w:t>
+            </w:r>
+          </w:p>
+        </w:tc>
+        <w:tc>
+          <w:tcPr>
+            <w:tcW w:type="dxa" w:w="2600"/>
+            <w:tcMar>
+              <w:top w:type="dxa" w:w="50"/>
+              <w:left w:type="dxa" w:w="90"/>
+              <w:bottom w:type="dxa" w:w="50"/>
+              <w:right w:type="dxa" w:w="90"/>
+            </w:tcMar>
+          </w:tcPr>
+          <w:p>
+            <w:pPr>
+              <w:jc w:val="left"/>
+            </w:pPr>
+            <w:r>
+              <w:rPr>
+                <w:b w:val="false"/>
+                <w:bCs w:val="false"/>
+                <w:sz w:val="19"/>
+                <w:szCs w:val="19"/>
+              </w:rPr>
+              <w:t xml:space="preserve">matplotlib</w:t>
+            </w:r>
+          </w:p>
+        </w:tc>
+        <w:tc>
+          <w:tcPr>
+            <w:tcW w:type="dxa" w:w="2400"/>
+            <w:tcMar>
+              <w:top w:type="dxa" w:w="50"/>
+              <w:left w:type="dxa" w:w="90"/>
+              <w:bottom w:type="dxa" w:w="50"/>
+              <w:right w:type="dxa" w:w="90"/>
+            </w:tcMar>
+          </w:tcPr>
+          <w:p>
+            <w:pPr>
+              <w:jc w:val="center"/>
+            </w:pPr>
+            <w:r>
+              <w:rPr>
+                <w:b w:val="false"/>
+                <w:bCs w:val="false"/>
+                <w:sz w:val="19"/>
+                <w:szCs w:val="19"/>
+              </w:rPr>
+              <w:t xml:space="preserve">3.11.1</w:t>
+            </w:r>
+          </w:p>
+        </w:tc>
+      </w:tr>
+    </w:tbl>
+    <w:p>
+      <w:pPr>
+        <w:spacing w:after="200" w:line="276"/>
+        <w:jc w:val="both"/>
+      </w:pPr>
+      <w:r>
+        <w:rPr>
+          <w:sz w:val="21"/>
+          <w:szCs w:val="21"/>
+        </w:rPr>
+        <w:t xml:space="preserve">Random forest results on MIES shift by approximately 0.002 balanced accuracy under scikit-learn releases earlier than the pinned version, which is small relative to every effect reported here but worth noting for anyone rerunning the code in a different environment.</w:t>
+      </w:r>
+    </w:p>
+    <w:p>
+      <w:pPr>
+        <w:spacing w:after="120" w:before="220"/>
+      </w:pPr>
+      <w:r>
+        <w:rPr>
+          <w:b/>
+          <w:bCs/>
+          <w:sz w:val="22"/>
+          <w:szCs w:val="22"/>
+        </w:rPr>
+        <w:t xml:space="preserve">B. Reproducibility Statement</w:t>
+      </w:r>
+    </w:p>
+    <w:p>
+      <w:pPr>
+        <w:spacing w:after="160" w:line="276"/>
+        <w:jc w:val="both"/>
+      </w:pPr>
+      <w:r>
+        <w:rPr>
+          <w:sz w:val="21"/>
+          <w:szCs w:val="21"/>
+        </w:rPr>
+        <w:t xml:space="preserve">A single random seed of 42 is applied to every estimator, to SMOTE, and to the cross-validation splitter, and cross-validation folds are stratified throughout. The baseline in Table 1 uses one 80/20 stratified split; every comparison in Section V uses 5-fold cross-validation repeated 10 times, giving 50 fits per arm. Imputation, scaling, resampling, and feature selection are all performed inside the pipeline so that they are fitted on training folds only, except where a condition deliberately does otherwise in order to measure the effect. Missing MIES responses are imputed with the training-fold median. Feature selection keeps the 15 items with the highest ANOVA F-score. The cleaning code, the condition scripts, the figure scripts, and the pinned requirements file are all in the repository listed under Code and Data Availability, and each table in this paper is produced by a named script in that repository.</w:t>
+      </w:r>
+    </w:p>
+    <w:p>
+      <w:pPr>
+        <w:spacing w:after="140" w:before="320"/>
+      </w:pPr>
+      <w:r>
+        <w:rPr>
+          <w:b/>
+          <w:bCs/>
+          <w:sz w:val="26"/>
+          <w:szCs w:val="26"/>
+        </w:rPr>
+        <w:t xml:space="preserve">V. Results and Analysis</w:t>
+      </w:r>
+    </w:p>
+    <w:p>
+      <w:pPr>
+        <w:spacing w:after="160" w:line="276"/>
+        <w:jc w:val="both"/>
+      </w:pPr>
+      <w:r>
+        <w:rPr>
+          <w:sz w:val="21"/>
+          <w:szCs w:val="21"/>
+        </w:rPr>
         <w:t xml:space="preserve">Table 1 gives baseline accuracy for each dataset and model on a single split, and Table 2 gives the effect of each condition measured across 50 fits. Figure 1 shows the same four effects with their intervals.</w:t>
+      </w:r>
+    </w:p>
+    <w:p>
+      <w:pPr>
+        <w:spacing w:after="120" w:before="220"/>
+      </w:pPr>
+      <w:r>
+        <w:rPr>
+          <w:b/>
+          <w:bCs/>
+          <w:sz w:val="22"/>
+          <w:szCs w:val="22"/>
+        </w:rPr>
+        <w:t xml:space="preserve">A. Baseline Accuracy</w:t>
       </w:r>
     </w:p>
     <w:tbl>
@@ -933,13 +1845,28 @@
     <w:p>
       <w:pPr>
         <w:spacing w:after="240"/>
+        <w:jc w:val="center"/>
       </w:pPr>
       <w:r>
         <w:rPr>
           <w:sz w:val="18"/>
           <w:szCs w:val="18"/>
         </w:rPr>
-        <w:t xml:space="preserve">Table 1. Accuracy on a held-out 20% test set, single stratified split. The Kaggle rows and the two-class MIES rows are close to one another, while the three-class MIES rows sit roughly 18 points lower.</w:t>
+        <w:t xml:space="preserve">Table 1: Accuracy on a held-out 20% test set, single stratified split. The Kaggle rows and the two-class MIES rows are close to one another, while the three-class MIES rows sit roughly 18 points lower.</w:t>
+      </w:r>
+    </w:p>
+    <w:p>
+      <w:pPr>
+        <w:spacing w:after="120" w:before="220"/>
+      </w:pPr>
+      <w:r>
+        <w:rPr>
+          <w:b/>
+          <w:bCs/>
+          <w:sz w:val="22"/>
+          <w:szCs w:val="22"/>
+        </w:rPr>
+        <w:t xml:space="preserve">B. Effect of Each Condition</w:t>
       </w:r>
     </w:p>
     <w:tbl>
@@ -2294,13 +3221,14 @@
     <w:p>
       <w:pPr>
         <w:spacing w:after="240"/>
+        <w:jc w:val="center"/>
       </w:pPr>
       <w:r>
         <w:rPr>
           <w:sz w:val="18"/>
           <w:szCs w:val="18"/>
         </w:rPr>
-        <w:t xml:space="preserve">Table 2. Effect of each condition, in percentage points of balanced accuracy, from 5-fold cross-validation repeated 10 times. Intervals are 95%. Only the selection-order intervals contain zero.</w:t>
+        <w:t xml:space="preserve">Table 2: Effect of each condition, in percentage points of balanced accuracy, from 5-fold cross-validation repeated 10 times. Intervals are 95%. Only the selection-order intervals contain zero.</w:t>
       </w:r>
     </w:p>
     <w:p>
@@ -2312,848 +3240,6 @@
         <w:drawing>
           <wp:inline distT="0" distB="0" distL="0" distR="0">
             <wp:extent cx="4095750" cy="2381250"/>
-            <wp:effectExtent t="0" r="0" b="0" l="0"/>
-            <wp:docPr id="1" name="" descr="" title=""/>
-            <wp:cNvGraphicFramePr>
-              <a:graphicFrameLocks xmlns:a="http://schemas.openxmlformats.org/drawingml/2006/main" noChangeAspect="1"/>
-            </wp:cNvGraphicFramePr>
-            <a:graphic xmlns:a="http://schemas.openxmlformats.org/drawingml/2006/main">
-              <a:graphicData uri="http://schemas.openxmlformats.org/drawingml/2006/picture">
-                <pic:pic xmlns:pic="http://schemas.openxmlformats.org/drawingml/2006/picture">
-                  <pic:nvPicPr>
-                    <pic:cNvPr id="0" name="" descr=""/>
-                    <pic:cNvPicPr>
-                      <a:picLocks noChangeAspect="1" noChangeArrowheads="1"/>
-                    </pic:cNvPicPr>
-                  </pic:nvPicPr>
-                  <pic:blipFill>
-                    <a:blip r:embed="rId7" cstate="none"/>
-                    <a:srcRect/>
-                    <a:stretch>
-                      <a:fillRect/>
-                    </a:stretch>
-                  </pic:blipFill>
-                  <pic:spPr bwMode="auto">
-                    <a:xfrm>
-                      <a:off x="0" y="0"/>
-                      <a:ext cx="4095750" cy="2381250"/>
-                    </a:xfrm>
-                    <a:prstGeom prst="rect">
-                      <a:avLst/>
-                    </a:prstGeom>
-                  </pic:spPr>
-                </pic:pic>
-              </a:graphicData>
-            </a:graphic>
-          </wp:inline>
-        </w:drawing>
-      </w:r>
-    </w:p>
-    <w:p>
-      <w:pPr>
-        <w:spacing w:after="240"/>
-      </w:pPr>
-      <w:r>
-        <w:rPr>
-          <w:sz w:val="18"/>
-          <w:szCs w:val="18"/>
-        </w:rPr>
-        <w:t xml:space="preserve">Figure 1. The four conditions, random forest, with 95% intervals. The interval for selection order crosses zero; the others do not.</w:t>
-      </w:r>
-    </w:p>
-    <w:p>
-      <w:pPr>
-        <w:spacing w:after="120" w:before="220"/>
-      </w:pPr>
-      <w:r>
-        <w:rPr>
-          <w:b/>
-          <w:bCs/>
-          <w:sz w:val="22"/>
-          <w:szCs w:val="22"/>
-        </w:rPr>
-        <w:t xml:space="preserve">3.1  Class structure</w:t>
-      </w:r>
-    </w:p>
-    <w:p>
-      <w:pPr>
-        <w:spacing w:after="160" w:line="276"/>
-        <w:jc w:val="both"/>
-      </w:pPr>
-      <w:r>
-        <w:rPr>
-          <w:sz w:val="21"/>
-          <w:szCs w:val="21"/>
-        </w:rPr>
-        <w:t xml:space="preserve">Removing the 1,769 respondents who identify as neither introvert nor extrovert raises balanced accuracy by 22.76 to 23.46 points depending on the model. This is the largest effect measured here.</w:t>
-      </w:r>
-    </w:p>
-    <w:p>
-      <w:pPr>
-        <w:spacing w:after="160" w:line="276"/>
-        <w:jc w:val="both"/>
-      </w:pPr>
-      <w:r>
-        <w:rPr>
-          <w:sz w:val="21"/>
-          <w:szCs w:val="21"/>
-        </w:rPr>
-        <w:t xml:space="preserve">It is important to be clear about what this comparison is. Dropping the neither group does not simply clean the data; it converts a three-class problem into a two-class problem and removes the respondents whose self-description is least definite. Accuracy rises partly because the remaining population is easier to separate. The point is not that removing this group is wrong, since a two-class problem is a reasonable thing to study. The point is that a two-class result and a three-class result describe different tasks and cannot be placed side by side.</w:t>
-      </w:r>
-    </w:p>
-    <w:p>
-      <w:pPr>
-        <w:spacing w:after="160" w:line="276"/>
-        <w:jc w:val="both"/>
-      </w:pPr>
-      <w:r>
-        <w:rPr>
-          <w:sz w:val="21"/>
-          <w:szCs w:val="21"/>
-        </w:rPr>
-        <w:t xml:space="preserve">This matters for reading the existing literature. My three-class results, at 0.728 to 0.736 raw accuracy, fall close to two published studies using the same instrument: So [12] reports 73.81% and Fieri et al. [13] report 73.5% before resampling. Both studies retained the neither group. Fieri et al. state class counts of 4,404, 989, and 1,768, which include all three groups. So reports a no-information rate of 61.51%, which matches the majority-class share of the three-class version of this data (61.48%) rather than the two-class version (81.6%).</w:t>
-      </w:r>
-    </w:p>
-    <w:p>
-      <w:pPr>
-        <w:spacing w:after="120" w:before="220"/>
-      </w:pPr>
-      <w:r>
-        <w:rPr>
-          <w:b/>
-          <w:bCs/>
-          <w:sz w:val="22"/>
-          <w:szCs w:val="22"/>
-        </w:rPr>
-        <w:t xml:space="preserve">3.2  Resampling order</w:t>
-      </w:r>
-    </w:p>
-    <w:p>
-      <w:pPr>
-        <w:spacing w:after="160" w:line="276"/>
-        <w:jc w:val="both"/>
-      </w:pPr>
-      <w:r>
-        <w:rPr>
-          <w:sz w:val="21"/>
-          <w:szCs w:val="21"/>
-        </w:rPr>
-        <w:t xml:space="preserve">Applying SMOTE to the whole dataset before splitting, rather than inside each training fold, raises balanced accuracy on MIES by 20.69 points for the random forest, 18.33 for XGBoost, and 5.68 for logistic regression. On the Kaggle dataset the same change moves accuracy by less than 0.5 points in every case.</w:t>
-      </w:r>
-    </w:p>
-    <w:p>
-      <w:pPr>
-        <w:spacing w:after="160" w:line="276"/>
-        <w:jc w:val="both"/>
-      </w:pPr>
-      <w:r>
-        <w:rPr>
-          <w:sz w:val="21"/>
-          <w:szCs w:val="21"/>
-        </w:rPr>
-        <w:t xml:space="preserve">The mechanism is straightforward. SMOTE creates new minority-class rows by interpolating between existing ones. If those rows are created before the split, a synthetic row in a test fold can be an interpolation of two rows that are in the training fold, so the model is scored on points partly built from data it trained on. Resampling inside the training fold avoids this, because the test fold is never used to create anything.</w:t>
-      </w:r>
-    </w:p>
-    <w:p>
-      <w:pPr>
-        <w:spacing w:after="160" w:line="276"/>
-        <w:jc w:val="both"/>
-      </w:pPr>
-      <w:r>
-        <w:rPr>
-          <w:sz w:val="21"/>
-          <w:szCs w:val="21"/>
-        </w:rPr>
-        <w:t xml:space="preserve">Two things have to hold for the effect to appear. The classes have to be imbalanced enough for SMOTE to generate a large number of synthetic rows, which is why the Kaggle dataset shows almost nothing at 51/49 while MIES shows 20 points at 61/14/25. And the model has to be able to memorize individual rows. A logistic regression on seven features has seven coefficients and cannot store a particular row, which is why it gains 5.68 points where the random forest gains 20.69.</w:t>
-      </w:r>
-    </w:p>
-    <w:p>
-      <w:pPr>
-        <w:spacing w:after="160" w:line="276"/>
-        <w:jc w:val="both"/>
-      </w:pPr>
-      <w:r>
-        <w:rPr>
-          <w:sz w:val="21"/>
-          <w:szCs w:val="21"/>
-        </w:rPr>
-        <w:t xml:space="preserve">For comparison, Fieri et al. [13] report 73.5% before resampling and 95.5% after. The size of the change I measure from ordering alone is close to the size of the change they report, though I have not inspected their code and make no claim about what produced their numbers.</w:t>
-      </w:r>
-    </w:p>
-    <w:p>
-      <w:pPr>
-        <w:spacing w:after="120" w:before="220"/>
-      </w:pPr>
-      <w:r>
-        <w:rPr>
-          <w:b/>
-          <w:bCs/>
-          <w:sz w:val="22"/>
-          <w:szCs w:val="22"/>
-        </w:rPr>
-        <w:t xml:space="preserve">3.3  Duplicate rows</w:t>
-      </w:r>
-    </w:p>
-    <w:p>
-      <w:pPr>
-        <w:spacing w:after="160" w:line="276"/>
-        <w:jc w:val="both"/>
-      </w:pPr>
-      <w:r>
-        <w:rPr>
-          <w:sz w:val="21"/>
-          <w:szCs w:val="21"/>
-        </w:rPr>
-        <w:t xml:space="preserve">Keeping the 486 duplicate rows in the Kaggle file changes balanced accuracy by -1.47 points for the random forest, -1.41 for logistic regression, and -0.50 for XGBoost. All three intervals exclude zero, so the effect is real but small, and it runs in the opposite direction to what might be expected: keeping duplicates makes performance slightly worse rather than better.</w:t>
-      </w:r>
-    </w:p>
-    <w:p>
-      <w:pPr>
-        <w:spacing w:after="160" w:line="276"/>
-        <w:jc w:val="both"/>
-      </w:pPr>
-      <w:r>
-        <w:rPr>
-          <w:sz w:val="21"/>
-          <w:szCs w:val="21"/>
-        </w:rPr>
-        <w:t xml:space="preserve">The duplicates do produce overlap between training and test data. On a single 80/20 split of the raw file, 27.9% of test rows appear identically somewhere in the training set. That overlap exists in the file as published, before any analysis is performed. It does not translate into inflated balanced accuracy at this scale, but it is worth removing on principle, and worth knowing about for anyone using the dataset.</w:t>
-      </w:r>
-    </w:p>
-    <w:p>
-      <w:pPr>
-        <w:spacing w:after="120" w:before="220"/>
-      </w:pPr>
-      <w:r>
-        <w:rPr>
-          <w:b/>
-          <w:bCs/>
-          <w:sz w:val="22"/>
-          <w:szCs w:val="22"/>
-        </w:rPr>
-        <w:t xml:space="preserve">3.4  Feature selection order</w:t>
-      </w:r>
-    </w:p>
-    <w:p>
-      <w:pPr>
-        <w:spacing w:after="160" w:line="276"/>
-        <w:jc w:val="both"/>
-      </w:pPr>
-      <w:r>
-        <w:rPr>
-          <w:sz w:val="21"/>
-          <w:szCs w:val="21"/>
-        </w:rPr>
-        <w:t xml:space="preserve">Selecting the top 15 features by ANOVA F-score using the whole dataset, rather than inside each training fold, changes balanced accuracy by +0.08, -0.00, and +0.10 points for the three models. All three 95% intervals contain zero, the widest running from -0.46 to +0.63. There is no evidence of a systematic effect under these conditions.</w:t>
-      </w:r>
-    </w:p>
-    <w:p>
-      <w:pPr>
-        <w:spacing w:after="160" w:line="276"/>
-        <w:jc w:val="both"/>
-      </w:pPr>
-      <w:r>
-        <w:rPr>
-          <w:sz w:val="21"/>
-          <w:szCs w:val="21"/>
-        </w:rPr>
-        <w:t xml:space="preserve">This is worth stating because feature-selection order looks like the same category of mistake as resampling order. Both involve using the full dataset for a step that should be confined to training data. One produces a 20-point difference and the other produces nothing measurable.</w:t>
-      </w:r>
-    </w:p>
-    <w:p>
-      <w:pPr>
-        <w:spacing w:after="120" w:before="220"/>
-      </w:pPr>
-      <w:r>
-        <w:rPr>
-          <w:b/>
-          <w:bCs/>
-          <w:sz w:val="22"/>
-          <w:szCs w:val="22"/>
-        </w:rPr>
-        <w:t xml:space="preserve">3.5  Why selection order has so little effect</w:t>
-      </w:r>
-    </w:p>
-    <w:p>
-      <w:pPr>
-        <w:spacing w:after="160" w:line="276"/>
-        <w:jc w:val="both"/>
-      </w:pPr>
-      <w:r>
-        <w:rPr>
-          <w:sz w:val="21"/>
-          <w:szCs w:val="21"/>
-        </w:rPr>
-        <w:t xml:space="preserve">The reason appears to be that the items in these datasets carry heavily overlapping information, so which subset is chosen matters less than it might.</w:t>
-      </w:r>
-    </w:p>
-    <w:tbl>
-      <w:tblPr>
-        <w:tblW w:type="dxa" w:w="7600"/>
-        <w:tblBorders>
-          <w:top w:val="single" w:color="auto" w:sz="4"/>
-          <w:left w:val="single" w:color="auto" w:sz="4"/>
-          <w:bottom w:val="single" w:color="auto" w:sz="4"/>
-          <w:right w:val="single" w:color="auto" w:sz="4"/>
-          <w:insideH w:val="single" w:color="auto" w:sz="4"/>
-          <w:insideV w:val="single" w:color="auto" w:sz="4"/>
-        </w:tblBorders>
-      </w:tblPr>
-      <w:tblGrid>
-        <w:gridCol w:w="2400"/>
-        <w:gridCol w:w="1200"/>
-        <w:gridCol w:w="1700"/>
-        <w:gridCol w:w="1300"/>
-        <w:gridCol w:w="1300"/>
-      </w:tblGrid>
-      <w:tr>
-        <w:tc>
-          <w:tcPr>
-            <w:tcW w:type="dxa" w:w="2400"/>
-            <w:shd w:fill="EDEDED" w:val="clear"/>
-            <w:tcMar>
-              <w:top w:type="dxa" w:w="50"/>
-              <w:left w:type="dxa" w:w="90"/>
-              <w:bottom w:type="dxa" w:w="50"/>
-              <w:right w:type="dxa" w:w="90"/>
-            </w:tcMar>
-          </w:tcPr>
-          <w:p>
-            <w:pPr>
-              <w:jc w:val="left"/>
-            </w:pPr>
-            <w:r>
-              <w:rPr>
-                <w:b/>
-                <w:bCs/>
-                <w:sz w:val="19"/>
-                <w:szCs w:val="19"/>
-              </w:rPr>
-              <w:t xml:space="preserve">Item set</w:t>
-            </w:r>
-          </w:p>
-        </w:tc>
-        <w:tc>
-          <w:tcPr>
-            <w:tcW w:type="dxa" w:w="1200"/>
-            <w:shd w:fill="EDEDED" w:val="clear"/>
-            <w:tcMar>
-              <w:top w:type="dxa" w:w="50"/>
-              <w:left w:type="dxa" w:w="90"/>
-              <w:bottom w:type="dxa" w:w="50"/>
-              <w:right w:type="dxa" w:w="90"/>
-            </w:tcMar>
-          </w:tcPr>
-          <w:p>
-            <w:pPr>
-              <w:jc w:val="center"/>
-            </w:pPr>
-            <w:r>
-              <w:rPr>
-                <w:b/>
-                <w:bCs/>
-                <w:sz w:val="19"/>
-                <w:szCs w:val="19"/>
-              </w:rPr>
-              <w:t xml:space="preserve">Items</w:t>
-            </w:r>
-          </w:p>
-        </w:tc>
-        <w:tc>
-          <w:tcPr>
-            <w:tcW w:type="dxa" w:w="1700"/>
-            <w:shd w:fill="EDEDED" w:val="clear"/>
-            <w:tcMar>
-              <w:top w:type="dxa" w:w="50"/>
-              <w:left w:type="dxa" w:w="90"/>
-              <w:bottom w:type="dxa" w:w="50"/>
-              <w:right w:type="dxa" w:w="90"/>
-            </w:tcMar>
-          </w:tcPr>
-          <w:p>
-            <w:pPr>
-              <w:jc w:val="center"/>
-            </w:pPr>
-            <w:r>
-              <w:rPr>
-                <w:b/>
-                <w:bCs/>
-                <w:sz w:val="19"/>
-                <w:szCs w:val="19"/>
-              </w:rPr>
-              <w:t xml:space="preserve">Mean overlap</w:t>
-            </w:r>
-          </w:p>
-        </w:tc>
-        <w:tc>
-          <w:tcPr>
-            <w:tcW w:type="dxa" w:w="1300"/>
-            <w:shd w:fill="EDEDED" w:val="clear"/>
-            <w:tcMar>
-              <w:top w:type="dxa" w:w="50"/>
-              <w:left w:type="dxa" w:w="90"/>
-              <w:bottom w:type="dxa" w:w="50"/>
-              <w:right w:type="dxa" w:w="90"/>
-            </w:tcMar>
-          </w:tcPr>
-          <w:p>
-            <w:pPr>
-              <w:jc w:val="center"/>
-            </w:pPr>
-            <w:r>
-              <w:rPr>
-                <w:b/>
-                <w:bCs/>
-                <w:sz w:val="19"/>
-                <w:szCs w:val="19"/>
-              </w:rPr>
-              <w:t xml:space="preserve">Lowest</w:t>
-            </w:r>
-          </w:p>
-        </w:tc>
-        <w:tc>
-          <w:tcPr>
-            <w:tcW w:type="dxa" w:w="1300"/>
-            <w:shd w:fill="EDEDED" w:val="clear"/>
-            <w:tcMar>
-              <w:top w:type="dxa" w:w="50"/>
-              <w:left w:type="dxa" w:w="90"/>
-              <w:bottom w:type="dxa" w:w="50"/>
-              <w:right w:type="dxa" w:w="90"/>
-            </w:tcMar>
-          </w:tcPr>
-          <w:p>
-            <w:pPr>
-              <w:jc w:val="center"/>
-            </w:pPr>
-            <w:r>
-              <w:rPr>
-                <w:b/>
-                <w:bCs/>
-                <w:sz w:val="19"/>
-                <w:szCs w:val="19"/>
-              </w:rPr>
-              <w:t xml:space="preserve">Highest</w:t>
-            </w:r>
-          </w:p>
-        </w:tc>
-      </w:tr>
-      <w:tr>
-        <w:tc>
-          <w:tcPr>
-            <w:tcW w:type="dxa" w:w="2400"/>
-            <w:tcMar>
-              <w:top w:type="dxa" w:w="50"/>
-              <w:left w:type="dxa" w:w="90"/>
-              <w:bottom w:type="dxa" w:w="50"/>
-              <w:right w:type="dxa" w:w="90"/>
-            </w:tcMar>
-          </w:tcPr>
-          <w:p>
-            <w:pPr>
-              <w:jc w:val="left"/>
-            </w:pPr>
-            <w:r>
-              <w:rPr>
-                <w:b w:val="false"/>
-                <w:bCs w:val="false"/>
-                <w:sz w:val="19"/>
-                <w:szCs w:val="19"/>
-              </w:rPr>
-              <w:t xml:space="preserve">Kaggle behaviors</w:t>
-            </w:r>
-          </w:p>
-        </w:tc>
-        <w:tc>
-          <w:tcPr>
-            <w:tcW w:type="dxa" w:w="1200"/>
-            <w:tcMar>
-              <w:top w:type="dxa" w:w="50"/>
-              <w:left w:type="dxa" w:w="90"/>
-              <w:bottom w:type="dxa" w:w="50"/>
-              <w:right w:type="dxa" w:w="90"/>
-            </w:tcMar>
-          </w:tcPr>
-          <w:p>
-            <w:pPr>
-              <w:jc w:val="center"/>
-            </w:pPr>
-            <w:r>
-              <w:rPr>
-                <w:b w:val="false"/>
-                <w:bCs w:val="false"/>
-                <w:sz w:val="19"/>
-                <w:szCs w:val="19"/>
-              </w:rPr>
-              <w:t xml:space="preserve">7</w:t>
-            </w:r>
-          </w:p>
-        </w:tc>
-        <w:tc>
-          <w:tcPr>
-            <w:tcW w:type="dxa" w:w="1700"/>
-            <w:tcMar>
-              <w:top w:type="dxa" w:w="50"/>
-              <w:left w:type="dxa" w:w="90"/>
-              <w:bottom w:type="dxa" w:w="50"/>
-              <w:right w:type="dxa" w:w="90"/>
-            </w:tcMar>
-          </w:tcPr>
-          <w:p>
-            <w:pPr>
-              <w:jc w:val="center"/>
-            </w:pPr>
-            <w:r>
-              <w:rPr>
-                <w:b w:val="false"/>
-                <w:bCs w:val="false"/>
-                <w:sz w:val="19"/>
-                <w:szCs w:val="19"/>
-              </w:rPr>
-              <w:t xml:space="preserve">0.784</w:t>
-            </w:r>
-          </w:p>
-        </w:tc>
-        <w:tc>
-          <w:tcPr>
-            <w:tcW w:type="dxa" w:w="1300"/>
-            <w:tcMar>
-              <w:top w:type="dxa" w:w="50"/>
-              <w:left w:type="dxa" w:w="90"/>
-              <w:bottom w:type="dxa" w:w="50"/>
-              <w:right w:type="dxa" w:w="90"/>
-            </w:tcMar>
-          </w:tcPr>
-          <w:p>
-            <w:pPr>
-              <w:jc w:val="center"/>
-            </w:pPr>
-            <w:r>
-              <w:rPr>
-                <w:b w:val="false"/>
-                <w:bCs w:val="false"/>
-                <w:sz w:val="19"/>
-                <w:szCs w:val="19"/>
-              </w:rPr>
-              <w:t xml:space="preserve">0.69</w:t>
-            </w:r>
-          </w:p>
-        </w:tc>
-        <w:tc>
-          <w:tcPr>
-            <w:tcW w:type="dxa" w:w="1300"/>
-            <w:tcMar>
-              <w:top w:type="dxa" w:w="50"/>
-              <w:left w:type="dxa" w:w="90"/>
-              <w:bottom w:type="dxa" w:w="50"/>
-              <w:right w:type="dxa" w:w="90"/>
-            </w:tcMar>
-          </w:tcPr>
-          <w:p>
-            <w:pPr>
-              <w:jc w:val="center"/>
-            </w:pPr>
-            <w:r>
-              <w:rPr>
-                <w:b w:val="false"/>
-                <w:bCs w:val="false"/>
-                <w:sz w:val="19"/>
-                <w:szCs w:val="19"/>
-              </w:rPr>
-              <w:t xml:space="preserve">0.957</w:t>
-            </w:r>
-          </w:p>
-        </w:tc>
-      </w:tr>
-      <w:tr>
-        <w:tc>
-          <w:tcPr>
-            <w:tcW w:type="dxa" w:w="2400"/>
-            <w:tcMar>
-              <w:top w:type="dxa" w:w="50"/>
-              <w:left w:type="dxa" w:w="90"/>
-              <w:bottom w:type="dxa" w:w="50"/>
-              <w:right w:type="dxa" w:w="90"/>
-            </w:tcMar>
-          </w:tcPr>
-          <w:p>
-            <w:pPr>
-              <w:jc w:val="left"/>
-            </w:pPr>
-            <w:r>
-              <w:rPr>
-                <w:b w:val="false"/>
-                <w:bCs w:val="false"/>
-                <w:sz w:val="19"/>
-                <w:szCs w:val="19"/>
-              </w:rPr>
-              <w:t xml:space="preserve">MIES</w:t>
-            </w:r>
-          </w:p>
-        </w:tc>
-        <w:tc>
-          <w:tcPr>
-            <w:tcW w:type="dxa" w:w="1200"/>
-            <w:tcMar>
-              <w:top w:type="dxa" w:w="50"/>
-              <w:left w:type="dxa" w:w="90"/>
-              <w:bottom w:type="dxa" w:w="50"/>
-              <w:right w:type="dxa" w:w="90"/>
-            </w:tcMar>
-          </w:tcPr>
-          <w:p>
-            <w:pPr>
-              <w:jc w:val="center"/>
-            </w:pPr>
-            <w:r>
-              <w:rPr>
-                <w:b w:val="false"/>
-                <w:bCs w:val="false"/>
-                <w:sz w:val="19"/>
-                <w:szCs w:val="19"/>
-              </w:rPr>
-              <w:t xml:space="preserve">91</w:t>
-            </w:r>
-          </w:p>
-        </w:tc>
-        <w:tc>
-          <w:tcPr>
-            <w:tcW w:type="dxa" w:w="1700"/>
-            <w:tcMar>
-              <w:top w:type="dxa" w:w="50"/>
-              <w:left w:type="dxa" w:w="90"/>
-              <w:bottom w:type="dxa" w:w="50"/>
-              <w:right w:type="dxa" w:w="90"/>
-            </w:tcMar>
-          </w:tcPr>
-          <w:p>
-            <w:pPr>
-              <w:jc w:val="center"/>
-            </w:pPr>
-            <w:r>
-              <w:rPr>
-                <w:b w:val="false"/>
-                <w:bCs w:val="false"/>
-                <w:sz w:val="19"/>
-                <w:szCs w:val="19"/>
-              </w:rPr>
-              <w:t xml:space="preserve">0.196</w:t>
-            </w:r>
-          </w:p>
-        </w:tc>
-        <w:tc>
-          <w:tcPr>
-            <w:tcW w:type="dxa" w:w="1300"/>
-            <w:tcMar>
-              <w:top w:type="dxa" w:w="50"/>
-              <w:left w:type="dxa" w:w="90"/>
-              <w:bottom w:type="dxa" w:w="50"/>
-              <w:right w:type="dxa" w:w="90"/>
-            </w:tcMar>
-          </w:tcPr>
-          <w:p>
-            <w:pPr>
-              <w:jc w:val="center"/>
-            </w:pPr>
-            <w:r>
-              <w:rPr>
-                <w:b w:val="false"/>
-                <w:bCs w:val="false"/>
-                <w:sz w:val="19"/>
-                <w:szCs w:val="19"/>
-              </w:rPr>
-              <w:t xml:space="preserve">0.00</w:t>
-            </w:r>
-          </w:p>
-        </w:tc>
-        <w:tc>
-          <w:tcPr>
-            <w:tcW w:type="dxa" w:w="1300"/>
-            <w:tcMar>
-              <w:top w:type="dxa" w:w="50"/>
-              <w:left w:type="dxa" w:w="90"/>
-              <w:bottom w:type="dxa" w:w="50"/>
-              <w:right w:type="dxa" w:w="90"/>
-            </w:tcMar>
-          </w:tcPr>
-          <w:p>
-            <w:pPr>
-              <w:jc w:val="center"/>
-            </w:pPr>
-            <w:r>
-              <w:rPr>
-                <w:b w:val="false"/>
-                <w:bCs w:val="false"/>
-                <w:sz w:val="19"/>
-                <w:szCs w:val="19"/>
-              </w:rPr>
-              <w:t xml:space="preserve">0.823</w:t>
-            </w:r>
-          </w:p>
-        </w:tc>
-      </w:tr>
-      <w:tr>
-        <w:tc>
-          <w:tcPr>
-            <w:tcW w:type="dxa" w:w="2400"/>
-            <w:tcMar>
-              <w:top w:type="dxa" w:w="50"/>
-              <w:left w:type="dxa" w:w="90"/>
-              <w:bottom w:type="dxa" w:w="50"/>
-              <w:right w:type="dxa" w:w="90"/>
-            </w:tcMar>
-          </w:tcPr>
-          <w:p>
-            <w:pPr>
-              <w:jc w:val="left"/>
-            </w:pPr>
-            <w:r>
-              <w:rPr>
-                <w:b w:val="false"/>
-                <w:bCs w:val="false"/>
-                <w:sz w:val="19"/>
-                <w:szCs w:val="19"/>
-              </w:rPr>
-              <w:t xml:space="preserve">BIG5 extraversion</w:t>
-            </w:r>
-          </w:p>
-        </w:tc>
-        <w:tc>
-          <w:tcPr>
-            <w:tcW w:type="dxa" w:w="1200"/>
-            <w:tcMar>
-              <w:top w:type="dxa" w:w="50"/>
-              <w:left w:type="dxa" w:w="90"/>
-              <w:bottom w:type="dxa" w:w="50"/>
-              <w:right w:type="dxa" w:w="90"/>
-            </w:tcMar>
-          </w:tcPr>
-          <w:p>
-            <w:pPr>
-              <w:jc w:val="center"/>
-            </w:pPr>
-            <w:r>
-              <w:rPr>
-                <w:b w:val="false"/>
-                <w:bCs w:val="false"/>
-                <w:sz w:val="19"/>
-                <w:szCs w:val="19"/>
-              </w:rPr>
-              <w:t xml:space="preserve">10</w:t>
-            </w:r>
-          </w:p>
-        </w:tc>
-        <w:tc>
-          <w:tcPr>
-            <w:tcW w:type="dxa" w:w="1700"/>
-            <w:tcMar>
-              <w:top w:type="dxa" w:w="50"/>
-              <w:left w:type="dxa" w:w="90"/>
-              <w:bottom w:type="dxa" w:w="50"/>
-              <w:right w:type="dxa" w:w="90"/>
-            </w:tcMar>
-          </w:tcPr>
-          <w:p>
-            <w:pPr>
-              <w:jc w:val="center"/>
-            </w:pPr>
-            <w:r>
-              <w:rPr>
-                <w:b w:val="false"/>
-                <w:bCs w:val="false"/>
-                <w:sz w:val="19"/>
-                <w:szCs w:val="19"/>
-              </w:rPr>
-              <w:t xml:space="preserve">0.454</w:t>
-            </w:r>
-          </w:p>
-        </w:tc>
-        <w:tc>
-          <w:tcPr>
-            <w:tcW w:type="dxa" w:w="1300"/>
-            <w:tcMar>
-              <w:top w:type="dxa" w:w="50"/>
-              <w:left w:type="dxa" w:w="90"/>
-              <w:bottom w:type="dxa" w:w="50"/>
-              <w:right w:type="dxa" w:w="90"/>
-            </w:tcMar>
-          </w:tcPr>
-          <w:p>
-            <w:pPr>
-              <w:jc w:val="center"/>
-            </w:pPr>
-            <w:r>
-              <w:rPr>
-                <w:b w:val="false"/>
-                <w:bCs w:val="false"/>
-                <w:sz w:val="19"/>
-                <w:szCs w:val="19"/>
-              </w:rPr>
-              <w:t xml:space="preserve">0.32</w:t>
-            </w:r>
-          </w:p>
-        </w:tc>
-        <w:tc>
-          <w:tcPr>
-            <w:tcW w:type="dxa" w:w="1300"/>
-            <w:tcMar>
-              <w:top w:type="dxa" w:w="50"/>
-              <w:left w:type="dxa" w:w="90"/>
-              <w:bottom w:type="dxa" w:w="50"/>
-              <w:right w:type="dxa" w:w="90"/>
-            </w:tcMar>
-          </w:tcPr>
-          <w:p>
-            <w:pPr>
-              <w:jc w:val="center"/>
-            </w:pPr>
-            <w:r>
-              <w:rPr>
-                <w:b w:val="false"/>
-                <w:bCs w:val="false"/>
-                <w:sz w:val="19"/>
-                <w:szCs w:val="19"/>
-              </w:rPr>
-              <w:t xml:space="preserve">0.631</w:t>
-            </w:r>
-          </w:p>
-        </w:tc>
-      </w:tr>
-    </w:tbl>
-    <w:p>
-      <w:pPr>
-        <w:spacing w:after="240"/>
-      </w:pPr>
-      <w:r>
-        <w:rPr>
-          <w:sz w:val="18"/>
-          <w:szCs w:val="18"/>
-        </w:rPr>
-        <w:t xml:space="preserve">Table 3. Absolute correlation between every pair of items within each set. The Kaggle behaviors overlap far more than either questionnaire scale.</w:t>
-      </w:r>
-    </w:p>
-    <w:p>
-      <w:pPr>
-        <w:spacing w:after="160" w:line="276"/>
-        <w:jc w:val="both"/>
-      </w:pPr>
-      <w:r>
-        <w:rPr>
-          <w:sz w:val="21"/>
-          <w:szCs w:val="21"/>
-        </w:rPr>
-        <w:t xml:space="preserve">In the Kaggle dataset, the least related pair of the seven behaviors correlates at 0.69, which is higher than the most related pair in the BIG5 extraversion scale (0.631). That scale was written to measure a single trait through ten items, so it is a reasonable upper reference point for how much a set of deliberately similar questions should overlap. The seven behaviors exceed it.</w:t>
-      </w:r>
-    </w:p>
-    <w:p>
-      <w:pPr>
-        <w:spacing w:after="60" w:before="160"/>
-        <w:jc w:val="center"/>
-      </w:pPr>
-      <w:r>
-        <w:drawing>
-          <wp:inline distT="0" distB="0" distL="0" distR="0">
-            <wp:extent cx="4191000" cy="1866900"/>
             <wp:effectExtent t="0" r="0" b="0" l="0"/>
             <wp:docPr id="1" name="" descr="" title=""/>
             <wp:cNvGraphicFramePr>
@@ -3178,7 +3264,7 @@
                   <pic:spPr bwMode="auto">
                     <a:xfrm>
                       <a:off x="0" y="0"/>
-                      <a:ext cx="4191000" cy="1866900"/>
+                      <a:ext cx="4095750" cy="2381250"/>
                     </a:xfrm>
                     <a:prstGeom prst="rect">
                       <a:avLst/>
@@ -3194,13 +3280,28 @@
     <w:p>
       <w:pPr>
         <w:spacing w:after="240"/>
+        <w:jc w:val="center"/>
       </w:pPr>
       <w:r>
         <w:rPr>
           <w:sz w:val="18"/>
           <w:szCs w:val="18"/>
         </w:rPr>
-        <w:t xml:space="preserve">Figure 2. Absolute correlation between item pairs. Left: the seven Kaggle behaviors. Right: the ten BIG5 extraversion items. Darker is more overlap.</w:t>
+        <w:t xml:space="preserve">Figure 1: The four conditions, random forest, with 95% intervals. The interval for selection order crosses zero; the others do not.</w:t>
+      </w:r>
+    </w:p>
+    <w:p>
+      <w:pPr>
+        <w:spacing w:after="120" w:before="220"/>
+      </w:pPr>
+      <w:r>
+        <w:rPr>
+          <w:b/>
+          <w:bCs/>
+          <w:sz w:val="22"/>
+          <w:szCs w:val="22"/>
+        </w:rPr>
+        <w:t xml:space="preserve">C. Class Structure</w:t>
       </w:r>
     </w:p>
     <w:p>
@@ -3213,7 +3314,765 @@
           <w:sz w:val="21"/>
           <w:szCs w:val="21"/>
         </w:rPr>
-        <w:t xml:space="preserve">A direct consequence is that removing the single highest-ranked item barely changes anything. On the Kaggle dataset all three models rank stage fright first, and removing it changes balanced accuracy by -0.005 for the random forest, +0.002 for logistic regression, and +0.004 for XGBoost. Two of the three models improve slightly without their most important feature.</w:t>
+        <w:t xml:space="preserve">Removing the 1,769 respondents who identify as neither introvert nor extrovert raises balanced accuracy by 22.76 to 23.46 points depending on the model. This is the largest effect measured here.</w:t>
+      </w:r>
+    </w:p>
+    <w:p>
+      <w:pPr>
+        <w:spacing w:after="160" w:line="276"/>
+        <w:jc w:val="both"/>
+      </w:pPr>
+      <w:r>
+        <w:rPr>
+          <w:sz w:val="21"/>
+          <w:szCs w:val="21"/>
+        </w:rPr>
+        <w:t xml:space="preserve">It is important to be clear about what this comparison is. Dropping the neither group does not simply clean the data; it converts a three-class problem into a two-class problem and removes the respondents whose self-description is least definite. Accuracy rises partly because the remaining population is easier to separate. The point is not that removing this group is wrong, since a two-class problem is a reasonable thing to study. The point is that a two-class result and a three-class result describe different tasks and cannot be placed side by side.</w:t>
+      </w:r>
+    </w:p>
+    <w:p>
+      <w:pPr>
+        <w:spacing w:after="160" w:line="276"/>
+        <w:jc w:val="both"/>
+      </w:pPr>
+      <w:r>
+        <w:rPr>
+          <w:sz w:val="21"/>
+          <w:szCs w:val="21"/>
+        </w:rPr>
+        <w:t xml:space="preserve">This matters for reading the existing literature. My three-class results, at 0.728 to 0.736 raw accuracy, fall close to two published studies using the same instrument: So [12] reports 73.81% and Fieri et al. [13] report 73.5% before resampling. Fieri et al. state class counts of 4,404, 989, and 1,768, which are the counts of all three groups, so that study retained the neither group as a matter of record. So does not state the class counts directly, but reports a no-information rate of 61.51%, which matches the majority-class share of the three-class version of this data (61.48%) rather than the two-class version (81.6%); the inference that the neither group was retained follows from that match rather than from a direct statement.</w:t>
+      </w:r>
+    </w:p>
+    <w:p>
+      <w:pPr>
+        <w:spacing w:after="120" w:before="220"/>
+      </w:pPr>
+      <w:r>
+        <w:rPr>
+          <w:b/>
+          <w:bCs/>
+          <w:sz w:val="22"/>
+          <w:szCs w:val="22"/>
+        </w:rPr>
+        <w:t xml:space="preserve">D. Resampling Order</w:t>
+      </w:r>
+    </w:p>
+    <w:p>
+      <w:pPr>
+        <w:spacing w:after="160" w:line="276"/>
+        <w:jc w:val="both"/>
+      </w:pPr>
+      <w:r>
+        <w:rPr>
+          <w:sz w:val="21"/>
+          <w:szCs w:val="21"/>
+        </w:rPr>
+        <w:t xml:space="preserve">Applying SMOTE to the whole dataset before splitting, rather than inside each training fold, raises balanced accuracy on MIES by 20.69 points for the random forest, 18.33 for XGBoost, and 5.68 for logistic regression. On the Kaggle dataset the same change moves accuracy by less than 0.5 points in every case.</w:t>
+      </w:r>
+    </w:p>
+    <w:p>
+      <w:pPr>
+        <w:spacing w:after="160" w:line="276"/>
+        <w:jc w:val="both"/>
+      </w:pPr>
+      <w:r>
+        <w:rPr>
+          <w:sz w:val="21"/>
+          <w:szCs w:val="21"/>
+        </w:rPr>
+        <w:t xml:space="preserve">The mechanism is straightforward. SMOTE creates new minority-class rows by interpolating between existing ones. If those rows are created before the split, a synthetic row in a test fold can be an interpolation of two rows that are in the training fold, so the model is scored on points partly built from data it trained on. Resampling inside the training fold avoids this, because the test fold is never used to create anything.</w:t>
+      </w:r>
+    </w:p>
+    <w:p>
+      <w:pPr>
+        <w:spacing w:after="160" w:line="276"/>
+        <w:jc w:val="both"/>
+      </w:pPr>
+      <w:r>
+        <w:rPr>
+          <w:sz w:val="21"/>
+          <w:szCs w:val="21"/>
+        </w:rPr>
+        <w:t xml:space="preserve">Two things have to hold for the effect to appear. The classes have to be imbalanced enough for SMOTE to generate a large number of synthetic rows, which is why the Kaggle dataset shows almost nothing at 51/49 while MIES shows 20 points at 61/14/25. And the model has to be flexible enough to exploit the leaked information. A logistic regression on seven features has seven coefficients and cannot fit an individual row, which is why it gains 5.68 points where the random forest gains 20.69.</w:t>
+      </w:r>
+    </w:p>
+    <w:p>
+      <w:pPr>
+        <w:spacing w:after="160" w:line="276"/>
+        <w:jc w:val="both"/>
+      </w:pPr>
+      <w:r>
+        <w:rPr>
+          <w:sz w:val="21"/>
+          <w:szCs w:val="21"/>
+        </w:rPr>
+        <w:t xml:space="preserve">For comparison, Fieri et al. [13] report 73.5% before resampling and 95.5% after. The size of the change I measure from ordering alone is close to the size of the change they report, though I have not inspected their code and make no claim about what produced their numbers.</w:t>
+      </w:r>
+    </w:p>
+    <w:p>
+      <w:pPr>
+        <w:spacing w:after="120" w:before="220"/>
+      </w:pPr>
+      <w:r>
+        <w:rPr>
+          <w:b/>
+          <w:bCs/>
+          <w:sz w:val="22"/>
+          <w:szCs w:val="22"/>
+        </w:rPr>
+        <w:t xml:space="preserve">E. Duplicate Rows</w:t>
+      </w:r>
+    </w:p>
+    <w:p>
+      <w:pPr>
+        <w:spacing w:after="160" w:line="276"/>
+        <w:jc w:val="both"/>
+      </w:pPr>
+      <w:r>
+        <w:rPr>
+          <w:sz w:val="21"/>
+          <w:szCs w:val="21"/>
+        </w:rPr>
+        <w:t xml:space="preserve">Keeping the 486 duplicate rows in the Kaggle file changes balanced accuracy by -1.47 points for the random forest, -1.41 for logistic regression, and -0.50 for XGBoost. All three intervals exclude zero, and all three estimates are small and negative: keeping duplicates makes performance slightly worse rather than better, which is the opposite of what might be expected.</w:t>
+      </w:r>
+    </w:p>
+    <w:p>
+      <w:pPr>
+        <w:spacing w:after="160" w:line="276"/>
+        <w:jc w:val="both"/>
+      </w:pPr>
+      <w:r>
+        <w:rPr>
+          <w:sz w:val="21"/>
+          <w:szCs w:val="21"/>
+        </w:rPr>
+        <w:t xml:space="preserve">The duplicates do produce overlap between training and test data. On a single 80/20 split of the raw file, 27.9% of test rows appear identically somewhere in the training set. That overlap exists in the file as published, before any analysis is performed. It does not translate into inflated balanced accuracy at this scale, but it is worth removing on principle, and worth knowing about for anyone using the dataset.</w:t>
+      </w:r>
+    </w:p>
+    <w:p>
+      <w:pPr>
+        <w:spacing w:after="120" w:before="220"/>
+      </w:pPr>
+      <w:r>
+        <w:rPr>
+          <w:b/>
+          <w:bCs/>
+          <w:sz w:val="22"/>
+          <w:szCs w:val="22"/>
+        </w:rPr>
+        <w:t xml:space="preserve">F. Feature Selection Order</w:t>
+      </w:r>
+    </w:p>
+    <w:p>
+      <w:pPr>
+        <w:spacing w:after="160" w:line="276"/>
+        <w:jc w:val="both"/>
+      </w:pPr>
+      <w:r>
+        <w:rPr>
+          <w:sz w:val="21"/>
+          <w:szCs w:val="21"/>
+        </w:rPr>
+        <w:t xml:space="preserve">Selecting the top 15 features by ANOVA F-score using the whole dataset, rather than inside each training fold, changes balanced accuracy by +0.08, -0.00, and +0.10 points for the three models. All three 95% intervals contain zero, the widest running from -0.46 to +0.63. There is no evidence of a systematic effect under these conditions.</w:t>
+      </w:r>
+    </w:p>
+    <w:p>
+      <w:pPr>
+        <w:spacing w:after="160" w:line="276"/>
+        <w:jc w:val="both"/>
+      </w:pPr>
+      <w:r>
+        <w:rPr>
+          <w:sz w:val="21"/>
+          <w:szCs w:val="21"/>
+        </w:rPr>
+        <w:t xml:space="preserve">This is worth stating because feature-selection order looks like the same category of mistake as resampling order. Both involve using the full dataset for a step that should be confined to training data. One produces a 20-point difference and the other produces nothing measurable.</w:t>
+      </w:r>
+    </w:p>
+    <w:p>
+      <w:pPr>
+        <w:spacing w:after="120" w:before="220"/>
+      </w:pPr>
+      <w:r>
+        <w:rPr>
+          <w:b/>
+          <w:bCs/>
+          <w:sz w:val="22"/>
+          <w:szCs w:val="22"/>
+        </w:rPr>
+        <w:t xml:space="preserve">G. Item Overlap and the Null Selection Result</w:t>
+      </w:r>
+    </w:p>
+    <w:p>
+      <w:pPr>
+        <w:spacing w:after="160" w:line="276"/>
+        <w:jc w:val="both"/>
+      </w:pPr>
+      <w:r>
+        <w:rPr>
+          <w:sz w:val="21"/>
+          <w:szCs w:val="21"/>
+        </w:rPr>
+        <w:t xml:space="preserve">One possible explanation is that the items in these datasets carry heavily overlapping information, so which subset is chosen matters less than it might.</w:t>
+      </w:r>
+    </w:p>
+    <w:tbl>
+      <w:tblPr>
+        <w:tblW w:type="dxa" w:w="7600"/>
+        <w:tblBorders>
+          <w:top w:val="single" w:color="auto" w:sz="4"/>
+          <w:left w:val="single" w:color="auto" w:sz="4"/>
+          <w:bottom w:val="single" w:color="auto" w:sz="4"/>
+          <w:right w:val="single" w:color="auto" w:sz="4"/>
+          <w:insideH w:val="single" w:color="auto" w:sz="4"/>
+          <w:insideV w:val="single" w:color="auto" w:sz="4"/>
+        </w:tblBorders>
+      </w:tblPr>
+      <w:tblGrid>
+        <w:gridCol w:w="2400"/>
+        <w:gridCol w:w="1200"/>
+        <w:gridCol w:w="1700"/>
+        <w:gridCol w:w="1300"/>
+        <w:gridCol w:w="1300"/>
+      </w:tblGrid>
+      <w:tr>
+        <w:tc>
+          <w:tcPr>
+            <w:tcW w:type="dxa" w:w="2400"/>
+            <w:shd w:fill="EDEDED" w:val="clear"/>
+            <w:tcMar>
+              <w:top w:type="dxa" w:w="50"/>
+              <w:left w:type="dxa" w:w="90"/>
+              <w:bottom w:type="dxa" w:w="50"/>
+              <w:right w:type="dxa" w:w="90"/>
+            </w:tcMar>
+          </w:tcPr>
+          <w:p>
+            <w:pPr>
+              <w:jc w:val="left"/>
+            </w:pPr>
+            <w:r>
+              <w:rPr>
+                <w:b/>
+                <w:bCs/>
+                <w:sz w:val="19"/>
+                <w:szCs w:val="19"/>
+              </w:rPr>
+              <w:t xml:space="preserve">Item set</w:t>
+            </w:r>
+          </w:p>
+        </w:tc>
+        <w:tc>
+          <w:tcPr>
+            <w:tcW w:type="dxa" w:w="1200"/>
+            <w:shd w:fill="EDEDED" w:val="clear"/>
+            <w:tcMar>
+              <w:top w:type="dxa" w:w="50"/>
+              <w:left w:type="dxa" w:w="90"/>
+              <w:bottom w:type="dxa" w:w="50"/>
+              <w:right w:type="dxa" w:w="90"/>
+            </w:tcMar>
+          </w:tcPr>
+          <w:p>
+            <w:pPr>
+              <w:jc w:val="center"/>
+            </w:pPr>
+            <w:r>
+              <w:rPr>
+                <w:b/>
+                <w:bCs/>
+                <w:sz w:val="19"/>
+                <w:szCs w:val="19"/>
+              </w:rPr>
+              <w:t xml:space="preserve">Items</w:t>
+            </w:r>
+          </w:p>
+        </w:tc>
+        <w:tc>
+          <w:tcPr>
+            <w:tcW w:type="dxa" w:w="1700"/>
+            <w:shd w:fill="EDEDED" w:val="clear"/>
+            <w:tcMar>
+              <w:top w:type="dxa" w:w="50"/>
+              <w:left w:type="dxa" w:w="90"/>
+              <w:bottom w:type="dxa" w:w="50"/>
+              <w:right w:type="dxa" w:w="90"/>
+            </w:tcMar>
+          </w:tcPr>
+          <w:p>
+            <w:pPr>
+              <w:jc w:val="center"/>
+            </w:pPr>
+            <w:r>
+              <w:rPr>
+                <w:b/>
+                <w:bCs/>
+                <w:sz w:val="19"/>
+                <w:szCs w:val="19"/>
+              </w:rPr>
+              <w:t xml:space="preserve">Mean overlap</w:t>
+            </w:r>
+          </w:p>
+        </w:tc>
+        <w:tc>
+          <w:tcPr>
+            <w:tcW w:type="dxa" w:w="1300"/>
+            <w:shd w:fill="EDEDED" w:val="clear"/>
+            <w:tcMar>
+              <w:top w:type="dxa" w:w="50"/>
+              <w:left w:type="dxa" w:w="90"/>
+              <w:bottom w:type="dxa" w:w="50"/>
+              <w:right w:type="dxa" w:w="90"/>
+            </w:tcMar>
+          </w:tcPr>
+          <w:p>
+            <w:pPr>
+              <w:jc w:val="center"/>
+            </w:pPr>
+            <w:r>
+              <w:rPr>
+                <w:b/>
+                <w:bCs/>
+                <w:sz w:val="19"/>
+                <w:szCs w:val="19"/>
+              </w:rPr>
+              <w:t xml:space="preserve">Lowest</w:t>
+            </w:r>
+          </w:p>
+        </w:tc>
+        <w:tc>
+          <w:tcPr>
+            <w:tcW w:type="dxa" w:w="1300"/>
+            <w:shd w:fill="EDEDED" w:val="clear"/>
+            <w:tcMar>
+              <w:top w:type="dxa" w:w="50"/>
+              <w:left w:type="dxa" w:w="90"/>
+              <w:bottom w:type="dxa" w:w="50"/>
+              <w:right w:type="dxa" w:w="90"/>
+            </w:tcMar>
+          </w:tcPr>
+          <w:p>
+            <w:pPr>
+              <w:jc w:val="center"/>
+            </w:pPr>
+            <w:r>
+              <w:rPr>
+                <w:b/>
+                <w:bCs/>
+                <w:sz w:val="19"/>
+                <w:szCs w:val="19"/>
+              </w:rPr>
+              <w:t xml:space="preserve">Highest</w:t>
+            </w:r>
+          </w:p>
+        </w:tc>
+      </w:tr>
+      <w:tr>
+        <w:tc>
+          <w:tcPr>
+            <w:tcW w:type="dxa" w:w="2400"/>
+            <w:tcMar>
+              <w:top w:type="dxa" w:w="50"/>
+              <w:left w:type="dxa" w:w="90"/>
+              <w:bottom w:type="dxa" w:w="50"/>
+              <w:right w:type="dxa" w:w="90"/>
+            </w:tcMar>
+          </w:tcPr>
+          <w:p>
+            <w:pPr>
+              <w:jc w:val="left"/>
+            </w:pPr>
+            <w:r>
+              <w:rPr>
+                <w:b w:val="false"/>
+                <w:bCs w:val="false"/>
+                <w:sz w:val="19"/>
+                <w:szCs w:val="19"/>
+              </w:rPr>
+              <w:t xml:space="preserve">Kaggle behaviors</w:t>
+            </w:r>
+          </w:p>
+        </w:tc>
+        <w:tc>
+          <w:tcPr>
+            <w:tcW w:type="dxa" w:w="1200"/>
+            <w:tcMar>
+              <w:top w:type="dxa" w:w="50"/>
+              <w:left w:type="dxa" w:w="90"/>
+              <w:bottom w:type="dxa" w:w="50"/>
+              <w:right w:type="dxa" w:w="90"/>
+            </w:tcMar>
+          </w:tcPr>
+          <w:p>
+            <w:pPr>
+              <w:jc w:val="center"/>
+            </w:pPr>
+            <w:r>
+              <w:rPr>
+                <w:b w:val="false"/>
+                <w:bCs w:val="false"/>
+                <w:sz w:val="19"/>
+                <w:szCs w:val="19"/>
+              </w:rPr>
+              <w:t xml:space="preserve">7</w:t>
+            </w:r>
+          </w:p>
+        </w:tc>
+        <w:tc>
+          <w:tcPr>
+            <w:tcW w:type="dxa" w:w="1700"/>
+            <w:tcMar>
+              <w:top w:type="dxa" w:w="50"/>
+              <w:left w:type="dxa" w:w="90"/>
+              <w:bottom w:type="dxa" w:w="50"/>
+              <w:right w:type="dxa" w:w="90"/>
+            </w:tcMar>
+          </w:tcPr>
+          <w:p>
+            <w:pPr>
+              <w:jc w:val="center"/>
+            </w:pPr>
+            <w:r>
+              <w:rPr>
+                <w:b w:val="false"/>
+                <w:bCs w:val="false"/>
+                <w:sz w:val="19"/>
+                <w:szCs w:val="19"/>
+              </w:rPr>
+              <w:t xml:space="preserve">0.784</w:t>
+            </w:r>
+          </w:p>
+        </w:tc>
+        <w:tc>
+          <w:tcPr>
+            <w:tcW w:type="dxa" w:w="1300"/>
+            <w:tcMar>
+              <w:top w:type="dxa" w:w="50"/>
+              <w:left w:type="dxa" w:w="90"/>
+              <w:bottom w:type="dxa" w:w="50"/>
+              <w:right w:type="dxa" w:w="90"/>
+            </w:tcMar>
+          </w:tcPr>
+          <w:p>
+            <w:pPr>
+              <w:jc w:val="center"/>
+            </w:pPr>
+            <w:r>
+              <w:rPr>
+                <w:b w:val="false"/>
+                <w:bCs w:val="false"/>
+                <w:sz w:val="19"/>
+                <w:szCs w:val="19"/>
+              </w:rPr>
+              <w:t xml:space="preserve">0.69</w:t>
+            </w:r>
+          </w:p>
+        </w:tc>
+        <w:tc>
+          <w:tcPr>
+            <w:tcW w:type="dxa" w:w="1300"/>
+            <w:tcMar>
+              <w:top w:type="dxa" w:w="50"/>
+              <w:left w:type="dxa" w:w="90"/>
+              <w:bottom w:type="dxa" w:w="50"/>
+              <w:right w:type="dxa" w:w="90"/>
+            </w:tcMar>
+          </w:tcPr>
+          <w:p>
+            <w:pPr>
+              <w:jc w:val="center"/>
+            </w:pPr>
+            <w:r>
+              <w:rPr>
+                <w:b w:val="false"/>
+                <w:bCs w:val="false"/>
+                <w:sz w:val="19"/>
+                <w:szCs w:val="19"/>
+              </w:rPr>
+              <w:t xml:space="preserve">0.957</w:t>
+            </w:r>
+          </w:p>
+        </w:tc>
+      </w:tr>
+      <w:tr>
+        <w:tc>
+          <w:tcPr>
+            <w:tcW w:type="dxa" w:w="2400"/>
+            <w:tcMar>
+              <w:top w:type="dxa" w:w="50"/>
+              <w:left w:type="dxa" w:w="90"/>
+              <w:bottom w:type="dxa" w:w="50"/>
+              <w:right w:type="dxa" w:w="90"/>
+            </w:tcMar>
+          </w:tcPr>
+          <w:p>
+            <w:pPr>
+              <w:jc w:val="left"/>
+            </w:pPr>
+            <w:r>
+              <w:rPr>
+                <w:b w:val="false"/>
+                <w:bCs w:val="false"/>
+                <w:sz w:val="19"/>
+                <w:szCs w:val="19"/>
+              </w:rPr>
+              <w:t xml:space="preserve">MIES</w:t>
+            </w:r>
+          </w:p>
+        </w:tc>
+        <w:tc>
+          <w:tcPr>
+            <w:tcW w:type="dxa" w:w="1200"/>
+            <w:tcMar>
+              <w:top w:type="dxa" w:w="50"/>
+              <w:left w:type="dxa" w:w="90"/>
+              <w:bottom w:type="dxa" w:w="50"/>
+              <w:right w:type="dxa" w:w="90"/>
+            </w:tcMar>
+          </w:tcPr>
+          <w:p>
+            <w:pPr>
+              <w:jc w:val="center"/>
+            </w:pPr>
+            <w:r>
+              <w:rPr>
+                <w:b w:val="false"/>
+                <w:bCs w:val="false"/>
+                <w:sz w:val="19"/>
+                <w:szCs w:val="19"/>
+              </w:rPr>
+              <w:t xml:space="preserve">91</w:t>
+            </w:r>
+          </w:p>
+        </w:tc>
+        <w:tc>
+          <w:tcPr>
+            <w:tcW w:type="dxa" w:w="1700"/>
+            <w:tcMar>
+              <w:top w:type="dxa" w:w="50"/>
+              <w:left w:type="dxa" w:w="90"/>
+              <w:bottom w:type="dxa" w:w="50"/>
+              <w:right w:type="dxa" w:w="90"/>
+            </w:tcMar>
+          </w:tcPr>
+          <w:p>
+            <w:pPr>
+              <w:jc w:val="center"/>
+            </w:pPr>
+            <w:r>
+              <w:rPr>
+                <w:b w:val="false"/>
+                <w:bCs w:val="false"/>
+                <w:sz w:val="19"/>
+                <w:szCs w:val="19"/>
+              </w:rPr>
+              <w:t xml:space="preserve">0.196</w:t>
+            </w:r>
+          </w:p>
+        </w:tc>
+        <w:tc>
+          <w:tcPr>
+            <w:tcW w:type="dxa" w:w="1300"/>
+            <w:tcMar>
+              <w:top w:type="dxa" w:w="50"/>
+              <w:left w:type="dxa" w:w="90"/>
+              <w:bottom w:type="dxa" w:w="50"/>
+              <w:right w:type="dxa" w:w="90"/>
+            </w:tcMar>
+          </w:tcPr>
+          <w:p>
+            <w:pPr>
+              <w:jc w:val="center"/>
+            </w:pPr>
+            <w:r>
+              <w:rPr>
+                <w:b w:val="false"/>
+                <w:bCs w:val="false"/>
+                <w:sz w:val="19"/>
+                <w:szCs w:val="19"/>
+              </w:rPr>
+              <w:t xml:space="preserve">0.00</w:t>
+            </w:r>
+          </w:p>
+        </w:tc>
+        <w:tc>
+          <w:tcPr>
+            <w:tcW w:type="dxa" w:w="1300"/>
+            <w:tcMar>
+              <w:top w:type="dxa" w:w="50"/>
+              <w:left w:type="dxa" w:w="90"/>
+              <w:bottom w:type="dxa" w:w="50"/>
+              <w:right w:type="dxa" w:w="90"/>
+            </w:tcMar>
+          </w:tcPr>
+          <w:p>
+            <w:pPr>
+              <w:jc w:val="center"/>
+            </w:pPr>
+            <w:r>
+              <w:rPr>
+                <w:b w:val="false"/>
+                <w:bCs w:val="false"/>
+                <w:sz w:val="19"/>
+                <w:szCs w:val="19"/>
+              </w:rPr>
+              <w:t xml:space="preserve">0.823</w:t>
+            </w:r>
+          </w:p>
+        </w:tc>
+      </w:tr>
+      <w:tr>
+        <w:tc>
+          <w:tcPr>
+            <w:tcW w:type="dxa" w:w="2400"/>
+            <w:tcMar>
+              <w:top w:type="dxa" w:w="50"/>
+              <w:left w:type="dxa" w:w="90"/>
+              <w:bottom w:type="dxa" w:w="50"/>
+              <w:right w:type="dxa" w:w="90"/>
+            </w:tcMar>
+          </w:tcPr>
+          <w:p>
+            <w:pPr>
+              <w:jc w:val="left"/>
+            </w:pPr>
+            <w:r>
+              <w:rPr>
+                <w:b w:val="false"/>
+                <w:bCs w:val="false"/>
+                <w:sz w:val="19"/>
+                <w:szCs w:val="19"/>
+              </w:rPr>
+              <w:t xml:space="preserve">BIG5 extraversion</w:t>
+            </w:r>
+          </w:p>
+        </w:tc>
+        <w:tc>
+          <w:tcPr>
+            <w:tcW w:type="dxa" w:w="1200"/>
+            <w:tcMar>
+              <w:top w:type="dxa" w:w="50"/>
+              <w:left w:type="dxa" w:w="90"/>
+              <w:bottom w:type="dxa" w:w="50"/>
+              <w:right w:type="dxa" w:w="90"/>
+            </w:tcMar>
+          </w:tcPr>
+          <w:p>
+            <w:pPr>
+              <w:jc w:val="center"/>
+            </w:pPr>
+            <w:r>
+              <w:rPr>
+                <w:b w:val="false"/>
+                <w:bCs w:val="false"/>
+                <w:sz w:val="19"/>
+                <w:szCs w:val="19"/>
+              </w:rPr>
+              <w:t xml:space="preserve">10</w:t>
+            </w:r>
+          </w:p>
+        </w:tc>
+        <w:tc>
+          <w:tcPr>
+            <w:tcW w:type="dxa" w:w="1700"/>
+            <w:tcMar>
+              <w:top w:type="dxa" w:w="50"/>
+              <w:left w:type="dxa" w:w="90"/>
+              <w:bottom w:type="dxa" w:w="50"/>
+              <w:right w:type="dxa" w:w="90"/>
+            </w:tcMar>
+          </w:tcPr>
+          <w:p>
+            <w:pPr>
+              <w:jc w:val="center"/>
+            </w:pPr>
+            <w:r>
+              <w:rPr>
+                <w:b w:val="false"/>
+                <w:bCs w:val="false"/>
+                <w:sz w:val="19"/>
+                <w:szCs w:val="19"/>
+              </w:rPr>
+              <w:t xml:space="preserve">0.454</w:t>
+            </w:r>
+          </w:p>
+        </w:tc>
+        <w:tc>
+          <w:tcPr>
+            <w:tcW w:type="dxa" w:w="1300"/>
+            <w:tcMar>
+              <w:top w:type="dxa" w:w="50"/>
+              <w:left w:type="dxa" w:w="90"/>
+              <w:bottom w:type="dxa" w:w="50"/>
+              <w:right w:type="dxa" w:w="90"/>
+            </w:tcMar>
+          </w:tcPr>
+          <w:p>
+            <w:pPr>
+              <w:jc w:val="center"/>
+            </w:pPr>
+            <w:r>
+              <w:rPr>
+                <w:b w:val="false"/>
+                <w:bCs w:val="false"/>
+                <w:sz w:val="19"/>
+                <w:szCs w:val="19"/>
+              </w:rPr>
+              <w:t xml:space="preserve">0.32</w:t>
+            </w:r>
+          </w:p>
+        </w:tc>
+        <w:tc>
+          <w:tcPr>
+            <w:tcW w:type="dxa" w:w="1300"/>
+            <w:tcMar>
+              <w:top w:type="dxa" w:w="50"/>
+              <w:left w:type="dxa" w:w="90"/>
+              <w:bottom w:type="dxa" w:w="50"/>
+              <w:right w:type="dxa" w:w="90"/>
+            </w:tcMar>
+          </w:tcPr>
+          <w:p>
+            <w:pPr>
+              <w:jc w:val="center"/>
+            </w:pPr>
+            <w:r>
+              <w:rPr>
+                <w:b w:val="false"/>
+                <w:bCs w:val="false"/>
+                <w:sz w:val="19"/>
+                <w:szCs w:val="19"/>
+              </w:rPr>
+              <w:t xml:space="preserve">0.631</w:t>
+            </w:r>
+          </w:p>
+        </w:tc>
+      </w:tr>
+    </w:tbl>
+    <w:p>
+      <w:pPr>
+        <w:spacing w:after="240"/>
+        <w:jc w:val="center"/>
+      </w:pPr>
+      <w:r>
+        <w:rPr>
+          <w:sz w:val="18"/>
+          <w:szCs w:val="18"/>
+        </w:rPr>
+        <w:t xml:space="preserve">Table 3: Absolute correlation between every pair of items within each set. The Kaggle behaviors overlap far more than either questionnaire scale.</w:t>
+      </w:r>
+    </w:p>
+    <w:p>
+      <w:pPr>
+        <w:spacing w:after="160" w:line="276"/>
+        <w:jc w:val="both"/>
+      </w:pPr>
+      <w:r>
+        <w:rPr>
+          <w:sz w:val="21"/>
+          <w:szCs w:val="21"/>
+        </w:rPr>
+        <w:t xml:space="preserve">In the Kaggle dataset, the least related pair of the seven behaviors correlates at 0.69, which is higher than the most related pair in the BIG5 extraversion scale (0.631). That scale was written to measure a single trait through ten items, so it is a reasonable upper reference point for how much a set of deliberately similar questions should overlap. The seven behaviors exceed it.</w:t>
       </w:r>
     </w:p>
     <w:p>
@@ -3224,7 +4083,7 @@
       <w:r>
         <w:drawing>
           <wp:inline distT="0" distB="0" distL="0" distR="0">
-            <wp:extent cx="3619500" cy="2628900"/>
+            <wp:extent cx="4191000" cy="1866900"/>
             <wp:effectExtent t="0" r="0" b="0" l="0"/>
             <wp:docPr id="1" name="" descr="" title=""/>
             <wp:cNvGraphicFramePr>
@@ -3249,6 +4108,78 @@
                   <pic:spPr bwMode="auto">
                     <a:xfrm>
                       <a:off x="0" y="0"/>
+                      <a:ext cx="4191000" cy="1866900"/>
+                    </a:xfrm>
+                    <a:prstGeom prst="rect">
+                      <a:avLst/>
+                    </a:prstGeom>
+                  </pic:spPr>
+                </pic:pic>
+              </a:graphicData>
+            </a:graphic>
+          </wp:inline>
+        </w:drawing>
+      </w:r>
+    </w:p>
+    <w:p>
+      <w:pPr>
+        <w:spacing w:after="240"/>
+        <w:jc w:val="center"/>
+      </w:pPr>
+      <w:r>
+        <w:rPr>
+          <w:sz w:val="18"/>
+          <w:szCs w:val="18"/>
+        </w:rPr>
+        <w:t xml:space="preserve">Figure 2: Absolute correlation between item pairs. Left: the seven Kaggle behaviors. Right: the ten BIG5 extraversion items. Darker is more overlap.</w:t>
+      </w:r>
+    </w:p>
+    <w:p>
+      <w:pPr>
+        <w:spacing w:after="160" w:line="276"/>
+        <w:jc w:val="both"/>
+      </w:pPr>
+      <w:r>
+        <w:rPr>
+          <w:sz w:val="21"/>
+          <w:szCs w:val="21"/>
+        </w:rPr>
+        <w:t xml:space="preserve">A direct consequence is that removing the single highest-ranked item barely changes anything. Ranking items by SHAP importance [17], all three models place stage fright first on the Kaggle dataset, and removing it changes balanced accuracy by -0.005 for the random forest, +0.002 for logistic regression, and +0.004 for XGBoost. Two of the three models improve slightly without their most important feature.</w:t>
+      </w:r>
+    </w:p>
+    <w:p>
+      <w:pPr>
+        <w:spacing w:after="60" w:before="160"/>
+        <w:jc w:val="center"/>
+      </w:pPr>
+      <w:r>
+        <w:drawing>
+          <wp:inline distT="0" distB="0" distL="0" distR="0">
+            <wp:extent cx="3619500" cy="2628900"/>
+            <wp:effectExtent t="0" r="0" b="0" l="0"/>
+            <wp:docPr id="1" name="" descr="" title=""/>
+            <wp:cNvGraphicFramePr>
+              <a:graphicFrameLocks xmlns:a="http://schemas.openxmlformats.org/drawingml/2006/main" noChangeAspect="1"/>
+            </wp:cNvGraphicFramePr>
+            <a:graphic xmlns:a="http://schemas.openxmlformats.org/drawingml/2006/main">
+              <a:graphicData uri="http://schemas.openxmlformats.org/drawingml/2006/picture">
+                <pic:pic xmlns:pic="http://schemas.openxmlformats.org/drawingml/2006/picture">
+                  <pic:nvPicPr>
+                    <pic:cNvPr id="0" name="" descr=""/>
+                    <pic:cNvPicPr>
+                      <a:picLocks noChangeAspect="1" noChangeArrowheads="1"/>
+                    </pic:cNvPicPr>
+                  </pic:nvPicPr>
+                  <pic:blipFill>
+                    <a:blip r:embed="rId10" cstate="none"/>
+                    <a:srcRect/>
+                    <a:stretch>
+                      <a:fillRect/>
+                    </a:stretch>
+                  </pic:blipFill>
+                  <pic:spPr bwMode="auto">
+                    <a:xfrm>
+                      <a:off x="0" y="0"/>
                       <a:ext cx="3619500" cy="2628900"/>
                     </a:xfrm>
                     <a:prstGeom prst="rect">
@@ -3265,13 +4196,14 @@
     <w:p>
       <w:pPr>
         <w:spacing w:after="240"/>
+        <w:jc w:val="center"/>
       </w:pPr>
       <w:r>
         <w:rPr>
           <w:sz w:val="18"/>
           <w:szCs w:val="18"/>
         </w:rPr>
-        <w:t xml:space="preserve">Figure 3. Balanced accuracy as items are removed one at a time in order of increasing importance, Kaggle dataset. Performance is flat from seven items down to two.</w:t>
+        <w:t xml:space="preserve">Figure 3: Balanced accuracy as items are removed one at a time in order of increasing importance, Kaggle dataset. Performance is flat from seven items down to two.</w:t>
       </w:r>
     </w:p>
     <w:p>
@@ -3285,7 +4217,7 @@
           <w:sz w:val="26"/>
           <w:szCs w:val="26"/>
         </w:rPr>
-        <w:t xml:space="preserve">4  Discussion</w:t>
+        <w:t xml:space="preserve">VI. Discussion</w:t>
       </w:r>
     </w:p>
     <w:p>
@@ -3324,20 +4256,7 @@
           <w:sz w:val="21"/>
           <w:szCs w:val="21"/>
         </w:rPr>
-        <w:t xml:space="preserve">The resampling result is a textbook leakage effect, but its size depends on conditions that are easy to overlook. It requires class imbalance, and it requires a model flexible enough to memorize individual rows. A study that resamples before splitting on balanced data with a linear model would see almost nothing, and might reasonably conclude the practice is harmless.</w:t>
-      </w:r>
-    </w:p>
-    <w:p>
-      <w:pPr>
-        <w:spacing w:after="160" w:line="276"/>
-        <w:jc w:val="both"/>
-      </w:pPr>
-      <w:r>
-        <w:rPr>
-          <w:sz w:val="21"/>
-          <w:szCs w:val="21"/>
-        </w:rPr>
-        <w:t xml:space="preserve">Several limitations apply. Only two datasets were used for classification, and both are self-report instruments, so nothing here speaks to behavioral or digital-trace data. The resampling effect was measured with SMOTE only, and other resampling methods may behave differently. The intervals reported here describe variation across cross-validation folds, not across independent samples, so they should be read as a measure of stability rather than as a full account of uncertainty. Finally, the item-overlap comparison in Section 3.5 is descriptive; it offers a plausible reason for the null selection-order result but does not establish it.</w:t>
+        <w:t xml:space="preserve">The resampling result is a textbook leakage effect, but its size depends on conditions that are easy to overlook. It requires class imbalance, and it requires a model flexible enough to exploit the leaked rows. A study that resamples before splitting on balanced data with a linear model would see almost nothing, and might reasonably conclude the practice is harmless.</w:t>
       </w:r>
     </w:p>
     <w:p>
@@ -3351,7 +4270,7 @@
           <w:sz w:val="26"/>
           <w:szCs w:val="26"/>
         </w:rPr>
-        <w:t xml:space="preserve">5  Conclusion</w:t>
+        <w:t xml:space="preserve">VII. Limitations</w:t>
       </w:r>
     </w:p>
     <w:p>
@@ -3364,20 +4283,97 @@
           <w:sz w:val="21"/>
           <w:szCs w:val="21"/>
         </w:rPr>
-        <w:t xml:space="preserve">I measured how much four data preparation decisions change the reported accuracy of introvert-extrovert classification, holding the datasets and models fixed. Dropping respondents who identify as neither raises balanced accuracy by about 23 points, though it also changes the task. Resampling before rather than inside cross-validation folds raises it by up to 21 points on imbalanced data and by almost nothing on balanced data. Keeping duplicate rows changes it by about one point. The order of feature selection produces no measurable change.</w:t>
-      </w:r>
-    </w:p>
-    <w:p>
-      <w:pPr>
-        <w:spacing w:after="160" w:line="276"/>
-        <w:jc w:val="both"/>
-      </w:pPr>
-      <w:r>
-        <w:rPr>
-          <w:sz w:val="21"/>
-          <w:szCs w:val="21"/>
-        </w:rPr>
-        <w:t xml:space="preserve">Two conclusions follow. Reported accuracies for this task are not directly comparable across studies unless the class structure and the preprocessing order are stated. And the choices are not equally consequential, so a reader checking a reported number should know which ones to ask about.</w:t>
+        <w:t xml:space="preserve">The following limitations qualify how far these results should be carried:</w:t>
+      </w:r>
+    </w:p>
+    <w:p>
+      <w:pPr>
+        <w:pStyle w:val="ListParagraph"/>
+        <w:numPr>
+          <w:ilvl w:val="0"/>
+          <w:numId w:val="1"/>
+        </w:numPr>
+        <w:spacing w:after="90" w:line="276"/>
+        <w:jc w:val="both"/>
+      </w:pPr>
+      <w:r>
+        <w:rPr>
+          <w:sz w:val="21"/>
+          <w:szCs w:val="21"/>
+        </w:rPr>
+        <w:t xml:space="preserve">Two datasets only. Both are self-report instruments, so nothing here speaks to behavioral or digital-trace data, and both were collected online from self-selected respondents.</w:t>
+      </w:r>
+    </w:p>
+    <w:p>
+      <w:pPr>
+        <w:pStyle w:val="ListParagraph"/>
+        <w:numPr>
+          <w:ilvl w:val="0"/>
+          <w:numId w:val="1"/>
+        </w:numPr>
+        <w:spacing w:after="90" w:line="276"/>
+        <w:jc w:val="both"/>
+      </w:pPr>
+      <w:r>
+        <w:rPr>
+          <w:sz w:val="21"/>
+          <w:szCs w:val="21"/>
+        </w:rPr>
+        <w:t xml:space="preserve">One resampling method. The resampling effect was measured with SMOTE alone. Random oversampling, undersampling, and other synthetic methods may behave differently.</w:t>
+      </w:r>
+    </w:p>
+    <w:p>
+      <w:pPr>
+        <w:pStyle w:val="ListParagraph"/>
+        <w:numPr>
+          <w:ilvl w:val="0"/>
+          <w:numId w:val="1"/>
+        </w:numPr>
+        <w:spacing w:after="90" w:line="276"/>
+        <w:jc w:val="both"/>
+      </w:pPr>
+      <w:r>
+        <w:rPr>
+          <w:sz w:val="21"/>
+          <w:szCs w:val="21"/>
+        </w:rPr>
+        <w:t xml:space="preserve">Intervals describe fold variation. The intervals reported here describe variation across cross-validation folds on a fixed dataset, not variation across independent samples, so they should be read as a measure of stability rather than as a full account of uncertainty. Three of the four conditions compare arms with different numbers of rows, so paired differencing across folds is not available for them.</w:t>
+      </w:r>
+    </w:p>
+    <w:p>
+      <w:pPr>
+        <w:pStyle w:val="ListParagraph"/>
+        <w:numPr>
+          <w:ilvl w:val="0"/>
+          <w:numId w:val="1"/>
+        </w:numPr>
+        <w:spacing w:after="90" w:line="276"/>
+        <w:jc w:val="both"/>
+      </w:pPr>
+      <w:r>
+        <w:rPr>
+          <w:sz w:val="21"/>
+          <w:szCs w:val="21"/>
+        </w:rPr>
+        <w:t xml:space="preserve">The overlap explanation is descriptive. The item-overlap comparison in Section V.G offers a plausible reason for the null selection-order result but does not establish it, since no experiment here manipulates overlap directly.</w:t>
+      </w:r>
+    </w:p>
+    <w:p>
+      <w:pPr>
+        <w:pStyle w:val="ListParagraph"/>
+        <w:numPr>
+          <w:ilvl w:val="0"/>
+          <w:numId w:val="1"/>
+        </w:numPr>
+        <w:spacing w:after="90" w:line="276"/>
+        <w:jc w:val="both"/>
+      </w:pPr>
+      <w:r>
+        <w:rPr>
+          <w:sz w:val="21"/>
+          <w:szCs w:val="21"/>
+        </w:rPr>
+        <w:t xml:space="preserve">No claim about published code. Where published figures are placed beside mine, the comparison is between reported numbers. I have not inspected the code behind any published result and make no claim about what produced those numbers.</w:t>
       </w:r>
     </w:p>
     <w:p>
@@ -3391,7 +4387,7 @@
           <w:sz w:val="26"/>
           <w:szCs w:val="26"/>
         </w:rPr>
-        <w:t xml:space="preserve">Code availability</w:t>
+        <w:t xml:space="preserve">VIII. Conclusion</w:t>
       </w:r>
     </w:p>
     <w:p>
@@ -3404,7 +4400,20 @@
           <w:sz w:val="21"/>
           <w:szCs w:val="21"/>
         </w:rPr>
-        <w:t xml:space="preserve">All code used to clean the data, run the conditions, and generate the figures is available at https://github.com/rishi3qrw43/introvert-extrovert. The datasets are not redistributed; the repository documents where to download each one.</w:t>
+        <w:t xml:space="preserve">I measured how much four data preparation decisions change the reported accuracy of introvert-extrovert classification, holding the datasets and models fixed. Dropping respondents who identify as neither raises balanced accuracy by about 23 points, though it also changes the task. Resampling before rather than inside cross-validation folds raises it by up to 21 points on imbalanced data and by almost nothing on balanced data. Keeping duplicate rows changes it by about one point. The order of feature selection produces no measurable change.</w:t>
+      </w:r>
+    </w:p>
+    <w:p>
+      <w:pPr>
+        <w:spacing w:after="160" w:line="276"/>
+        <w:jc w:val="both"/>
+      </w:pPr>
+      <w:r>
+        <w:rPr>
+          <w:sz w:val="21"/>
+          <w:szCs w:val="21"/>
+        </w:rPr>
+        <w:t xml:space="preserve">Two conclusions follow. Reported accuracies for this task are difficult to compare across studies when the class structure and the preprocessing order are not stated, and a reader has no way to tell which version of the task a number describes. And the choices are not equally consequential, so a reader checking a reported number should know which ones to ask about.</w:t>
       </w:r>
     </w:p>
     <w:p>
@@ -3418,6 +4427,33 @@
           <w:sz w:val="26"/>
           <w:szCs w:val="26"/>
         </w:rPr>
+        <w:t xml:space="preserve">Code and Data Availability</w:t>
+      </w:r>
+    </w:p>
+    <w:p>
+      <w:pPr>
+        <w:spacing w:after="160" w:line="276"/>
+        <w:jc w:val="both"/>
+      </w:pPr>
+      <w:r>
+        <w:rPr>
+          <w:sz w:val="21"/>
+          <w:szCs w:val="21"/>
+        </w:rPr>
+        <w:t xml:space="preserve">All code used to clean the data, run the conditions, and generate the figures is available at https://github.com/rishi3qrw43/introvert-extrovert. The datasets are not redistributed; the repository documents where to download each one.</w:t>
+      </w:r>
+    </w:p>
+    <w:p>
+      <w:pPr>
+        <w:spacing w:after="140" w:before="320"/>
+      </w:pPr>
+      <w:r>
+        <w:rPr>
+          <w:b/>
+          <w:bCs/>
+          <w:sz w:val="26"/>
+          <w:szCs w:val="26"/>
+        </w:rPr>
         <w:t xml:space="preserve">References</w:t>
       </w:r>
     </w:p>
@@ -3431,7 +4467,7 @@
           <w:sz w:val="19"/>
           <w:szCs w:val="19"/>
         </w:rPr>
-        <w:t xml:space="preserve">[1] C. G. Jung. Psychological Types. Translated by H. G. Baynes, revised ed., Princeton University Press, 1971.</w:t>
+        <w:t xml:space="preserve">[1] C. G. Jung, Psychological Types, H. G. Baynes, Trans., rev. ed. Princeton, NJ: Princeton University Press, 1971.</w:t>
       </w:r>
     </w:p>
     <w:p>
@@ -3444,7 +4480,7 @@
           <w:sz w:val="19"/>
           <w:szCs w:val="19"/>
         </w:rPr>
-        <w:t xml:space="preserve">[2] H. J. Eysenck. The Biological Basis of Personality. Charles C. Thomas, 1967.</w:t>
+        <w:t xml:space="preserve">[2] H. J. Eysenck, The Biological Basis of Personality. Springfield, IL: Charles C. Thomas, 1967.</w:t>
       </w:r>
     </w:p>
     <w:p>
@@ -3457,7 +4493,7 @@
           <w:sz w:val="19"/>
           <w:szCs w:val="19"/>
         </w:rPr>
-        <w:t xml:space="preserve">[3] S. Cain. Quiet: The Power of Introverts in a World That Can’t Stop Talking. Crown, 2012.</w:t>
+        <w:t xml:space="preserve">[3] S. Cain, Quiet: The Power of Introverts in a World That Can’t Stop Talking. New York, NY: Crown, 2012.</w:t>
       </w:r>
     </w:p>
     <w:p>
@@ -3470,7 +4506,7 @@
           <w:sz w:val="19"/>
           <w:szCs w:val="19"/>
         </w:rPr>
-        <w:t xml:space="preserve">[4] P. T. Costa and R. R. McCrae. Revised NEO Personality Inventory (NEO-PI-R) and NEO Five-Factor Inventory (NEO-FFI) Professional Manual. Psychological Assessment Resources, 1992.</w:t>
+        <w:t xml:space="preserve">[4] P. T. Costa and R. R. McCrae, Revised NEO Personality Inventory (NEO-PI-R) and NEO Five-Factor Inventory (NEO-FFI) Professional Manual. Odessa, FL: Psychological Assessment Resources, 1992.</w:t>
       </w:r>
     </w:p>
     <w:p>
@@ -3483,7 +4519,7 @@
           <w:sz w:val="19"/>
           <w:szCs w:val="19"/>
         </w:rPr>
-        <w:t xml:space="preserve">[5] I. B. Myers et al. MBTI Manual: A Guide to the Development and Use of the Myers-Briggs Type Indicator. 3rd ed., Consulting Psychologists Press, 1998.</w:t>
+        <w:t xml:space="preserve">[5] I. B. Myers, M. H. McCaulley, N. L. Quenk, and A. L. Hammer, MBTI Manual: A Guide to the Development and Use of the Myers-Briggs Type Indicator, 3rd ed. Palo Alto, CA: Consulting Psychologists Press, 1998.</w:t>
       </w:r>
     </w:p>
     <w:p>
@@ -3496,7 +4532,7 @@
           <w:sz w:val="19"/>
           <w:szCs w:val="19"/>
         </w:rPr>
-        <w:t xml:space="preserve">[6] S. D. Gosling et al. A very brief measure of the Big-Five personality domains. Journal of Research in Personality, 37(6):504-528, 2003.</w:t>
+        <w:t xml:space="preserve">[6] S. D. Gosling, P. J. Rentfrow, and W. B. Swann, "A very brief measure of the Big-Five personality domains," Journal of Research in Personality, vol. 37, no. 6, pp. 504-528, 2003.</w:t>
       </w:r>
     </w:p>
     <w:p>
@@ -3509,7 +4545,7 @@
           <w:sz w:val="19"/>
           <w:szCs w:val="19"/>
         </w:rPr>
-        <w:t xml:space="preserve">[7] M. Kosinski, D. Stillwell, and T. Graepel. Private traits and attributes are predictable from digital records of human behavior. Proceedings of the National Academy of Sciences, 110(15):5802-5805, 2013.</w:t>
+        <w:t xml:space="preserve">[7] M. Kosinski, D. Stillwell, and T. Graepel, "Private traits and attributes are predictable from digital records of human behavior," Proceedings of the National Academy of Sciences, vol. 110, no. 15, pp. 5802-5805, 2013.</w:t>
       </w:r>
     </w:p>
     <w:p>
@@ -3522,7 +4558,7 @@
           <w:sz w:val="19"/>
           <w:szCs w:val="19"/>
         </w:rPr>
-        <w:t xml:space="preserve">[8] W. Youyou, M. Kosinski, and D. Stillwell. Computer-based personality judgments are more accurate than those made by humans. Proceedings of the National Academy of Sciences, 112(4):1036-1040, 2015.</w:t>
+        <w:t xml:space="preserve">[8] W. Youyou, M. Kosinski, and D. Stillwell, "Computer-based personality judgments are more accurate than those made by humans," Proceedings of the National Academy of Sciences, vol. 112, no. 4, pp. 1036-1040, 2015.</w:t>
       </w:r>
     </w:p>
     <w:p>
@@ -3535,7 +4571,7 @@
           <w:sz w:val="19"/>
           <w:szCs w:val="19"/>
         </w:rPr>
-        <w:t xml:space="preserve">[9] S. C. Matz et al. Psychological targeting as an effective approach to digital mass persuasion. Proceedings of the National Academy of Sciences, 114(48):12714-12719, 2017.</w:t>
+        <w:t xml:space="preserve">[9] S. C. Matz, M. Kosinski, G. Nave, and D. J. Stillwell, "Psychological targeting as an effective approach to digital mass persuasion," Proceedings of the National Academy of Sciences, vol. 114, no. 48, pp. 12714-12719, 2017.</w:t>
       </w:r>
     </w:p>
     <w:p>
@@ -3548,7 +4584,7 @@
           <w:sz w:val="19"/>
           <w:szCs w:val="19"/>
         </w:rPr>
-        <w:t xml:space="preserve">[10] R. Kapilavai. Extrovert vs Introvert Behavior Data. Kaggle, 2024.</w:t>
+        <w:t xml:space="preserve">[10] R. Kapilavai, "Extrovert vs Introvert Behavior Data," Kaggle, 2024. [Online]. Available: https://www.kaggle.com/datasets/rakeshkapilavai/extrovert-vs-introvert-behavior-data</w:t>
       </w:r>
     </w:p>
     <w:p>
@@ -3561,7 +4597,7 @@
           <w:sz w:val="19"/>
           <w:szCs w:val="19"/>
         </w:rPr>
-        <w:t xml:space="preserve">[11] S. Kapoor and A. Narayanan. Leakage and the reproducibility crisis in machine-learning-based science. Patterns, 4(9):100804, 2023.</w:t>
+        <w:t xml:space="preserve">[11] S. Kapoor and A. Narayanan, "Leakage and the reproducibility crisis in machine-learning-based science," Patterns, vol. 4, no. 9, art. 100804, 2023.</w:t>
       </w:r>
     </w:p>
     <w:p>
@@ -3574,7 +4610,7 @@
           <w:sz w:val="19"/>
           <w:szCs w:val="19"/>
         </w:rPr>
-        <w:t xml:space="preserve">[12] C. So. Are you an introvert or extrovert? Accurate classification with only ten predictors. In 2020 International Conference on Artificial Intelligence in Information and Communication (ICAIIC), pages 1-5. IEEE, 2020.</w:t>
+        <w:t xml:space="preserve">[12] C. So, "Are you an introvert or extrovert? Accurate classification with only ten predictors," in Proc. 2020 International Conference on Artificial Intelligence in Information and Communication (ICAIIC), 2020, pp. 1-5.</w:t>
       </w:r>
     </w:p>
     <w:p>
@@ -3587,7 +4623,7 @@
           <w:sz w:val="19"/>
           <w:szCs w:val="19"/>
         </w:rPr>
-        <w:t xml:space="preserve">[13] B. Fieri, J. La’la, and D. Suhartono. Introversion-extraversion prediction using machine learning. JOIV: International Journal on Informatics Visualization, 7(4):2153-2159, 2023.</w:t>
+        <w:t xml:space="preserve">[13] B. Fieri, J. La’la, and D. Suhartono, "Introversion-extraversion prediction using machine learning," JOIV: International Journal on Informatics Visualization, vol. 7, no. 4, pp. 2153-2159, 2023.</w:t>
       </w:r>
     </w:p>
     <w:p>
@@ -3600,7 +4636,7 @@
           <w:sz w:val="19"/>
           <w:szCs w:val="19"/>
         </w:rPr>
-        <w:t xml:space="preserve">[14] Open-Source Psychometrics Project. Development of the Multidimensional Introversion-Extraversion Scales, 2019.</w:t>
+        <w:t xml:space="preserve">[14] Open-Source Psychometrics Project, "Development of the Multidimensional Introversion-Extraversion Scales," 2019. [Online]. Available: https://openpsychometrics.org/tests/MIES/development/</w:t>
       </w:r>
     </w:p>
     <w:p>
@@ -3613,7 +4649,7 @@
           <w:sz w:val="19"/>
           <w:szCs w:val="19"/>
         </w:rPr>
-        <w:t xml:space="preserve">[15] Open-Source Psychometrics Project. IPIP Big Five Factor Markers, 2014.</w:t>
+        <w:t xml:space="preserve">[15] Open-Source Psychometrics Project, "IPIP Big Five Factor Markers," 2014. [Online]. Available: https://openpsychometrics.org/tests/BIG5.php</w:t>
       </w:r>
     </w:p>
     <w:p>
@@ -3626,7 +4662,7 @@
           <w:sz w:val="19"/>
           <w:szCs w:val="19"/>
         </w:rPr>
-        <w:t xml:space="preserve">[16] N. V. Chawla, K. W. Bowyer, L. O. Hall, and W. P. Kegelmeyer. SMOTE: Synthetic minority over-sampling technique. Journal of Artificial Intelligence Research, 16:321-357, 2002.</w:t>
+        <w:t xml:space="preserve">[16] N. V. Chawla, K. W. Bowyer, L. O. Hall, and W. P. Kegelmeyer, "SMOTE: Synthetic minority over-sampling technique," Journal of Artificial Intelligence Research, vol. 16, pp. 321-357, 2002.</w:t>
       </w:r>
     </w:p>
     <w:p>
@@ -3639,7 +4675,7 @@
           <w:sz w:val="19"/>
           <w:szCs w:val="19"/>
         </w:rPr>
-        <w:t xml:space="preserve">[17] S. M. Lundberg and S.-I. Lee. A unified approach to interpreting model predictions. Advances in Neural Information Processing Systems, 30:4765-4774, 2017.</w:t>
+        <w:t xml:space="preserve">[17] S. M. Lundberg and S.-I. Lee, "A unified approach to interpreting model predictions," in Advances in Neural Information Processing Systems, vol. 30, 2017, pp. 4765-4774.</w:t>
       </w:r>
     </w:p>
     <w:p>
@@ -3652,10 +4688,37 @@
           <w:sz w:val="19"/>
           <w:szCs w:val="19"/>
         </w:rPr>
-        <w:t xml:space="preserve">[18] F. Pedregosa et al. Scikit-learn: Machine learning in Python. Journal of Machine Learning Research, 12:2825-2830, 2011.</w:t>
+        <w:t xml:space="preserve">[18] F. Pedregosa et al., "Scikit-learn: Machine learning in Python," Journal of Machine Learning Research, vol. 12, pp. 2825-2830, 2011.</w:t>
+      </w:r>
+    </w:p>
+    <w:p>
+      <w:pPr>
+        <w:spacing w:after="70"/>
+        <w:ind w:left="340" w:hanging="340"/>
+      </w:pPr>
+      <w:r>
+        <w:rPr>
+          <w:sz w:val="19"/>
+          <w:szCs w:val="19"/>
+        </w:rPr>
+        <w:t xml:space="preserve">[19] T. Chen and C. Guestrin, "XGBoost: A scalable tree boosting system," in Proc. 22nd ACM SIGKDD International Conference on Knowledge Discovery and Data Mining, 2016, pp. 785-794.</w:t>
+      </w:r>
+    </w:p>
+    <w:p>
+      <w:pPr>
+        <w:spacing w:after="70"/>
+        <w:ind w:left="340" w:hanging="340"/>
+      </w:pPr>
+      <w:r>
+        <w:rPr>
+          <w:sz w:val="19"/>
+          <w:szCs w:val="19"/>
+        </w:rPr>
+        <w:t xml:space="preserve">[20] G. Lemaitre, F. Nogueira, and C. K. Aridas, "Imbalanced-learn: A Python toolbox to tackle the curse of imbalanced datasets in machine learning," Journal of Machine Learning Research, vol. 18, no. 17, pp. 1-5, 2017.</w:t>
       </w:r>
     </w:p>
     <w:sectPr>
+      <w:footerReference w:type="default" r:id="rId7"/>
       <w:pgSz w:w="12240" w:h="15840" w:orient="portrait"/>
       <w:pgMar w:top="1440" w:right="1440" w:bottom="1440" w:left="1440" w:header="708" w:footer="708" w:gutter="0"/>
       <w:pgNumType/>
@@ -3704,6 +4767,26 @@
     </w:p>
   </w:endnote>
 </w:endnotes>
+</file>
+
+<file path=word/footer1.xml><?xml version="1.0" encoding="utf-8"?>
+<w:ftr xmlns:wpc="http://schemas.microsoft.com/office/word/2010/wordprocessingCanvas" xmlns:mc="http://schemas.openxmlformats.org/markup-compatibility/2006" xmlns:o="urn:schemas-microsoft-com:office:office" xmlns:r="http://schemas.openxmlformats.org/officeDocument/2006/relationships" xmlns:m="http://schemas.openxmlformats.org/officeDocument/2006/math" xmlns:v="urn:schemas-microsoft-com:vml" xmlns:wp14="http://schemas.microsoft.com/office/word/2010/wordprocessingDrawing" xmlns:wp="http://schemas.openxmlformats.org/drawingml/2006/wordprocessingDrawing" xmlns:w10="urn:schemas-microsoft-com:office:word" xmlns:w="http://schemas.openxmlformats.org/wordprocessingml/2006/main" xmlns:w14="http://schemas.microsoft.com/office/word/2010/wordml" xmlns:w15="http://schemas.microsoft.com/office/word/2012/wordml" xmlns:wpg="http://schemas.microsoft.com/office/word/2010/wordprocessingGroup" xmlns:wpi="http://schemas.microsoft.com/office/word/2010/wordprocessingInk" xmlns:wne="http://schemas.microsoft.com/office/word/2006/wordml" xmlns:wps="http://schemas.microsoft.com/office/word/2010/wordprocessingShape">
+  <w:p>
+    <w:pPr>
+      <w:jc w:val="center"/>
+    </w:pPr>
+    <w:r>
+      <w:rPr>
+        <w:sz w:val="19"/>
+        <w:szCs w:val="19"/>
+      </w:rPr>
+      <w:fldChar w:fldCharType="begin"/>
+      <w:instrText xml:space="preserve">PAGE</w:instrText>
+      <w:fldChar w:fldCharType="separate"/>
+      <w:fldChar w:fldCharType="end"/>
+    </w:r>
+  </w:p>
+</w:ftr>
 </file>
 
 <file path=word/footnotes.xml><?xml version="1.0" encoding="utf-8"?>

</xml_diff>

<commit_message>
Update intervals from re-run, pin xgboost 3.2.0
</commit_message>
<xml_diff>
--- a/paper/preprocessing_paper.docx
+++ b/paper/preprocessing_paper.docx
@@ -93,7 +93,7 @@
           <w:sz w:val="21"/>
           <w:szCs w:val="21"/>
         </w:rPr>
-        <w:t xml:space="preserve">Reported accuracies for classifying introverts and extroverts from self-report data vary widely. Fieri et al. [13] report 73.5% and 95.5% on the same dataset depending on how it was prepared before training. I measure how much four preparation decisions move that number, holding the data and the models fixed. Using a public Kaggle dataset of 2,900 responses to seven behavioral questions and the Multidimensional Introversion-Extraversion Scales (MIES; 7,188 respondents, 91 items), each condition is evaluated with 5-fold cross-validation repeated 10 times, and differences are reported in percentage points of balanced accuracy with 95% intervals. Dropping respondents who identify as neither introvert nor extrovert raises balanced accuracy by 22.8 to 23.5 points, although this changes the classification task rather than only the preprocessing. Applying SMOTE to the full dataset before splitting, rather than within each training fold, raises it by 18.3 to 20.7 points on the imbalanced dataset and by under 0.5 points on the balanced one. Keeping duplicate rows changes it by about one point. Selecting the top 15 features by ANOVA F-score before splitting shows no evidence of a systematic effect, with all three intervals containing zero. My three-class MIES results fall within a third of a point of two published studies that retained the ambivert group. Accuracies for this task are therefore not comparable across studies unless these choices are stated.</w:t>
+        <w:t xml:space="preserve">Reported accuracies for classifying introverts and extroverts from self-report data vary widely. Fieri et al. [13] report 73.5% and 95.5% on the same dataset depending on how it was prepared before training. I measure how much four preparation decisions move that number, holding the data and the models fixed. Using a public Kaggle dataset of 2,900 responses to seven behavioral questions and the Multidimensional Introversion-Extraversion Scales (MIES; 7,188 respondents, 91 items), each condition is evaluated with 5-fold cross-validation repeated 10 times, and differences are reported in percentage points of balanced accuracy with 95% intervals. Dropping respondents who identify as neither introvert nor extrovert raises balanced accuracy by 22.8 to 23.5 points, although this changes the classification task rather than only the preprocessing. Applying SMOTE to the full dataset before splitting, rather than within each training fold, raises it by 18.4 to 20.6 points on the imbalanced dataset and by under 0.5 points on the balanced one. Keeping duplicate rows changes it by about one point. Selecting the top 15 features by ANOVA F-score before splitting shows no evidence of a systematic effect, with all three intervals containing zero. My three-class MIES results fall within a third of a point of two published studies that retained the ambivert group. Accuracies for this task are therefore not comparable across studies unless these choices are stated.</w:t>
       </w:r>
     </w:p>
     <w:p>
@@ -1016,7 +1016,7 @@
                 <w:sz w:val="19"/>
                 <w:szCs w:val="19"/>
               </w:rPr>
-              <w:t xml:space="preserve">not pinned</w:t>
+              <w:t xml:space="preserve">3.2.0</w:t>
             </w:r>
           </w:p>
         </w:tc>
@@ -2065,7 +2065,7 @@
                 <w:sz w:val="19"/>
                 <w:szCs w:val="19"/>
               </w:rPr>
-              <w:t xml:space="preserve">+23.46</w:t>
+              <w:t xml:space="preserve">+23.48</w:t>
             </w:r>
           </w:p>
         </w:tc>
@@ -2090,7 +2090,7 @@
                 <w:sz w:val="19"/>
                 <w:szCs w:val="19"/>
               </w:rPr>
-              <w:t xml:space="preserve">22.94 to 23.99</w:t>
+              <w:t xml:space="preserve">22.93 to 24.04</w:t>
             </w:r>
           </w:p>
         </w:tc>
@@ -2371,7 +2371,7 @@
                 <w:sz w:val="19"/>
                 <w:szCs w:val="19"/>
               </w:rPr>
-              <w:t xml:space="preserve">+20.69</w:t>
+              <w:t xml:space="preserve">+20.61</w:t>
             </w:r>
           </w:p>
         </w:tc>
@@ -2396,7 +2396,7 @@
                 <w:sz w:val="19"/>
                 <w:szCs w:val="19"/>
               </w:rPr>
-              <w:t xml:space="preserve">20.28 to 21.11</w:t>
+              <w:t xml:space="preserve">20.20 to 21.03</w:t>
             </w:r>
           </w:p>
         </w:tc>
@@ -2473,7 +2473,7 @@
                 <w:sz w:val="19"/>
                 <w:szCs w:val="19"/>
               </w:rPr>
-              <w:t xml:space="preserve">+5.68</w:t>
+              <w:t xml:space="preserve">+5.65</w:t>
             </w:r>
           </w:p>
         </w:tc>
@@ -2498,7 +2498,7 @@
                 <w:sz w:val="19"/>
                 <w:szCs w:val="19"/>
               </w:rPr>
-              <w:t xml:space="preserve">5.19 to 6.17</w:t>
+              <w:t xml:space="preserve">5.16 to 6.14</w:t>
             </w:r>
           </w:p>
         </w:tc>
@@ -2575,7 +2575,7 @@
                 <w:sz w:val="19"/>
                 <w:szCs w:val="19"/>
               </w:rPr>
-              <w:t xml:space="preserve">+18.33</w:t>
+              <w:t xml:space="preserve">+18.39</w:t>
             </w:r>
           </w:p>
         </w:tc>
@@ -2600,7 +2600,7 @@
                 <w:sz w:val="19"/>
                 <w:szCs w:val="19"/>
               </w:rPr>
-              <w:t xml:space="preserve">17.90 to 18.77</w:t>
+              <w:t xml:space="preserve">17.97 to 18.82</w:t>
             </w:r>
           </w:p>
         </w:tc>
@@ -2702,7 +2702,7 @@
                 <w:sz w:val="19"/>
                 <w:szCs w:val="19"/>
               </w:rPr>
-              <w:t xml:space="preserve">-1.85 to -1.10</w:t>
+              <w:t xml:space="preserve">-1.85 to -1.09</w:t>
             </w:r>
           </w:p>
         </w:tc>
@@ -2983,7 +2983,7 @@
                 <w:sz w:val="19"/>
                 <w:szCs w:val="19"/>
               </w:rPr>
-              <w:t xml:space="preserve">+0.08</w:t>
+              <w:t xml:space="preserve">+0.04</w:t>
             </w:r>
           </w:p>
         </w:tc>
@@ -3008,7 +3008,7 @@
                 <w:sz w:val="19"/>
                 <w:szCs w:val="19"/>
               </w:rPr>
-              <w:t xml:space="preserve">-0.46 to 0.63</w:t>
+              <w:t xml:space="preserve">-0.52 to 0.60</w:t>
             </w:r>
           </w:p>
         </w:tc>
@@ -3314,7 +3314,7 @@
           <w:sz w:val="21"/>
           <w:szCs w:val="21"/>
         </w:rPr>
-        <w:t xml:space="preserve">Removing the 1,769 respondents who identify as neither introvert nor extrovert raises balanced accuracy by 22.76 to 23.46 points depending on the model. This is the largest effect measured here.</w:t>
+        <w:t xml:space="preserve">Removing the 1,769 respondents who identify as neither introvert nor extrovert raises balanced accuracy by 22.76 to 23.48 points depending on the model. This is the largest effect measured here.</w:t>
       </w:r>
     </w:p>
     <w:p>
@@ -3367,7 +3367,7 @@
           <w:sz w:val="21"/>
           <w:szCs w:val="21"/>
         </w:rPr>
-        <w:t xml:space="preserve">Applying SMOTE to the whole dataset before splitting, rather than inside each training fold, raises balanced accuracy on MIES by 20.69 points for the random forest, 18.33 for XGBoost, and 5.68 for logistic regression. On the Kaggle dataset the same change moves accuracy by less than 0.5 points in every case.</w:t>
+        <w:t xml:space="preserve">Applying SMOTE to the whole dataset before splitting, rather than inside each training fold, raises balanced accuracy on MIES by 20.61 points for the random forest, 18.39 for XGBoost, and 5.65 for logistic regression. On the Kaggle dataset the same change moves accuracy by less than 0.5 points in every case.</w:t>
       </w:r>
     </w:p>
     <w:p>
@@ -3393,7 +3393,7 @@
           <w:sz w:val="21"/>
           <w:szCs w:val="21"/>
         </w:rPr>
-        <w:t xml:space="preserve">Two things have to hold for the effect to appear. The classes have to be imbalanced enough for SMOTE to generate a large number of synthetic rows, which is why the Kaggle dataset shows almost nothing at 51/49 while MIES shows 20 points at 61/14/25. And the model has to be flexible enough to exploit the leaked information. A logistic regression on seven features has seven coefficients and cannot fit an individual row, which is why it gains 5.68 points where the random forest gains 20.69.</w:t>
+        <w:t xml:space="preserve">Two things have to hold for the effect to appear. The classes have to be imbalanced enough for SMOTE to generate a large number of synthetic rows, which is why the Kaggle dataset shows almost nothing at 51/49 while MIES shows 20 points at 61/14/25. And the model has to be flexible enough to exploit the leaked information. A logistic regression on seven features has seven coefficients and cannot fit an individual row, which is why it gains 5.65 points where the random forest gains 20.61.</w:t>
       </w:r>
     </w:p>
     <w:p>
@@ -3473,7 +3473,7 @@
           <w:sz w:val="21"/>
           <w:szCs w:val="21"/>
         </w:rPr>
-        <w:t xml:space="preserve">Selecting the top 15 features by ANOVA F-score using the whole dataset, rather than inside each training fold, changes balanced accuracy by +0.08, -0.00, and +0.10 points for the three models. All three 95% intervals contain zero, the widest running from -0.46 to +0.63. There is no evidence of a systematic effect under these conditions.</w:t>
+        <w:t xml:space="preserve">Selecting the top 15 features by ANOVA F-score using the whole dataset, rather than inside each training fold, changes balanced accuracy by +0.04, -0.00, and +0.10 points for the three models. All three 95% intervals contain zero, the widest running from -0.52 to +0.60. There is no evidence of a systematic effect under these conditions.</w:t>
       </w:r>
     </w:p>
     <w:p>

</xml_diff>

<commit_message>
Add reserved DOI, correct So and Fieri citations, add Breiman and ethics statement
</commit_message>
<xml_diff>
--- a/paper/preprocessing_paper.docx
+++ b/paper/preprocessing_paper.docx
@@ -58,15 +58,41 @@
     </w:p>
     <w:p>
       <w:pPr>
+        <w:spacing w:after="60"/>
+        <w:jc w:val="center"/>
+      </w:pPr>
+      <w:r>
+        <w:rPr>
+          <w:sz w:val="20"/>
+          <w:szCs w:val="20"/>
+        </w:rPr>
+        <w:t xml:space="preserve">August 2026</w:t>
+      </w:r>
+    </w:p>
+    <w:p>
+      <w:pPr>
+        <w:spacing w:after="60"/>
+        <w:jc w:val="center"/>
+      </w:pPr>
+      <w:r>
+        <w:rPr>
+          <w:sz w:val="19"/>
+          <w:szCs w:val="19"/>
+        </w:rPr>
+        <w:t xml:space="preserve">Preprint, version 1.0</w:t>
+      </w:r>
+    </w:p>
+    <w:p>
+      <w:pPr>
         <w:spacing w:after="300"/>
         <w:jc w:val="center"/>
       </w:pPr>
       <w:r>
         <w:rPr>
-          <w:sz w:val="20"/>
-          <w:szCs w:val="20"/>
-        </w:rPr>
-        <w:t xml:space="preserve">August 2026</w:t>
+          <w:sz w:val="19"/>
+          <w:szCs w:val="19"/>
+        </w:rPr>
+        <w:t xml:space="preserve">https://doi.org/10.5281/zenodo.21955709</w:t>
       </w:r>
     </w:p>
     <w:p>
@@ -93,7 +119,7 @@
           <w:sz w:val="21"/>
           <w:szCs w:val="21"/>
         </w:rPr>
-        <w:t xml:space="preserve">Reported accuracies for classifying introverts and extroverts from self-report data vary widely. Fieri et al. [13] report 73.5% and 95.5% on the same dataset depending on how it was prepared before training. I measure how much four preparation decisions move that number, holding the data and the models fixed. Using a public Kaggle dataset of 2,900 responses to seven behavioral questions and the Multidimensional Introversion-Extraversion Scales (MIES; 7,188 respondents, 91 items), each condition is evaluated with 5-fold cross-validation repeated 10 times, and differences are reported in percentage points of balanced accuracy with 95% intervals. Dropping respondents who identify as neither introvert nor extrovert raises balanced accuracy by 22.8 to 23.5 points, although this changes the classification task rather than only the preprocessing. Applying SMOTE to the full dataset before splitting, rather than within each training fold, raises it by 18.4 to 20.6 points on the imbalanced dataset and by under 0.5 points on the balanced one. Keeping duplicate rows changes it by about one point. Selecting the top 15 features by ANOVA F-score before splitting shows no evidence of a systematic effect, with all three intervals containing zero. My three-class MIES results fall within a third of a point of two published studies that retained the ambivert group. Accuracies for this task are therefore not comparable across studies unless these choices are stated.</w:t>
+        <w:t xml:space="preserve">Reported accuracies for classifying introverts and extroverts from self-report data vary widely. Fieri et al. [13] report 73.5% and 95.5% on the same dataset depending on how it was prepared before training. I measure how much four preparation decisions move that number, holding the data and the models fixed. Using a public Kaggle dataset of 2,900 responses to seven behavioral questions and the Multidimensional Introversion-Extraversion Scales (MIES; 7,188 respondents, 91 items), each condition is evaluated with 5-fold cross-validation repeated 10 times, and differences are reported in percentage points of balanced accuracy with 95% intervals. Dropping respondents who identify as neither introvert nor extrovert raises balanced accuracy by 22.8 to 23.5 points, although this changes the classification task rather than only the preprocessing. Applying SMOTE to the full dataset before splitting, rather than within each training fold, raises it by 18.4 to 20.6 points on the imbalanced dataset and by under 0.5 points on the balanced one. Keeping duplicate rows changes it by about one point. Selecting the top 15 features by ANOVA F-score before splitting shows no evidence of a systematic effect, with all three intervals containing zero. My three-class MIES results fall within a third of a point of two published studies that retained the ambivert group. Reported performance on this task is therefore sensitive to class definition and resampling order, which makes comparison across studies difficult when those choices are not stated.</w:t>
       </w:r>
     </w:p>
     <w:p>
@@ -461,7 +487,7 @@
           <w:sz w:val="21"/>
           <w:szCs w:val="21"/>
         </w:rPr>
-        <w:t xml:space="preserve">Three classifiers were used: a random forest with 100 trees, a logistic regression with L2 regularization and the lbfgs solver, and an XGBoost model [19] with a maximum depth of 3 and 100 trees. All use random_state = 42 so that the results can be repeated.</w:t>
+        <w:t xml:space="preserve">Three classifiers were used: a random forest [21] with 100 trees, a logistic regression with L2 regularization and the lbfgs solver, and an XGBoost model [19] with a maximum depth of 3 and 100 trees. All use random_state = 42 so that the results can be repeated.</w:t>
       </w:r>
     </w:p>
     <w:p>
@@ -4440,7 +4466,7 @@
           <w:sz w:val="21"/>
           <w:szCs w:val="21"/>
         </w:rPr>
-        <w:t xml:space="preserve">All code used to clean the data, run the conditions, and generate the figures is available at https://github.com/rishi3qrw43/introvert-extrovert. The datasets are not redistributed; the repository documents where to download each one.</w:t>
+        <w:t xml:space="preserve">All code used to clean the data, run the conditions, and generate the figures is available at https://github.com/rishi3qrw43/introvert-extrovert. The three datasets are publicly available from their original sources [10, 14, 15] and are not redistributed here; the repository documents where to download each one and how to prepare it.</w:t>
       </w:r>
     </w:p>
     <w:p>
@@ -4454,6 +4480,33 @@
           <w:sz w:val="26"/>
           <w:szCs w:val="26"/>
         </w:rPr>
+        <w:t xml:space="preserve">Ethics Statement</w:t>
+      </w:r>
+    </w:p>
+    <w:p>
+      <w:pPr>
+        <w:spacing w:after="160" w:line="276"/>
+        <w:jc w:val="both"/>
+      </w:pPr>
+      <w:r>
+        <w:rPr>
+          <w:sz w:val="21"/>
+          <w:szCs w:val="21"/>
+        </w:rPr>
+        <w:t xml:space="preserve">This work analyzes survey data that was collected and anonymized by others before the study began. No new human-subject data were collected, and no personally identifying information was accessed or redistributed.</w:t>
+      </w:r>
+    </w:p>
+    <w:p>
+      <w:pPr>
+        <w:spacing w:after="140" w:before="320"/>
+      </w:pPr>
+      <w:r>
+        <w:rPr>
+          <w:b/>
+          <w:bCs/>
+          <w:sz w:val="26"/>
+          <w:szCs w:val="26"/>
+        </w:rPr>
         <w:t xml:space="preserve">References</w:t>
       </w:r>
     </w:p>
@@ -4532,7 +4585,7 @@
           <w:sz w:val="19"/>
           <w:szCs w:val="19"/>
         </w:rPr>
-        <w:t xml:space="preserve">[6] S. D. Gosling, P. J. Rentfrow, and W. B. Swann, "A very brief measure of the Big-Five personality domains," Journal of Research in Personality, vol. 37, no. 6, pp. 504-528, 2003.</w:t>
+        <w:t xml:space="preserve">[6] S. D. Gosling, P. J. Rentfrow, and W. B. Swann, "A very brief measure of the Big-Five personality domains," Journal of Research in Personality, vol. 37, no. 6, pp. 504-528, 2003, doi: 10.1016/S0092-6566(03)00046-1.</w:t>
       </w:r>
     </w:p>
     <w:p>
@@ -4545,7 +4598,7 @@
           <w:sz w:val="19"/>
           <w:szCs w:val="19"/>
         </w:rPr>
-        <w:t xml:space="preserve">[7] M. Kosinski, D. Stillwell, and T. Graepel, "Private traits and attributes are predictable from digital records of human behavior," Proceedings of the National Academy of Sciences, vol. 110, no. 15, pp. 5802-5805, 2013.</w:t>
+        <w:t xml:space="preserve">[7] M. Kosinski, D. Stillwell, and T. Graepel, "Private traits and attributes are predictable from digital records of human behavior," Proceedings of the National Academy of Sciences, vol. 110, no. 15, pp. 5802-5805, 2013, doi: 10.1073/pnas.1218772110.</w:t>
       </w:r>
     </w:p>
     <w:p>
@@ -4558,7 +4611,7 @@
           <w:sz w:val="19"/>
           <w:szCs w:val="19"/>
         </w:rPr>
-        <w:t xml:space="preserve">[8] W. Youyou, M. Kosinski, and D. Stillwell, "Computer-based personality judgments are more accurate than those made by humans," Proceedings of the National Academy of Sciences, vol. 112, no. 4, pp. 1036-1040, 2015.</w:t>
+        <w:t xml:space="preserve">[8] W. Youyou, M. Kosinski, and D. Stillwell, "Computer-based personality judgments are more accurate than those made by humans," Proceedings of the National Academy of Sciences, vol. 112, no. 4, pp. 1036-1040, 2015, doi: 10.1073/pnas.1418680112.</w:t>
       </w:r>
     </w:p>
     <w:p>
@@ -4571,7 +4624,7 @@
           <w:sz w:val="19"/>
           <w:szCs w:val="19"/>
         </w:rPr>
-        <w:t xml:space="preserve">[9] S. C. Matz, M. Kosinski, G. Nave, and D. J. Stillwell, "Psychological targeting as an effective approach to digital mass persuasion," Proceedings of the National Academy of Sciences, vol. 114, no. 48, pp. 12714-12719, 2017.</w:t>
+        <w:t xml:space="preserve">[9] S. C. Matz, M. Kosinski, G. Nave, and D. J. Stillwell, "Psychological targeting as an effective approach to digital mass persuasion," Proceedings of the National Academy of Sciences, vol. 114, no. 48, pp. 12714-12719, 2017, doi: 10.1073/pnas.1710966114.</w:t>
       </w:r>
     </w:p>
     <w:p>
@@ -4597,7 +4650,7 @@
           <w:sz w:val="19"/>
           <w:szCs w:val="19"/>
         </w:rPr>
-        <w:t xml:space="preserve">[11] S. Kapoor and A. Narayanan, "Leakage and the reproducibility crisis in machine-learning-based science," Patterns, vol. 4, no. 9, art. 100804, 2023.</w:t>
+        <w:t xml:space="preserve">[11] S. Kapoor and A. Narayanan, "Leakage and the reproducibility crisis in machine-learning-based science," Patterns, vol. 4, no. 9, art. 100804, 2023, doi: 10.1016/j.patter.2023.100804.</w:t>
       </w:r>
     </w:p>
     <w:p>
@@ -4610,7 +4663,7 @@
           <w:sz w:val="19"/>
           <w:szCs w:val="19"/>
         </w:rPr>
-        <w:t xml:space="preserve">[12] C. So, "Are you an introvert or extrovert? Accurate classification with only ten predictors," in Proc. 2020 International Conference on Artificial Intelligence in Information and Communication (ICAIIC), 2020, pp. 1-5.</w:t>
+        <w:t xml:space="preserve">[12] C. So, "Are you an introvert or extrovert? Accurate classification with only ten predictors," in Proc. 2020 International Conference on Artificial Intelligence in Information and Communication (ICAIIC), Fukuoka, Japan, 2020, pp. 693-696, doi: 10.1109/ICAIIC48513.2020.9065069.</w:t>
       </w:r>
     </w:p>
     <w:p>
@@ -4623,7 +4676,7 @@
           <w:sz w:val="19"/>
           <w:szCs w:val="19"/>
         </w:rPr>
-        <w:t xml:space="preserve">[13] B. Fieri, J. La’la, and D. Suhartono, "Introversion-extraversion prediction using machine learning," JOIV: International Journal on Informatics Visualization, vol. 7, no. 4, pp. 2153-2159, 2023.</w:t>
+        <w:t xml:space="preserve">[13] B. Fieri, J. La’la, and D. Suhartono, "Introversion-extraversion prediction using machine learning," JOIV: International Journal on Informatics Visualization, vol. 7, no. 4, pp. 2154-2160, 2023, doi: 10.62527/joiv.7.4.1019.</w:t>
       </w:r>
     </w:p>
     <w:p>
@@ -4662,7 +4715,7 @@
           <w:sz w:val="19"/>
           <w:szCs w:val="19"/>
         </w:rPr>
-        <w:t xml:space="preserve">[16] N. V. Chawla, K. W. Bowyer, L. O. Hall, and W. P. Kegelmeyer, "SMOTE: Synthetic minority over-sampling technique," Journal of Artificial Intelligence Research, vol. 16, pp. 321-357, 2002.</w:t>
+        <w:t xml:space="preserve">[16] N. V. Chawla, K. W. Bowyer, L. O. Hall, and W. P. Kegelmeyer, "SMOTE: Synthetic minority over-sampling technique," Journal of Artificial Intelligence Research, vol. 16, pp. 321-357, 2002, doi: 10.1613/jair.953.</w:t>
       </w:r>
     </w:p>
     <w:p>
@@ -4715,6 +4768,19 @@
           <w:szCs w:val="19"/>
         </w:rPr>
         <w:t xml:space="preserve">[20] G. Lemaitre, F. Nogueira, and C. K. Aridas, "Imbalanced-learn: A Python toolbox to tackle the curse of imbalanced datasets in machine learning," Journal of Machine Learning Research, vol. 18, no. 17, pp. 1-5, 2017.</w:t>
+      </w:r>
+    </w:p>
+    <w:p>
+      <w:pPr>
+        <w:spacing w:after="70"/>
+        <w:ind w:left="340" w:hanging="340"/>
+      </w:pPr>
+      <w:r>
+        <w:rPr>
+          <w:sz w:val="19"/>
+          <w:szCs w:val="19"/>
+        </w:rPr>
+        <w:t xml:space="preserve">[21] L. Breiman, "Random forests," Machine Learning, vol. 45, no. 1, pp. 5-32, 2001, doi: 10.1023/A:1010933404324.</w:t>
       </w:r>
     </w:p>
     <w:sectPr>

</xml_diff>

<commit_message>
Expand item-overlap section, define terms, remove inline hedges and cross-references
</commit_message>
<xml_diff>
--- a/paper/preprocessing_paper.docx
+++ b/paper/preprocessing_paper.docx
@@ -393,7 +393,7 @@
           <w:sz w:val="21"/>
           <w:szCs w:val="21"/>
         </w:rPr>
-        <w:t xml:space="preserve">The third is the IPIP Big Five Factor Markers data [15], 19,719 responses to 50 items. It carries no self-reported introvert or extrovert label. A label would have to be derived from the extraversion items themselves, and predicting that label from those same items would be circular, so this dataset is not used for classification. It appears only in Section V.G as a reference point for how much the items of an established extraversion scale overlap with one another.</w:t>
+        <w:t xml:space="preserve">The third is the IPIP Big Five Factor Markers data [15], 19,719 responses to 50 items. It carries no self-reported introvert or extrovert label, and deriving one from the extraversion items would make any prediction from those same items circular, so this dataset is never used for classification. Its ten extraversion items serve only as a reference point for how much the questions of an established scale overlap with one another.</w:t>
       </w:r>
     </w:p>
     <w:p>
@@ -433,7 +433,7 @@
           <w:sz w:val="21"/>
           <w:szCs w:val="21"/>
         </w:rPr>
-        <w:t xml:space="preserve">The file contains 486 rows that are exact duplicates of another row. Unless a condition states otherwise, these are removed before analysis, leaving 2,414 unique rows. Section V.E reports what happens when they are kept.</w:t>
+        <w:t xml:space="preserve">The file contains 486 rows that are exact duplicates of another row. Unless a condition states otherwise, these are removed before analysis, leaving 2,414 unique rows.</w:t>
       </w:r>
     </w:p>
     <w:p>
@@ -500,7 +500,7 @@
           <w:sz w:val="21"/>
           <w:szCs w:val="21"/>
         </w:rPr>
-        <w:t xml:space="preserve">Every preprocessing step runs inside a scikit-learn [18] pipeline, so imputation and scaling are fitted on training data only. This matters here for a specific reason: fitting a scaler on the full dataset before splitting is itself a small version of the leakage this paper measures, so the code should not commit it.</w:t>
+        <w:t xml:space="preserve">Every preprocessing step runs inside a scikit-learn [18] pipeline, so imputation and scaling are fitted on training data only. Fitting them on the full dataset first would be a small version of the leakage this paper measures.</w:t>
       </w:r>
     </w:p>
     <w:p>
@@ -540,7 +540,7 @@
           <w:sz w:val="21"/>
           <w:szCs w:val="21"/>
         </w:rPr>
-        <w:t xml:space="preserve">Balanced accuracy is used rather than raw accuracy because MIES is strongly imbalanced. A model that always predicts “introvert” on the three-class version reaches 61.5% raw accuracy while learning nothing. Balanced accuracy scores each class separately and averages them, so the same model scores 33%. Where results from this paper are placed beside published figures, the comparison uses raw accuracy on both sides, since the published studies report raw accuracy.</w:t>
+        <w:t xml:space="preserve">Balanced accuracy is used rather than raw accuracy because MIES is strongly imbalanced. Introverts make up 61.5% of the three-class data, so a model that answers “introvert” every time scores 61.5% raw accuracy without having learned anything. That figure has a name: the no-information rate, the score a classifier gets for free by always naming the largest class. Balanced accuracy scores each class separately and then averages them, so the same do-nothing model scores 33%. Where results here sit beside published figures, both sides use raw accuracy, since the published studies report raw accuracy.</w:t>
       </w:r>
     </w:p>
     <w:p>
@@ -567,7 +567,7 @@
           <w:sz w:val="21"/>
           <w:szCs w:val="21"/>
         </w:rPr>
-        <w:t xml:space="preserve">Each condition is a pair of pipelines that differ in exactly one step.</w:t>
+        <w:t xml:space="preserve">Each condition is a pair of pipelines that differ in exactly one step. In three of the four pairs, the first arm uses the whole dataset for a step that should be confined to the training data, and the second arm confines it correctly.</w:t>
       </w:r>
     </w:p>
     <w:p>
@@ -594,7 +594,7 @@
           <w:sz w:val="21"/>
           <w:szCs w:val="21"/>
         </w:rPr>
-        <w:t xml:space="preserve">Three classes (introvert, extrovert, neither) against two classes, with the neither group removed. This changes the prediction task and the population being classified, not only the preprocessing. Section V.C discusses that directly.</w:t>
+        <w:t xml:space="preserve">Three classes (introvert, extrovert, neither) against two classes, with the neither group removed. This one changes the prediction task and the population being classified, not only the order of the steps.</w:t>
       </w:r>
     </w:p>
     <w:p>
@@ -621,7 +621,7 @@
           <w:sz w:val="21"/>
           <w:szCs w:val="21"/>
         </w:rPr>
-        <w:t xml:space="preserve">In the leaky version, SMOTE [16] is applied to the entire dataset and cross-validation is run on the result. In the correct version, SMOTE is applied inside each training fold only, using an imbalanced-learn [20] pipeline, leaving every test fold untouched. Five nearest neighbors are used in both cases.</w:t>
+        <w:t xml:space="preserve">SMOTE [16] applied to the entire dataset before cross-validation, against SMOTE applied inside each training fold through an imbalanced-learn [20] pipeline. SMOTE builds a new minority-class row by taking a real minority row, picking one of its five closest minority neighbors, and placing a new point at a random spot on the line between them. Five neighbors is the default and is used in both arms, so the only thing that differs is when the new rows are made.</w:t>
       </w:r>
     </w:p>
     <w:p>
@@ -648,7 +648,7 @@
           <w:sz w:val="21"/>
           <w:szCs w:val="21"/>
         </w:rPr>
-        <w:t xml:space="preserve">Kept against removed, as described in Section II.B.</w:t>
+        <w:t xml:space="preserve">The 486 exact duplicate rows kept in one arm and removed in the other, on the Kaggle dataset.</w:t>
       </w:r>
     </w:p>
     <w:p>
@@ -675,7 +675,7 @@
           <w:sz w:val="21"/>
           <w:szCs w:val="21"/>
         </w:rPr>
-        <w:t xml:space="preserve">In the leaky version, the top 15 features by ANOVA F-score are chosen using the entire dataset, and cross-validation is run on those features. In the correct version, the same selection is performed separately inside each training fold. Fifteen was chosen because it matches the number of items selected by Fieri et al. [13].</w:t>
+        <w:t xml:space="preserve">The 15 items with the highest ANOVA F-score chosen from the entire dataset before cross-validation, against the same selection repeated from scratch inside each training fold. The F-score ranks each item by how far apart the class averages are relative to the spread within each class, so a high-scoring item is one that separates the groups cleanly on its own.</w:t>
       </w:r>
     </w:p>
     <w:p>
@@ -1358,19 +1358,6 @@
     </w:tbl>
     <w:p>
       <w:pPr>
-        <w:spacing w:after="200" w:line="276"/>
-        <w:jc w:val="both"/>
-      </w:pPr>
-      <w:r>
-        <w:rPr>
-          <w:sz w:val="21"/>
-          <w:szCs w:val="21"/>
-        </w:rPr>
-        <w:t xml:space="preserve">Random forest results on MIES shift by approximately 0.002 balanced accuracy under scikit-learn releases earlier than the pinned version, which is small relative to every effect reported here but worth noting for anyone rerunning the code in a different environment.</w:t>
-      </w:r>
-    </w:p>
-    <w:p>
-      <w:pPr>
         <w:spacing w:after="120" w:before="220"/>
       </w:pPr>
       <w:r>
@@ -1393,7 +1380,7 @@
           <w:sz w:val="21"/>
           <w:szCs w:val="21"/>
         </w:rPr>
-        <w:t xml:space="preserve">A single random seed of 42 is applied to every estimator, to SMOTE, and to the cross-validation splitter, and cross-validation folds are stratified throughout. The baseline in Table 1 uses one 80/20 stratified split; every comparison in Section V uses 5-fold cross-validation repeated 10 times, giving 50 fits per arm. Imputation, scaling, resampling, and feature selection are all performed inside the pipeline so that they are fitted on training folds only, except where a condition deliberately does otherwise in order to measure the effect. Missing MIES responses are imputed with the training-fold median. Feature selection keeps the 15 items with the highest ANOVA F-score. The cleaning code, the condition scripts, the figure scripts, and the pinned requirements file are all in the repository listed under Code and Data Availability, and each table in this paper is produced by a named script in that repository.</w:t>
+        <w:t xml:space="preserve">A single random seed of 42 is applied to every estimator, to SMOTE, and to the cross-validation splitter, and all folds are stratified. Imputation, scaling, resampling, and feature selection run inside the pipeline so that they are fitted on training folds only, except where a condition deliberately does otherwise in order to measure the effect, and missing MIES responses are imputed with the training-fold median. Every table in this paper is produced by a named script in the repository listed under Code and Data Availability.</w:t>
       </w:r>
     </w:p>
     <w:p>
@@ -3353,7 +3340,7 @@
           <w:sz w:val="21"/>
           <w:szCs w:val="21"/>
         </w:rPr>
-        <w:t xml:space="preserve">It is important to be clear about what this comparison is. Dropping the neither group does not simply clean the data; it converts a three-class problem into a two-class problem and removes the respondents whose self-description is least definite. Accuracy rises partly because the remaining population is easier to separate. The point is not that removing this group is wrong, since a two-class problem is a reasonable thing to study. The point is that a two-class result and a three-class result describe different tasks and cannot be placed side by side.</w:t>
+        <w:t xml:space="preserve">Dropping the neither group converts a three-class problem into a two-class problem and removes the respondents whose self-description is least definite. Accuracy rises partly because the population that remains is easier to separate. A two-class problem is a reasonable thing to study, but a two-class result and a three-class result answer different questions and cannot be placed side by side.</w:t>
       </w:r>
     </w:p>
     <w:p>
@@ -3366,7 +3353,7 @@
           <w:sz w:val="21"/>
           <w:szCs w:val="21"/>
         </w:rPr>
-        <w:t xml:space="preserve">This matters for reading the existing literature. My three-class results, at 0.728 to 0.736 raw accuracy, fall close to two published studies using the same instrument: So [12] reports 73.81% and Fieri et al. [13] report 73.5% before resampling. Fieri et al. state class counts of 4,404, 989, and 1,768, which are the counts of all three groups, so that study retained the neither group as a matter of record. So does not state the class counts directly, but reports a no-information rate of 61.51%, which matches the majority-class share of the three-class version of this data (61.48%) rather than the two-class version (81.6%); the inference that the neither group was retained follows from that match rather than from a direct statement.</w:t>
+        <w:t xml:space="preserve">My three-class results, at 0.728 to 0.736 raw accuracy, land close to two published studies using the same instrument: So [12] reports 73.81% and Fieri et al. [13] report 73.5% before resampling. Fieri et al. list class counts of 4,404, 989, and 1,768, which are all three groups. So reports a no-information rate of 61.51%, and the largest class in the three-class version of this data accounts for 61.48% of it, against 81.6% in the two-class version, so that study was almost certainly working with three classes as well.</w:t>
       </w:r>
     </w:p>
     <w:p>
@@ -3432,7 +3419,7 @@
           <w:sz w:val="21"/>
           <w:szCs w:val="21"/>
         </w:rPr>
-        <w:t xml:space="preserve">For comparison, Fieri et al. [13] report 73.5% before resampling and 95.5% after. The size of the change I measure from ordering alone is close to the size of the change they report, though I have not inspected their code and make no claim about what produced their numbers.</w:t>
+        <w:t xml:space="preserve">For comparison, Fieri et al. [13] report 73.5% before resampling and 95.5% after. The change I measure from ordering alone is close in size to the change they report.</w:t>
       </w:r>
     </w:p>
     <w:p>
@@ -3539,7 +3526,20 @@
           <w:sz w:val="21"/>
           <w:szCs w:val="21"/>
         </w:rPr>
-        <w:t xml:space="preserve">One possible explanation is that the items in these datasets carry heavily overlapping information, so which subset is chosen matters less than it might.</w:t>
+        <w:t xml:space="preserve">Choosing features on the whole dataset can only leak something if the choice itself carries information. If the questions in a dataset all measure close to the same thing, then almost any subset of them carries almost the same information, and it stops mattering whether that subset was picked using the test rows or without them. The measurements below suggest that is the situation here.</w:t>
+      </w:r>
+    </w:p>
+    <w:p>
+      <w:pPr>
+        <w:spacing w:after="160" w:line="276"/>
+        <w:jc w:val="both"/>
+      </w:pPr>
+      <w:r>
+        <w:rPr>
+          <w:sz w:val="21"/>
+          <w:szCs w:val="21"/>
+        </w:rPr>
+        <w:t xml:space="preserve">Table 3 reports how strongly the items within each set move together. The measure is the absolute correlation between every pair of items in a set, where 0 means two questions tell you unrelated things about a person and 1 means they tell you the same thing twice. A set with a high average is one where the questions are close to interchangeable.</w:t>
       </w:r>
     </w:p>
     <w:tbl>
@@ -4098,7 +4098,7 @@
           <w:sz w:val="21"/>
           <w:szCs w:val="21"/>
         </w:rPr>
-        <w:t xml:space="preserve">In the Kaggle dataset, the least related pair of the seven behaviors correlates at 0.69, which is higher than the most related pair in the BIG5 extraversion scale (0.631). That scale was written to measure a single trait through ten items, so it is a reasonable upper reference point for how much a set of deliberately similar questions should overlap. The seven behaviors exceed it.</w:t>
+        <w:t xml:space="preserve">The seven Kaggle behaviors average 0.784, roughly four times the MIES average of 0.196. The sharpest way to see it is at the edges of the range. The least related pair of the seven behaviors correlates at 0.69, which is higher than the most related pair in the BIG5 extraversion scale at 0.631. That scale was written on purpose to measure one trait through ten differently worded items, so it is a fair upper reference point for how much a deliberately repetitive set of questions should overlap. The seven behaviors sit above it, which means asking about time alone, social events, going outside, friends, posting, stage fright, and feeling drained is closer to asking one question seven times than to asking seven questions.</w:t>
       </w:r>
     </w:p>
     <w:p>
@@ -4170,7 +4170,7 @@
           <w:sz w:val="21"/>
           <w:szCs w:val="21"/>
         </w:rPr>
-        <w:t xml:space="preserve">A direct consequence is that removing the single highest-ranked item barely changes anything. Ranking items by SHAP importance [17], all three models place stage fright first on the Kaggle dataset, and removing it changes balanced accuracy by -0.005 for the random forest, +0.002 for logistic regression, and +0.004 for XGBoost. Two of the three models improve slightly without their most important feature.</w:t>
+        <w:t xml:space="preserve">Two further results follow from that. The first is that removing the single most important item barely changes anything. Importance here is measured with SHAP [17], a method that divides the credit for a model’s predictions among its features, so the top-ranked item is the one the model leans on hardest. All three models rank stage fright first on the Kaggle dataset, and removing it changes balanced accuracy by -0.005 for the random forest, +0.002 for logistic regression, and +0.004 for XGBoost. Two of the three do slightly better without the feature they depend on most.</w:t>
       </w:r>
     </w:p>
     <w:p>
@@ -4234,6 +4234,19 @@
     </w:p>
     <w:p>
       <w:pPr>
+        <w:spacing w:after="160" w:line="276"/>
+        <w:jc w:val="both"/>
+      </w:pPr>
+      <w:r>
+        <w:rPr>
+          <w:sz w:val="21"/>
+          <w:szCs w:val="21"/>
+        </w:rPr>
+        <w:t xml:space="preserve">The second is that the ablation curve in Figure 3 stays flat as items are dropped one at a time, holding steady from seven questions down to two. A dataset where the last two questions perform about as well as all seven is a dataset where the choice of questions carries little information, which is what the null result in Section F would predict.</w:t>
+      </w:r>
+    </w:p>
+    <w:p>
+      <w:pPr>
         <w:spacing w:after="140" w:before="320"/>
       </w:pPr>
       <w:r>
@@ -4269,7 +4282,7 @@
           <w:sz w:val="21"/>
           <w:szCs w:val="21"/>
         </w:rPr>
-        <w:t xml:space="preserve">The class-structure result is the one most likely to be misread. It is not a claim that dropping ambiverts is an error. It is a claim that two-class and three-class results are answers to different questions, and that the difference between them is large enough to account for most of the range seen in published work on this instrument. When a paper reports accuracy for introvert-extrovert classification, the class structure should be stated somewhere a reader will see it.</w:t>
+        <w:t xml:space="preserve">The class-structure result is the one most likely to be misread. Dropping ambiverts is a legitimate choice, but two-class and three-class results answer different questions, and the gap between them is large enough to account for most of the range seen in published work on this instrument. Any paper reporting accuracy for this task should state its class structure somewhere a reader will see it.</w:t>
       </w:r>
     </w:p>
     <w:p>
@@ -4282,7 +4295,7 @@
           <w:sz w:val="21"/>
           <w:szCs w:val="21"/>
         </w:rPr>
-        <w:t xml:space="preserve">The resampling result is a textbook leakage effect, but its size depends on conditions that are easy to overlook. It requires class imbalance, and it requires a model flexible enough to exploit the leaked rows. A study that resamples before splitting on balanced data with a linear model would see almost nothing, and might reasonably conclude the practice is harmless.</w:t>
+        <w:t xml:space="preserve">The resampling effect depends on conditions that are easy to overlook. It needs class imbalance, and it needs a model flexible enough to exploit the extra rows, so a study that resampled before splitting on balanced data with a linear model would see almost nothing and might conclude the practice is harmless.</w:t>
       </w:r>
     </w:p>
     <w:p>
@@ -4381,7 +4394,7 @@
           <w:sz w:val="21"/>
           <w:szCs w:val="21"/>
         </w:rPr>
-        <w:t xml:space="preserve">The overlap explanation is descriptive. The item-overlap comparison in Section V.G offers a plausible reason for the null selection-order result but does not establish it, since no experiment here manipulates overlap directly.</w:t>
+        <w:t xml:space="preserve">The overlap explanation is descriptive. The item-overlap measurements offer a plausible reason for the null selection-order result but do not establish it, since no experiment here manipulates overlap directly.</w:t>
       </w:r>
     </w:p>
     <w:p>

</xml_diff>

<commit_message>
Restore original manuscript wording in introduction, cleaning, and methods
</commit_message>
<xml_diff>
--- a/paper/preprocessing_paper.docx
+++ b/paper/preprocessing_paper.docx
@@ -187,7 +187,20 @@
           <w:sz w:val="21"/>
           <w:szCs w:val="21"/>
         </w:rPr>
-        <w:t xml:space="preserve">Psychologists have studied the distinction between introversion and extroversion for decades because of its obvious presence in daily life [1, 2]. Some individuals will be more energized after a day of being alone, while others will become restless if they do not see other people on a regular basis. One individual may leave a long social gathering exhausted; another will be energized to participate in more social activities [3]. Researchers have used formal assessments such as the NEO Personality Inventory [4], type-based instruments such as the Myers-Briggs Type Indicator [5], and shorter self-report measures [6] to place people along this dimension. More recently, personality traits have been predicted from social media activity [7], computer models have judged personality more accurately than a person’s own friends [8], and personality estimates have been used to target persuasive messages [9]. This work suggests that introverts and extroverts differ in measurable ways, although it has often relied on large and detailed digital records rather than a few simple, self-reported behaviors.</w:t>
+        <w:t xml:space="preserve">Psychologists have studied personality traits, particularly the distinction between introversion and extroversion, for decades because of their obvious presence in our daily lives [1, 2]. For example, some individuals will be more energized after a day of being alone, while others will become restless if they do not see other people on a regular basis. One individual may leave a long social gathering exhausted; another will be energized to participate in more social activities [3]. Researchers have used formal assessments, like the NEO Personality Inventory [4] or Myers-Briggs Type Indicator, MBTI [5], and shorter self-report measures [6] to assess personality traits. These assessments rely on people reflecting on and describing themselves, but the difference between introverts and extroverts is also thought to show up in their everyday behavior.</w:t>
+      </w:r>
+    </w:p>
+    <w:p>
+      <w:pPr>
+        <w:spacing w:after="160" w:line="276"/>
+        <w:jc w:val="both"/>
+      </w:pPr>
+      <w:r>
+        <w:rPr>
+          <w:sz w:val="21"/>
+          <w:szCs w:val="21"/>
+        </w:rPr>
+        <w:t xml:space="preserve">More recently, researchers have shown that personality is reflected in behavior and digital records, not only in questionnaires. Private traits have been predicted from social media activity [7], computer models have judged personality more accurately than a person’s own friends [8], and such patterns have even been used to target persuasive messages [9]. This work suggests that introverts and extroverts behave differently in measurable ways, although it has often relied on large and very detailed digital records rather than a few simple, self-reported behaviors.</w:t>
       </w:r>
     </w:p>
     <w:p>
@@ -420,7 +433,7 @@
           <w:sz w:val="21"/>
           <w:szCs w:val="21"/>
         </w:rPr>
-        <w:t xml:space="preserve">For the Kaggle dataset, the five numerical questions were rounded to the nearest whole number. For stage fright and feeling drained, 1 was used to represent “Yes” and 0 to represent “No.” Personality labels were set to 0 for introvert and 1 for extrovert.</w:t>
+        <w:t xml:space="preserve">For the Kaggle dataset, the five numerical questions were rounded to the nearest whole number. For stage fright and feeling drained, 1 was used to represent “Yes” and 0 to represent “No.” All personality labels were set to 0 for introvert (including “Int”) and 1 for extrovert.</w:t>
       </w:r>
     </w:p>
     <w:p>
@@ -487,7 +500,7 @@
           <w:sz w:val="21"/>
           <w:szCs w:val="21"/>
         </w:rPr>
-        <w:t xml:space="preserve">Three classifiers were used: a random forest [21] with 100 trees, a logistic regression with L2 regularization and the lbfgs solver, and an XGBoost model [19] with a maximum depth of 3 and 100 trees. All use random_state = 42 so that the results can be repeated.</w:t>
+        <w:t xml:space="preserve">Three classifiers were used: a random forest [21] with 100 trees, a logistic regression with L2 regularization and the lbfgs solver, and an XGBoost model [19] with a max depth of 3 and 100 trees. All code used random_state = 42 so that the results could be repeated.</w:t>
       </w:r>
     </w:p>
     <w:p>
@@ -527,7 +540,7 @@
           <w:sz w:val="21"/>
           <w:szCs w:val="21"/>
         </w:rPr>
-        <w:t xml:space="preserve">The baseline results in Table 1 use a single 80/20 stratified split. Every condition comparison in Section V instead uses 5-fold cross-validation repeated 10 times, giving 50 fits per condition. Differences between conditions are reported in percentage points of balanced accuracy, with a 95% interval computed from the pooled fold variance of the two conditions being compared.</w:t>
+        <w:t xml:space="preserve">For the baseline results in Table 1, the data were split in an 80/20 ratio between training and testing sets, with equal numbers of introverts and extroverts maintained through stratification. Every condition comparison in Section V instead uses 5-fold cross-validation repeated 10 times, giving 50 fits per condition. Differences between conditions are reported in percentage points of balanced accuracy, with a 95% interval computed from the pooled fold variance of the two conditions being compared.</w:t>
       </w:r>
     </w:p>
     <w:p>
@@ -4340,7 +4353,7 @@
           <w:sz w:val="21"/>
           <w:szCs w:val="21"/>
         </w:rPr>
-        <w:t xml:space="preserve">Two datasets only. Both are self-report instruments, so nothing here speaks to behavioral or digital-trace data, and both were collected online from self-selected respondents.</w:t>
+        <w:t xml:space="preserve">Two datasets only. The data came from self-reported answers only, so people may not remember or report their habits perfectly, and both samples were collected online from respondents who chose to take part.</w:t>
       </w:r>
     </w:p>
     <w:p>

</xml_diff>

<commit_message>
Plainer phrasing in sections not carried over from the original manuscript
</commit_message>
<xml_diff>
--- a/paper/preprocessing_paper.docx
+++ b/paper/preprocessing_paper.docx
@@ -119,7 +119,7 @@
           <w:sz w:val="21"/>
           <w:szCs w:val="21"/>
         </w:rPr>
-        <w:t xml:space="preserve">Reported accuracies for classifying introverts and extroverts from self-report data vary widely. Fieri et al. [13] report 73.5% and 95.5% on the same dataset depending on how it was prepared before training. I measure how much four preparation decisions move that number, holding the data and the models fixed. Using a public Kaggle dataset of 2,900 responses to seven behavioral questions and the Multidimensional Introversion-Extraversion Scales (MIES; 7,188 respondents, 91 items), each condition is evaluated with 5-fold cross-validation repeated 10 times, and differences are reported in percentage points of balanced accuracy with 95% intervals. Dropping respondents who identify as neither introvert nor extrovert raises balanced accuracy by 22.8 to 23.5 points, although this changes the classification task rather than only the preprocessing. Applying SMOTE to the full dataset before splitting, rather than within each training fold, raises it by 18.4 to 20.6 points on the imbalanced dataset and by under 0.5 points on the balanced one. Keeping duplicate rows changes it by about one point. Selecting the top 15 features by ANOVA F-score before splitting shows no evidence of a systematic effect, with all three intervals containing zero. My three-class MIES results fall within a third of a point of two published studies that retained the ambivert group. Reported performance on this task is therefore sensitive to class definition and resampling order, which makes comparison across studies difficult when those choices are not stated.</w:t>
+        <w:t xml:space="preserve">Reported accuracies for classifying introverts and extroverts from self-report data vary widely. Fieri et al. [13] report 73.5% and 95.5% on the same dataset depending on how it was prepared before training. I measure how much four preparation decisions move that number, holding the data and the models fixed. Using a public Kaggle dataset of 2,900 responses to seven behavioral questions and the Multidimensional Introversion-Extraversion Scales (MIES; 7,188 respondents, 91 items), each condition is evaluated with 5-fold cross-validation repeated 10 times, and differences are reported in percentage points of balanced accuracy with 95% intervals. Dropping respondents who identify as neither introvert nor extrovert raises balanced accuracy by 22.8 to 23.5 points, although this changes the classification task rather than only the preprocessing. Applying SMOTE to the full dataset before splitting, rather than within each training fold, raises it by 18.4 to 20.6 points on the imbalanced dataset and by under 0.5 points on the balanced one. Keeping duplicate rows changes it by about one point. Selecting the top 15 features by ANOVA F-score before splitting shows no evidence of a systematic effect, with all three intervals containing zero. My three-class MIES results fall within a third of a point of two published studies that retained the ambivert group. Reported accuracy for this task is therefore sensitive to how the classes are defined and to when the resampling is done. That makes it hard to compare numbers across studies when those choices are not stated.</w:t>
       </w:r>
     </w:p>
     <w:p>
@@ -227,7 +227,7 @@
           <w:sz w:val="21"/>
           <w:szCs w:val="21"/>
         </w:rPr>
-        <w:t xml:space="preserve">Studies that classify introverts and extroverts from self-report data report very different accuracies. Fieri et al. [13] report 73.5% and 95.5% for the same dataset, depending on how the data were prepared before training. So [12] reports 73.81% on the same questionnaire. Numbers like these are often compared as though they describe the same problem.</w:t>
+        <w:t xml:space="preserve">Studies that classify introverts and extroverts from self-report data report very different accuracies. Fieri et al. [13] report 73.5% and 95.5% for the same dataset, depending on how the data were prepared before training. So [12] reports 73.81% on the same questionnaire. Numbers like these often get compared as though they describe the same problem.</w:t>
       </w:r>
     </w:p>
     <w:p>
@@ -285,7 +285,7 @@
           <w:sz w:val="21"/>
           <w:szCs w:val="21"/>
         </w:rPr>
-        <w:t xml:space="preserve">A controlled comparison in which each of the four decisions is isolated, with everything else about the setup held fixed, so that any difference is attributable to the decision alone.</w:t>
+        <w:t xml:space="preserve">A controlled comparison where each of the four decisions is tested on its own, with everything else held fixed, so any difference has to come from that decision.</w:t>
       </w:r>
     </w:p>
     <w:p>
@@ -303,7 +303,7 @@
           <w:sz w:val="21"/>
           <w:szCs w:val="21"/>
         </w:rPr>
-        <w:t xml:space="preserve">Effect sizes reported in percentage points of balanced accuracy with 95% intervals, measured across 50 fits per condition rather than a single split.</w:t>
+        <w:t xml:space="preserve">Effect sizes in percentage points of balanced accuracy, with 95% intervals, measured across 50 fits per condition instead of one split.</w:t>
       </w:r>
     </w:p>
     <w:p>
@@ -321,7 +321,7 @@
           <w:sz w:val="21"/>
           <w:szCs w:val="21"/>
         </w:rPr>
-        <w:t xml:space="preserve">A reproduction of two published three-class results on the same instrument, which locates the class-structure decision as the source of most of the spread in the published literature.</w:t>
+        <w:t xml:space="preserve">A reproduction of two published three-class results on the same questionnaire, which points to the class-structure decision as the source of most of the spread in the published numbers.</w:t>
       </w:r>
     </w:p>
     <w:p>
@@ -339,7 +339,7 @@
           <w:sz w:val="21"/>
           <w:szCs w:val="21"/>
         </w:rPr>
-        <w:t xml:space="preserve">An item-overlap analysis of both datasets, offering an explanation for why one of the four decisions produces no measurable effect while a superficially similar one produces roughly twenty points.</w:t>
+        <w:t xml:space="preserve">A measurement of how much the questions in each dataset overlap, which helps explain why one of the four decisions does nothing measurable while a similar-looking one moves accuracy about twenty points.</w:t>
       </w:r>
     </w:p>
     <w:p>
@@ -553,7 +553,7 @@
           <w:sz w:val="21"/>
           <w:szCs w:val="21"/>
         </w:rPr>
-        <w:t xml:space="preserve">Balanced accuracy is used rather than raw accuracy because MIES is strongly imbalanced. Introverts make up 61.5% of the three-class data, so a model that answers “introvert” every time scores 61.5% raw accuracy without having learned anything. That figure has a name: the no-information rate, the score a classifier gets for free by always naming the largest class. Balanced accuracy scores each class separately and then averages them, so the same do-nothing model scores 33%. Where results here sit beside published figures, both sides use raw accuracy, since the published studies report raw accuracy.</w:t>
+        <w:t xml:space="preserve">Balanced accuracy is used rather than raw accuracy because MIES is strongly imbalanced. Introverts make up 61.5% of the three-class data, so a model that answers “introvert” every time scores 61.5% raw accuracy without having learned anything. That number is called the no-information rate. It is the score a model gets for free by always guessing the largest class. Balanced accuracy scores each class separately and then averages them, so the same do-nothing model scores 33%. Where results here are placed next to published figures, both sides use raw accuracy, since the published studies report raw accuracy.</w:t>
       </w:r>
     </w:p>
     <w:p>
@@ -634,7 +634,7 @@
           <w:sz w:val="21"/>
           <w:szCs w:val="21"/>
         </w:rPr>
-        <w:t xml:space="preserve">SMOTE [16] applied to the entire dataset before cross-validation, against SMOTE applied inside each training fold through an imbalanced-learn [20] pipeline. SMOTE builds a new minority-class row by taking a real minority row, picking one of its five closest minority neighbors, and placing a new point at a random spot on the line between them. Five neighbors is the default and is used in both arms, so the only thing that differs is when the new rows are made.</w:t>
+        <w:t xml:space="preserve">SMOTE [16] applied to the entire dataset before cross-validation, against SMOTE applied inside each training fold through an imbalanced-learn [20] pipeline. SMOTE makes a new minority-class row by taking a real one, picking one of its five closest minority neighbors, and putting a new point somewhere on the line between them. Five neighbors is the default and both arms use it, so the only difference is when the new rows get made.</w:t>
       </w:r>
     </w:p>
     <w:p>
@@ -3366,7 +3366,7 @@
           <w:sz w:val="21"/>
           <w:szCs w:val="21"/>
         </w:rPr>
-        <w:t xml:space="preserve">My three-class results, at 0.728 to 0.736 raw accuracy, land close to two published studies using the same instrument: So [12] reports 73.81% and Fieri et al. [13] report 73.5% before resampling. Fieri et al. list class counts of 4,404, 989, and 1,768, which are all three groups. So reports a no-information rate of 61.51%, and the largest class in the three-class version of this data accounts for 61.48% of it, against 81.6% in the two-class version, so that study was almost certainly working with three classes as well.</w:t>
+        <w:t xml:space="preserve">My three-class results, at 0.728 to 0.736 raw accuracy, come out close to two published studies that used the same questionnaire: So [12] reports 73.81% and Fieri et al. [13] report 73.5% before resampling. Fieri et al. list class counts of 4,404, 989, and 1,768, which are all three groups. So reports a no-information rate of 61.51%, and the largest class in the three-class version of this data accounts for 61.48% of it, against 81.6% in the two-class version, so that study was almost certainly working with three classes as well.</w:t>
       </w:r>
     </w:p>
     <w:p>
@@ -3406,7 +3406,7 @@
           <w:sz w:val="21"/>
           <w:szCs w:val="21"/>
         </w:rPr>
-        <w:t xml:space="preserve">The mechanism is straightforward. SMOTE creates new minority-class rows by interpolating between existing ones. If those rows are created before the split, a synthetic row in a test fold can be an interpolation of two rows that are in the training fold, so the model is scored on points partly built from data it trained on. Resampling inside the training fold avoids this, because the test fold is never used to create anything.</w:t>
+        <w:t xml:space="preserve">The reason for this is fairly simple. SMOTE creates new minority-class rows by interpolating between existing ones. If those rows are created before the split, a synthetic row in a test fold can be an interpolation of two rows that are in the training fold, so the model is scored on points partly built from data it trained on. Resampling inside the training fold avoids this, because the test fold is never used to create anything.</w:t>
       </w:r>
     </w:p>
     <w:p>
@@ -3539,7 +3539,7 @@
           <w:sz w:val="21"/>
           <w:szCs w:val="21"/>
         </w:rPr>
-        <w:t xml:space="preserve">Choosing features on the whole dataset can only leak something if the choice itself carries information. If the questions in a dataset all measure close to the same thing, then almost any subset of them carries almost the same information, and it stops mattering whether that subset was picked using the test rows or without them. The measurements below suggest that is the situation here.</w:t>
+        <w:t xml:space="preserve">Choosing features on the whole dataset can only leak something if the choice itself tells you something. If the questions in a dataset all measure close to the same thing, then almost any subset of them holds almost the same information, and it stops mattering whether that subset was picked using the test rows or without them. The measurements below suggest that is what is going on here.</w:t>
       </w:r>
     </w:p>
     <w:p>
@@ -3552,7 +3552,7 @@
           <w:sz w:val="21"/>
           <w:szCs w:val="21"/>
         </w:rPr>
-        <w:t xml:space="preserve">Table 3 reports how strongly the items within each set move together. The measure is the absolute correlation between every pair of items in a set, where 0 means two questions tell you unrelated things about a person and 1 means they tell you the same thing twice. A set with a high average is one where the questions are close to interchangeable.</w:t>
+        <w:t xml:space="preserve">Table 3 reports how strongly the items within each set move together. The measure is the absolute correlation between every pair of items in a set, where 0 means two questions tell you unrelated things about a person and 1 means they tell you the same thing twice. A set with a high average is one where the questions are more or less interchangeable.</w:t>
       </w:r>
     </w:p>
     <w:tbl>
@@ -4111,7 +4111,7 @@
           <w:sz w:val="21"/>
           <w:szCs w:val="21"/>
         </w:rPr>
-        <w:t xml:space="preserve">The seven Kaggle behaviors average 0.784, roughly four times the MIES average of 0.196. The sharpest way to see it is at the edges of the range. The least related pair of the seven behaviors correlates at 0.69, which is higher than the most related pair in the BIG5 extraversion scale at 0.631. That scale was written on purpose to measure one trait through ten differently worded items, so it is a fair upper reference point for how much a deliberately repetitive set of questions should overlap. The seven behaviors sit above it, which means asking about time alone, social events, going outside, friends, posting, stage fright, and feeling drained is closer to asking one question seven times than to asking seven questions.</w:t>
+        <w:t xml:space="preserve">The seven Kaggle behaviors average 0.784, roughly four times the MIES average of 0.196. The clearest way to see this is at the edges of the range. The least related pair of the seven behaviors correlates at 0.69, which is higher than the most related pair in the BIG5 extraversion scale at 0.631. That scale was written on purpose to measure one trait through ten differently worded items, so it is a fair upper reference point for how much a deliberately repetitive set of questions should overlap. The seven behaviors are above it. Asking about time alone, social events, going outside, friends, posting, stage fright, and feeling drained is closer to asking one question seven times than to asking seven different questions.</w:t>
       </w:r>
     </w:p>
     <w:p>
@@ -4183,7 +4183,7 @@
           <w:sz w:val="21"/>
           <w:szCs w:val="21"/>
         </w:rPr>
-        <w:t xml:space="preserve">Two further results follow from that. The first is that removing the single most important item barely changes anything. Importance here is measured with SHAP [17], a method that divides the credit for a model’s predictions among its features, so the top-ranked item is the one the model leans on hardest. All three models rank stage fright first on the Kaggle dataset, and removing it changes balanced accuracy by -0.005 for the random forest, +0.002 for logistic regression, and +0.004 for XGBoost. Two of the three do slightly better without the feature they depend on most.</w:t>
+        <w:t xml:space="preserve">Two more results follow from this. The first is that removing the single most important item barely changes anything. Importance here comes from SHAP [17], a method that splits the credit for a model’s predictions among its features, so the top-ranked item is the one the model relies on most. All three models rank stage fright first on the Kaggle dataset, and removing it changes balanced accuracy by -0.005 for the random forest, +0.002 for logistic regression, and +0.004 for XGBoost. Two of the three models actually did slightly better without the feature they relied on most.</w:t>
       </w:r>
     </w:p>
     <w:p>
@@ -4255,7 +4255,7 @@
           <w:sz w:val="21"/>
           <w:szCs w:val="21"/>
         </w:rPr>
-        <w:t xml:space="preserve">The second is that the ablation curve in Figure 3 stays flat as items are dropped one at a time, holding steady from seven questions down to two. A dataset where the last two questions perform about as well as all seven is a dataset where the choice of questions carries little information, which is what the null result in Section F would predict.</w:t>
+        <w:t xml:space="preserve">The second is that the ablation curve in Figure 3 stays flat as items are dropped one at a time, from seven questions down to two. If the last two questions do about as well as all seven, then the choice of questions carries very little information. That is what the null result in Section F would predict.</w:t>
       </w:r>
     </w:p>
     <w:p>
@@ -4282,7 +4282,7 @@
           <w:sz w:val="21"/>
           <w:szCs w:val="21"/>
         </w:rPr>
-        <w:t xml:space="preserve">The four conditions do not behave alike. Two of them move reported accuracy by roughly 20 points, one moves it by about one point, and one produces nothing measurable. That spread is the main practical result, because it means the choices cannot be treated as interchangeable methodological details.</w:t>
+        <w:t xml:space="preserve">The four conditions do not behave alike. Two of them move reported accuracy by roughly 20 points, one moves it by about one point, and one produces nothing measurable. That spread is the main practical result. It means these choices cannot all be treated as minor details of method.</w:t>
       </w:r>
     </w:p>
     <w:p>

</xml_diff>

<commit_message>
Apply author revisions; show all three models in Figure 1
</commit_message>
<xml_diff>
--- a/paper/preprocessing_paper.docx
+++ b/paper/preprocessing_paper.docx
@@ -119,7 +119,7 @@
           <w:sz w:val="21"/>
           <w:szCs w:val="21"/>
         </w:rPr>
-        <w:t xml:space="preserve">Reported accuracies for classifying introverts and extroverts from self-report data vary widely. Fieri et al. [13] report 73.5% and 95.5% on the same dataset depending on how it was prepared before training. I measure how much four preparation decisions move that number, holding the data and the models fixed. Using a public Kaggle dataset of 2,900 responses to seven behavioral questions and the Multidimensional Introversion-Extraversion Scales (MIES; 7,188 respondents, 91 items), each condition is evaluated with 5-fold cross-validation repeated 10 times, and differences are reported in percentage points of balanced accuracy with 95% intervals. Dropping respondents who identify as neither introvert nor extrovert raises balanced accuracy by 22.8 to 23.5 points, although this changes the classification task rather than only the preprocessing. Applying SMOTE to the full dataset before splitting, rather than within each training fold, raises it by 18.4 to 20.6 points on the imbalanced dataset and by under 0.5 points on the balanced one. Keeping duplicate rows changes it by about one point. Selecting the top 15 features by ANOVA F-score before splitting shows no evidence of a systematic effect, with all three intervals containing zero. My three-class MIES results fall within a third of a point of two published studies that retained the ambivert group. Reported accuracy for this task is therefore sensitive to how the classes are defined and to when the resampling is done. That makes it hard to compare numbers across studies when those choices are not stated.</w:t>
+        <w:t xml:space="preserve">Reported accuracies for classifying introverts and extroverts from self-report data vary widely. Fieri et al. [13] report 73.5% and 95.5% on the same dataset depending on how it was prepared before training. I measure how much four preparation decisions move that number, holding the data and the models fixed. Using a public Kaggle dataset of 2,900 responses to seven behavioral questions and the Multidimensional Introversion-Extraversion Scales (MIES; 7,188 respondents, 91 items), each condition is evaluated with 5-fold cross-validation repeated 10 times, and differences are reported in percentage points of balanced accuracy with 95% intervals. Dropping respondents who identify as neither introvert nor extrovert raises balanced accuracy by 22.8 to 23.5 points, although this changes the classification task rather than only the preprocessing. Applying SMOTE to the full dataset before splitting, rather than within each training fold, raises it by 18.4 to 20.6 points on the imbalanced dataset and by under 0.5 points on the balanced one. Keeping duplicate rows changes it by about one point. Selecting the top 15 features by ANOVA F-score before splitting shows no evidence of a systematic effect, with all three intervals containing zero. My three-class MIES results fall within a third of a point of two published studies that retained the ambivert group. Reported accuracy is therefore sensitive to how the classes are defined and to when the resampling is done. That makes it hard to compare numbers across studies when those choices are not stated.</w:t>
       </w:r>
     </w:p>
     <w:p>
@@ -227,7 +227,7 @@
           <w:sz w:val="21"/>
           <w:szCs w:val="21"/>
         </w:rPr>
-        <w:t xml:space="preserve">Studies that classify introverts and extroverts from self-report data report very different accuracies. Fieri et al. [13] report 73.5% and 95.5% for the same dataset, depending on how the data were prepared before training. So [12] reports 73.81% on the same questionnaire. Numbers like these often get compared as though they describe the same problem.</w:t>
+        <w:t xml:space="preserve">Studies that classify introverts and extroverts from self-reported data report very different accuracies. Fieri et al. [13] report 73.5% and 95.5% for the same dataset, depending on how the data were prepared before training. So [12] reports 73.81% on the same questionnaire. Numbers like these often get compared as though they describe the same problem.</w:t>
       </w:r>
     </w:p>
     <w:p>
@@ -240,7 +240,7 @@
           <w:sz w:val="21"/>
           <w:szCs w:val="21"/>
         </w:rPr>
-        <w:t xml:space="preserve">Leakage and preprocessing errors are known to inflate reported performance across many fields. Kapoor and Narayanan [11] found them in 294 papers spanning 17 disciplines and sorted them into eight types. Personality classification was not one of the fields they surveyed, and I could not find a study that measures how much these choices matter for this particular task.</w:t>
+        <w:t xml:space="preserve">Leakage and preprocessing errors are known to inflate reported performance across many fields. Kapoor and Narayanan [11] found them in 294 papers spanning 17 disciplines and sorted them into eight types. Personality classification was not one of the fields they surveyed, and I could not find a study that measures how much these choices matter.</w:t>
       </w:r>
     </w:p>
     <w:p>
@@ -459,7 +459,7 @@
           <w:sz w:val="21"/>
           <w:szCs w:val="21"/>
         </w:rPr>
-        <w:t xml:space="preserve">For MIES, a response of 0 marks a skipped question rather than a rating, and is treated as missing. Missing values are filled with the median of the training fold.</w:t>
+        <w:t xml:space="preserve">For MIES, a response of 0 marks a skipped question, and not a rating, and is treated as missing. Missing values are filled with the median from the training fold.</w:t>
       </w:r>
     </w:p>
     <w:p>
@@ -513,7 +513,7 @@
           <w:sz w:val="21"/>
           <w:szCs w:val="21"/>
         </w:rPr>
-        <w:t xml:space="preserve">Every preprocessing step runs inside a scikit-learn [18] pipeline, so imputation and scaling are fitted on training data only. Fitting them on the full dataset first would be a small version of the leakage this paper measures.</w:t>
+        <w:t xml:space="preserve">Every preprocessing step runs inside a scikit-learn [18] pipeline, so imputation and scaling are fitted on training data only.</w:t>
       </w:r>
     </w:p>
     <w:p>
@@ -553,7 +553,7 @@
           <w:sz w:val="21"/>
           <w:szCs w:val="21"/>
         </w:rPr>
-        <w:t xml:space="preserve">Balanced accuracy is used rather than raw accuracy because MIES is strongly imbalanced. Introverts make up 61.5% of the three-class data, so a model that answers “introvert” every time scores 61.5% raw accuracy without having learned anything. That number is called the no-information rate. It is the score a model gets for free by always guessing the largest class. Balanced accuracy scores each class separately and then averages them, so the same do-nothing model scores 33%. Where results here are placed next to published figures, both sides use raw accuracy, since the published studies report raw accuracy.</w:t>
+        <w:t xml:space="preserve">Balanced accuracy is used rather than raw accuracy because MIES is strongly imbalanced. Introverts make up 61.5% of the three-class data, so a lazy model that answers “introvert” every time scores 61.5% raw accuracy without having learned anything. That number is called the no-information rate. It is the score a model gets for free by always guessing the largest class. Balanced accuracy scores each class separately and then averages them, so the same lazy model would score 33%. Where results here are placed next to published figures, both sides use raw accuracy, since the published studies report raw accuracy.</w:t>
       </w:r>
     </w:p>
     <w:p>
@@ -607,7 +607,7 @@
           <w:sz w:val="21"/>
           <w:szCs w:val="21"/>
         </w:rPr>
-        <w:t xml:space="preserve">Three classes (introvert, extrovert, neither) against two classes, with the neither group removed. This one changes the prediction task and the population being classified, not only the order of the steps.</w:t>
+        <w:t xml:space="preserve">Three classes (introvert, extrovert, or neither) against two classes, with the neither group removed. This one changes the prediction task and the population being classified, not only the order of the steps.</w:t>
       </w:r>
     </w:p>
     <w:p>
@@ -1420,7 +1420,7 @@
           <w:sz w:val="21"/>
           <w:szCs w:val="21"/>
         </w:rPr>
-        <w:t xml:space="preserve">Table 1 gives baseline accuracy for each dataset and model on a single split, and Table 2 gives the effect of each condition measured across 50 fits. Figure 1 shows the same four effects with their intervals.</w:t>
+        <w:t xml:space="preserve">Table 1 gives baseline accuracy for each dataset and model on a single split, and Table 2 gives the effect of each condition measured across 50 fits. Figure 1 shows the same effects for all three models.</w:t>
       </w:r>
     </w:p>
     <w:p>
@@ -3265,7 +3265,7 @@
       <w:r>
         <w:drawing>
           <wp:inline distT="0" distB="0" distL="0" distR="0">
-            <wp:extent cx="4095750" cy="2381250"/>
+            <wp:extent cx="4286250" cy="2638425"/>
             <wp:effectExtent t="0" r="0" b="0" l="0"/>
             <wp:docPr id="1" name="" descr="" title=""/>
             <wp:cNvGraphicFramePr>
@@ -3290,7 +3290,7 @@
                   <pic:spPr bwMode="auto">
                     <a:xfrm>
                       <a:off x="0" y="0"/>
-                      <a:ext cx="4095750" cy="2381250"/>
+                      <a:ext cx="4286250" cy="2638425"/>
                     </a:xfrm>
                     <a:prstGeom prst="rect">
                       <a:avLst/>
@@ -3313,7 +3313,7 @@
           <w:sz w:val="18"/>
           <w:szCs w:val="18"/>
         </w:rPr>
-        <w:t xml:space="preserve">Figure 1: The four conditions, random forest, with 95% intervals. The interval for selection order crosses zero; the others do not.</w:t>
+        <w:t xml:space="preserve">Figure 1: Effect of each condition for all three models, with 95% intervals. The selection-order intervals cross zero and the others do not. Logistic regression gains far less from resampling before the split than the two tree models do.</w:t>
       </w:r>
     </w:p>
     <w:p>
@@ -3419,7 +3419,7 @@
           <w:sz w:val="21"/>
           <w:szCs w:val="21"/>
         </w:rPr>
-        <w:t xml:space="preserve">Two things have to hold for the effect to appear. The classes have to be imbalanced enough for SMOTE to generate a large number of synthetic rows, which is why the Kaggle dataset shows almost nothing at 51/49 while MIES shows 20 points at 61/14/25. And the model has to be flexible enough to exploit the leaked information. A logistic regression on seven features has seven coefficients and cannot fit an individual row, which is why it gains 5.65 points where the random forest gains 20.61.</w:t>
+        <w:t xml:space="preserve">Two things have to hold for the effect to appear. The classes have to be imbalanced enough for SMOTE to generate a large number of synthetic rows, which is why the Kaggle dataset shows almost nothing at 51/49 while MIES shows 20 points at 61/14/25. A logistic regression on seven features has seven coefficients and cannot fit an individual row, which is why it gains 5.65 points where the random forest gains 20.61.</w:t>
       </w:r>
     </w:p>
     <w:p>
@@ -3432,7 +3432,7 @@
           <w:sz w:val="21"/>
           <w:szCs w:val="21"/>
         </w:rPr>
-        <w:t xml:space="preserve">For comparison, Fieri et al. [13] report 73.5% before resampling and 95.5% after. The change I measure from ordering alone is close in size to the change they report.</w:t>
+        <w:t xml:space="preserve">For comparison, Fieri et al. [13] report 73.5% before resampling and 95.5% after.</w:t>
       </w:r>
     </w:p>
     <w:p>
@@ -3552,7 +3552,7 @@
           <w:sz w:val="21"/>
           <w:szCs w:val="21"/>
         </w:rPr>
-        <w:t xml:space="preserve">Table 3 reports how strongly the items within each set move together. The measure is the absolute correlation between every pair of items in a set, where 0 means two questions tell you unrelated things about a person and 1 means they tell you the same thing twice. A set with a high average is one where the questions are more or less interchangeable.</w:t>
+        <w:t xml:space="preserve">Table 3 reports how strongly the items within each set move together. The measure is the absolute correlation between every pair of items in a set, where 0 means two questions tell you unrelated things about a person and 1 means they tell you the same thing twice. A set with a high average is one where the questions are more or less interchangeable and less useful.</w:t>
       </w:r>
     </w:p>
     <w:tbl>
@@ -4295,7 +4295,7 @@
           <w:sz w:val="21"/>
           <w:szCs w:val="21"/>
         </w:rPr>
-        <w:t xml:space="preserve">The class-structure result is the one most likely to be misread. Dropping ambiverts is a legitimate choice, but two-class and three-class results answer different questions, and the gap between them is large enough to account for most of the range seen in published work on this instrument. Any paper reporting accuracy for this task should state its class structure somewhere a reader will see it.</w:t>
+        <w:t xml:space="preserve">The class-structure result is the one most likely to be misread. Dropping ambiverts is a legitimate choice, but two-class and three-class results answer different questions, and the gap between them is large enough to account for most of the range seen in published work on this instrument.</w:t>
       </w:r>
     </w:p>
     <w:p>

</xml_diff>

<commit_message>
Cut repeated summaries from conclusion, discussion, and results opener
</commit_message>
<xml_diff>
--- a/paper/preprocessing_paper.docx
+++ b/paper/preprocessing_paper.docx
@@ -1408,19 +1408,6 @@
           <w:szCs w:val="26"/>
         </w:rPr>
         <w:t xml:space="preserve">V. Results and Analysis</w:t>
-      </w:r>
-    </w:p>
-    <w:p>
-      <w:pPr>
-        <w:spacing w:after="160" w:line="276"/>
-        <w:jc w:val="both"/>
-      </w:pPr>
-      <w:r>
-        <w:rPr>
-          <w:sz w:val="21"/>
-          <w:szCs w:val="21"/>
-        </w:rPr>
-        <w:t xml:space="preserve">Table 1 gives baseline accuracy for each dataset and model on a single split, and Table 2 gives the effect of each condition measured across 50 fits. Figure 1 shows the same effects for all three models.</w:t>
       </w:r>
     </w:p>
     <w:p>
@@ -4308,7 +4295,7 @@
           <w:sz w:val="21"/>
           <w:szCs w:val="21"/>
         </w:rPr>
-        <w:t xml:space="preserve">The resampling effect depends on conditions that are easy to overlook. It needs class imbalance, and it needs a model flexible enough to exploit the extra rows, so a study that resampled before splitting on balanced data with a linear model would see almost nothing and might conclude the practice is harmless.</w:t>
+        <w:t xml:space="preserve">A study that resampled before splitting on balanced data with a linear model would see almost nothing from it, and might reasonably conclude the practice is harmless.</w:t>
       </w:r>
     </w:p>
     <w:p>
@@ -4452,7 +4439,7 @@
           <w:sz w:val="21"/>
           <w:szCs w:val="21"/>
         </w:rPr>
-        <w:t xml:space="preserve">I measured how much four data preparation decisions change the reported accuracy of introvert-extrovert classification, holding the datasets and models fixed. Dropping respondents who identify as neither raises balanced accuracy by about 23 points, though it also changes the task. Resampling before rather than inside cross-validation folds raises it by up to 21 points on imbalanced data and by almost nothing on balanced data. Keeping duplicate rows changes it by about one point. The order of feature selection produces no measurable change.</w:t>
+        <w:t xml:space="preserve">I measured how much four data preparation decisions change the reported accuracy of introvert-extrovert classification, holding the datasets and models fixed. Two of them move balanced accuracy by roughly 20 points, one moves it by about a point, and one does nothing measurable.</w:t>
       </w:r>
     </w:p>
     <w:p>

</xml_diff>

<commit_message>
Restore Fieri comparison; condense item-overlap section
</commit_message>
<xml_diff>
--- a/paper/preprocessing_paper.docx
+++ b/paper/preprocessing_paper.docx
@@ -3419,7 +3419,7 @@
           <w:sz w:val="21"/>
           <w:szCs w:val="21"/>
         </w:rPr>
-        <w:t xml:space="preserve">For comparison, Fieri et al. [13] report 73.5% before resampling and 95.5% after.</w:t>
+        <w:t xml:space="preserve">For comparison, Fieri et al. [13] report 73.5% before resampling and 95.5% after. The change I measure from ordering alone is close in size to the change they report.</w:t>
       </w:r>
     </w:p>
     <w:p>
@@ -3539,7 +3539,7 @@
           <w:sz w:val="21"/>
           <w:szCs w:val="21"/>
         </w:rPr>
-        <w:t xml:space="preserve">Table 3 reports how strongly the items within each set move together. The measure is the absolute correlation between every pair of items in a set, where 0 means two questions tell you unrelated things about a person and 1 means they tell you the same thing twice. A set with a high average is one where the questions are more or less interchangeable and less useful.</w:t>
+        <w:t xml:space="preserve">Table 3 reports how strongly the items within each set move together, using the absolute correlation between every pair of items. A 0 means two questions tell you unrelated things about a person and a 1 means they tell you the same thing twice. A set with a high average is one where the questions are more or less interchangeable and less useful.</w:t>
       </w:r>
     </w:p>
     <w:tbl>
@@ -4170,79 +4170,7 @@
           <w:sz w:val="21"/>
           <w:szCs w:val="21"/>
         </w:rPr>
-        <w:t xml:space="preserve">Two more results follow from this. The first is that removing the single most important item barely changes anything. Importance here comes from SHAP [17], a method that splits the credit for a model’s predictions among its features, so the top-ranked item is the one the model relies on most. All three models rank stage fright first on the Kaggle dataset, and removing it changes balanced accuracy by -0.005 for the random forest, +0.002 for logistic regression, and +0.004 for XGBoost. Two of the three models actually did slightly better without the feature they relied on most.</w:t>
-      </w:r>
-    </w:p>
-    <w:p>
-      <w:pPr>
-        <w:spacing w:after="60" w:before="160"/>
-        <w:jc w:val="center"/>
-      </w:pPr>
-      <w:r>
-        <w:drawing>
-          <wp:inline distT="0" distB="0" distL="0" distR="0">
-            <wp:extent cx="3619500" cy="2628900"/>
-            <wp:effectExtent t="0" r="0" b="0" l="0"/>
-            <wp:docPr id="1" name="" descr="" title=""/>
-            <wp:cNvGraphicFramePr>
-              <a:graphicFrameLocks xmlns:a="http://schemas.openxmlformats.org/drawingml/2006/main" noChangeAspect="1"/>
-            </wp:cNvGraphicFramePr>
-            <a:graphic xmlns:a="http://schemas.openxmlformats.org/drawingml/2006/main">
-              <a:graphicData uri="http://schemas.openxmlformats.org/drawingml/2006/picture">
-                <pic:pic xmlns:pic="http://schemas.openxmlformats.org/drawingml/2006/picture">
-                  <pic:nvPicPr>
-                    <pic:cNvPr id="0" name="" descr=""/>
-                    <pic:cNvPicPr>
-                      <a:picLocks noChangeAspect="1" noChangeArrowheads="1"/>
-                    </pic:cNvPicPr>
-                  </pic:nvPicPr>
-                  <pic:blipFill>
-                    <a:blip r:embed="rId10" cstate="none"/>
-                    <a:srcRect/>
-                    <a:stretch>
-                      <a:fillRect/>
-                    </a:stretch>
-                  </pic:blipFill>
-                  <pic:spPr bwMode="auto">
-                    <a:xfrm>
-                      <a:off x="0" y="0"/>
-                      <a:ext cx="3619500" cy="2628900"/>
-                    </a:xfrm>
-                    <a:prstGeom prst="rect">
-                      <a:avLst/>
-                    </a:prstGeom>
-                  </pic:spPr>
-                </pic:pic>
-              </a:graphicData>
-            </a:graphic>
-          </wp:inline>
-        </w:drawing>
-      </w:r>
-    </w:p>
-    <w:p>
-      <w:pPr>
-        <w:spacing w:after="240"/>
-        <w:jc w:val="center"/>
-      </w:pPr>
-      <w:r>
-        <w:rPr>
-          <w:sz w:val="18"/>
-          <w:szCs w:val="18"/>
-        </w:rPr>
-        <w:t xml:space="preserve">Figure 3: Balanced accuracy as items are removed one at a time in order of increasing importance, Kaggle dataset. Performance is flat from seven items down to two.</w:t>
-      </w:r>
-    </w:p>
-    <w:p>
-      <w:pPr>
-        <w:spacing w:after="160" w:line="276"/>
-        <w:jc w:val="both"/>
-      </w:pPr>
-      <w:r>
-        <w:rPr>
-          <w:sz w:val="21"/>
-          <w:szCs w:val="21"/>
-        </w:rPr>
-        <w:t xml:space="preserve">The second is that the ablation curve in Figure 3 stays flat as items are dropped one at a time, from seven questions down to two. If the last two questions do about as well as all seven, then the choice of questions carries very little information. That is what the null result in Section F would predict.</w:t>
+        <w:t xml:space="preserve">The same pattern appears when items are removed rather than counted. All three models rank stage fright as their most important item on the Kaggle dataset, ranked by SHAP [17], and removing it changes balanced accuracy by less than half a point for every one of them. Accuracy also stays flat as items are dropped one at a time, from seven questions down to two. If the last two do about as well as all seven, then the choice of questions carries very little information, which is what the null result in Section F would predict.</w:t>
       </w:r>
     </w:p>
     <w:p>

</xml_diff>